<commit_message>
Updated syllabus template - update syllabus template - generate_more_data will generate schedule, gradeTable, gradingPolicy info, and other json/list data
</commit_message>
<xml_diff>
--- a/backend/docx/SyllabusTemplate.docx
+++ b/backend/docx/SyllabusTemplate.docx
@@ -723,6 +723,9 @@
         <w:t>}</w:t>
       </w:r>
       <w:r>
+        <w:t>&lt;title&gt;</w:t>
+      </w:r>
+      <w:r>
         <w:t>,</w:t>
       </w:r>
       <w:r>
@@ -740,9 +743,26 @@
         <w:t>}</w:t>
       </w:r>
       <w:r>
+        <w:t>&lt;/title&gt;</w:t>
+      </w:r>
+      <w:r>
         <w:t xml:space="preserve"> </w:t>
       </w:r>
       <w:r>
+        <w:t>&lt;</w:t>
+      </w:r>
+      <w:proofErr w:type="spellStart"/>
+      <w:r>
+        <w:t>foa</w:t>
+      </w:r>
+      <w:proofErr w:type="spellEnd"/>
+      <w:r>
+        <w:t>&gt;</w:t>
+      </w:r>
+      <w:r>
+        <w:t>(</w:t>
+      </w:r>
+      <w:r>
         <w:t>${</w:t>
       </w:r>
       <w:proofErr w:type="spellStart"/>
@@ -753,6 +773,20 @@
       <w:r>
         <w:t>}</w:t>
       </w:r>
+      <w:r>
+        <w:t>)</w:t>
+      </w:r>
+      <w:r>
+        <w:t>&lt;?</w:t>
+      </w:r>
+      <w:proofErr w:type="spellStart"/>
+      <w:r>
+        <w:t>foa</w:t>
+      </w:r>
+      <w:proofErr w:type="spellEnd"/>
+      <w:r>
+        <w:t>&gt;</w:t>
+      </w:r>
     </w:p>
     <w:p>
       <w:pPr>
@@ -777,6 +811,9 @@
         <w:t>}</w:t>
       </w:r>
       <w:r>
+        <w:t>&lt;phone&gt;</w:t>
+      </w:r>
+      <w:r>
         <w:t xml:space="preserve">, </w:t>
       </w:r>
       <w:r>
@@ -788,6 +825,9 @@
       <w:r>
         <w:t>}</w:t>
       </w:r>
+      <w:r>
+        <w:t>&lt;/phone&gt;</w:t>
+      </w:r>
     </w:p>
     <w:p>
       <w:pPr>
@@ -855,6 +895,9 @@
       <w:r>
         <w:t>additional_contact_info</w:t>
       </w:r>
+      <w:r>
+        <w:t>_syllabus</w:t>
+      </w:r>
       <w:proofErr w:type="spellEnd"/>
       <w:r>
         <w:t>}</w:t>
@@ -909,6 +952,11 @@
       <w:r>
         <w:t>}</w:t>
       </w:r>
+    </w:p>
+    <w:p>
+      <w:pPr>
+        <w:spacing w:after="0"/>
+      </w:pPr>
     </w:p>
     <w:p>
       <w:pPr>
@@ -1173,892 +1221,348 @@
     </w:p>
     <w:p>
       <w:pPr>
+        <w:spacing w:after="0"/>
+      </w:pPr>
+      <w:r>
+        <w:t>${</w:t>
+      </w:r>
+      <w:proofErr w:type="spellStart"/>
+      <w:r>
+        <w:t>learning_outcomes_syllabus</w:t>
+      </w:r>
+      <w:proofErr w:type="spellEnd"/>
+      <w:r>
+        <w:t>}</w:t>
+      </w:r>
+    </w:p>
+    <w:p>
+      <w:pPr>
+        <w:spacing w:after="0"/>
+      </w:pPr>
+    </w:p>
+    <w:p>
+      <w:pPr>
+        <w:spacing w:after="0"/>
+        <w:rPr>
+          <w:rFonts w:asciiTheme="majorHAnsi" w:eastAsiaTheme="majorEastAsia" w:hAnsiTheme="majorHAnsi" w:cstheme="majorBidi"/>
+          <w:b/>
+          <w:bCs/>
+          <w:color w:val="1F3864" w:themeColor="accent1" w:themeShade="80"/>
+          <w:sz w:val="26"/>
+          <w:szCs w:val="26"/>
+        </w:rPr>
+      </w:pPr>
+      <w:r>
+        <w:rPr>
+          <w:rFonts w:asciiTheme="majorHAnsi" w:eastAsiaTheme="majorEastAsia" w:hAnsiTheme="majorHAnsi" w:cstheme="majorBidi"/>
+          <w:b/>
+          <w:bCs/>
+          <w:color w:val="1F3864" w:themeColor="accent1" w:themeShade="80"/>
+          <w:sz w:val="26"/>
+          <w:szCs w:val="26"/>
+        </w:rPr>
+        <w:t>High Impact Practices</w:t>
+      </w:r>
+    </w:p>
+    <w:p>
+      <w:pPr>
+        <w:spacing w:after="0"/>
+      </w:pPr>
+    </w:p>
+    <w:p>
+      <w:pPr>
+        <w:spacing w:after="0"/>
+      </w:pPr>
+      <w:r>
+        <w:t>$(</w:t>
+      </w:r>
+      <w:proofErr w:type="spellStart"/>
+      <w:r>
+        <w:t>hip_syllabus</w:t>
+      </w:r>
+      <w:proofErr w:type="spellEnd"/>
+      <w:r>
+        <w:t>}</w:t>
+      </w:r>
+    </w:p>
+    <w:p>
+      <w:pPr>
+        <w:spacing w:after="0"/>
+        <w:rPr>
+          <w:rFonts w:asciiTheme="majorHAnsi" w:eastAsiaTheme="majorEastAsia" w:hAnsiTheme="majorHAnsi" w:cstheme="majorBidi"/>
+          <w:b/>
+          <w:bCs/>
+          <w:color w:val="1F3864" w:themeColor="accent1" w:themeShade="80"/>
+          <w:sz w:val="26"/>
+          <w:szCs w:val="26"/>
+        </w:rPr>
+      </w:pPr>
+    </w:p>
+    <w:p>
+      <w:pPr>
+        <w:spacing w:after="0"/>
+        <w:rPr>
+          <w:rFonts w:asciiTheme="majorHAnsi" w:eastAsiaTheme="majorEastAsia" w:hAnsiTheme="majorHAnsi" w:cstheme="majorBidi"/>
+          <w:b/>
+          <w:bCs/>
+          <w:color w:val="1F3864" w:themeColor="accent1" w:themeShade="80"/>
+          <w:sz w:val="26"/>
+          <w:szCs w:val="26"/>
+        </w:rPr>
+      </w:pPr>
+      <w:r>
+        <w:rPr>
+          <w:rFonts w:asciiTheme="majorHAnsi" w:eastAsiaTheme="majorEastAsia" w:hAnsiTheme="majorHAnsi" w:cstheme="majorBidi"/>
+          <w:b/>
+          <w:bCs/>
+          <w:color w:val="1F3864" w:themeColor="accent1" w:themeShade="80"/>
+          <w:sz w:val="26"/>
+          <w:szCs w:val="26"/>
+        </w:rPr>
+        <w:t>Learning Resources</w:t>
+      </w:r>
+    </w:p>
+    <w:p>
+      <w:pPr>
+        <w:spacing w:after="0"/>
+      </w:pPr>
+    </w:p>
+    <w:p>
+      <w:pPr>
+        <w:spacing w:after="0"/>
+      </w:pPr>
+      <w:r>
+        <w:t>${</w:t>
+      </w:r>
+      <w:proofErr w:type="spellStart"/>
+      <w:r>
+        <w:t>course_materials_syllabus</w:t>
+      </w:r>
+      <w:proofErr w:type="spellEnd"/>
+      <w:r>
+        <w:t>}</w:t>
+      </w:r>
+    </w:p>
+    <w:p>
+      <w:pPr>
+        <w:spacing w:after="0"/>
+      </w:pPr>
+    </w:p>
+    <w:p>
+      <w:pPr>
+        <w:spacing w:after="0"/>
+        <w:rPr>
+          <w:rFonts w:asciiTheme="majorHAnsi" w:eastAsiaTheme="majorEastAsia" w:hAnsiTheme="majorHAnsi" w:cstheme="majorBidi"/>
+          <w:b/>
+          <w:bCs/>
+          <w:color w:val="1F3864" w:themeColor="accent1" w:themeShade="80"/>
+          <w:sz w:val="26"/>
+          <w:szCs w:val="26"/>
+        </w:rPr>
+      </w:pPr>
+      <w:r>
+        <w:rPr>
+          <w:rFonts w:asciiTheme="majorHAnsi" w:eastAsiaTheme="majorEastAsia" w:hAnsiTheme="majorHAnsi" w:cstheme="majorBidi"/>
+          <w:b/>
+          <w:bCs/>
+          <w:color w:val="1F3864" w:themeColor="accent1" w:themeShade="80"/>
+          <w:sz w:val="26"/>
+          <w:szCs w:val="26"/>
+        </w:rPr>
+        <w:t>Assessments</w:t>
+      </w:r>
+    </w:p>
+    <w:p>
+      <w:pPr>
+        <w:spacing w:after="0"/>
+        <w:rPr>
+          <w:rStyle w:val="Heading4Char"/>
+          <w:b/>
+          <w:bCs/>
+          <w:i w:val="0"/>
+          <w:iCs w:val="0"/>
+          <w:color w:val="1F3864" w:themeColor="accent1" w:themeShade="80"/>
+        </w:rPr>
+      </w:pPr>
+    </w:p>
+    <w:p>
+      <w:pPr>
+        <w:spacing w:after="0"/>
+        <w:rPr>
+          <w:rStyle w:val="Heading4Char"/>
+          <w:rFonts w:asciiTheme="minorHAnsi" w:hAnsiTheme="minorHAnsi" w:cstheme="minorHAnsi"/>
+          <w:i w:val="0"/>
+          <w:iCs w:val="0"/>
+          <w:color w:val="auto"/>
+        </w:rPr>
+      </w:pPr>
+      <w:r>
+        <w:rPr>
+          <w:rStyle w:val="Heading4Char"/>
+          <w:rFonts w:asciiTheme="minorHAnsi" w:hAnsiTheme="minorHAnsi" w:cstheme="minorHAnsi"/>
+          <w:i w:val="0"/>
+          <w:iCs w:val="0"/>
+          <w:color w:val="auto"/>
+        </w:rPr>
+        <w:t>${</w:t>
+      </w:r>
+      <w:proofErr w:type="spellStart"/>
+      <w:r>
+        <w:rPr>
+          <w:rStyle w:val="Heading4Char"/>
+          <w:rFonts w:asciiTheme="minorHAnsi" w:hAnsiTheme="minorHAnsi" w:cstheme="minorHAnsi"/>
+          <w:i w:val="0"/>
+          <w:iCs w:val="0"/>
+          <w:color w:val="auto"/>
+        </w:rPr>
+        <w:t>assmt_assignments_syllabus_json</w:t>
+      </w:r>
+      <w:proofErr w:type="spellEnd"/>
+      <w:r>
+        <w:rPr>
+          <w:rStyle w:val="Heading4Char"/>
+          <w:rFonts w:asciiTheme="minorHAnsi" w:hAnsiTheme="minorHAnsi" w:cstheme="minorHAnsi"/>
+          <w:i w:val="0"/>
+          <w:iCs w:val="0"/>
+          <w:color w:val="auto"/>
+        </w:rPr>
+        <w:t>}</w:t>
+      </w:r>
+    </w:p>
+    <w:p>
+      <w:pPr>
+        <w:spacing w:after="0"/>
+        <w:rPr>
+          <w:rStyle w:val="Heading4Char"/>
+          <w:b/>
+          <w:bCs/>
+          <w:i w:val="0"/>
+          <w:iCs w:val="0"/>
+          <w:color w:val="1F3864" w:themeColor="accent1" w:themeShade="80"/>
+        </w:rPr>
+      </w:pPr>
+    </w:p>
+    <w:p>
+      <w:pPr>
+        <w:spacing w:after="0"/>
+      </w:pPr>
+    </w:p>
+    <w:p>
+      <w:pPr>
+        <w:spacing w:after="0"/>
+      </w:pPr>
+      <w:r>
+        <w:t>Students will be assigned the following final letter grades, based on the calculations coming from the course assessment section.</w:t>
+      </w:r>
+    </w:p>
+    <w:p>
+      <w:pPr>
+        <w:spacing w:after="0"/>
+      </w:pPr>
+    </w:p>
+    <w:p>
+      <w:pPr>
+        <w:spacing w:after="0"/>
+      </w:pPr>
+      <w:r>
+        <w:t>${</w:t>
+      </w:r>
+      <w:proofErr w:type="spellStart"/>
+      <w:r>
+        <w:t>grade_table_syllabus_list</w:t>
+      </w:r>
+      <w:proofErr w:type="spellEnd"/>
+      <w:r>
+        <w:t>}</w:t>
+      </w:r>
+    </w:p>
+    <w:p>
+      <w:pPr>
+        <w:spacing w:after="0"/>
+      </w:pPr>
+    </w:p>
+    <w:p>
+      <w:pPr>
+        <w:spacing w:after="0"/>
+      </w:pPr>
+    </w:p>
+    <w:p>
+      <w:pPr>
         <w:pStyle w:val="Heading3"/>
         <w:rPr>
-          <w:color w:val="1F3864" w:themeColor="accent1" w:themeShade="80"/>
-        </w:rPr>
-      </w:pPr>
-      <w:r>
-        <w:rPr>
-          <w:color w:val="1F3864" w:themeColor="accent1" w:themeShade="80"/>
-        </w:rPr>
-        <w:t>Upon completing this course, students will be able to:</w:t>
-      </w:r>
-    </w:p>
-    <w:p>
-      <w:pPr>
-        <w:pStyle w:val="ListParagraph"/>
-        <w:numPr>
-          <w:ilvl w:val="0"/>
-          <w:numId w:val="1"/>
-        </w:numPr>
-        <w:spacing w:after="0"/>
-      </w:pPr>
-      <w:r>
+          <w:b/>
+          <w:bCs/>
+          <w:color w:val="1F3864" w:themeColor="accent1" w:themeShade="80"/>
+          <w:sz w:val="26"/>
+          <w:szCs w:val="26"/>
+        </w:rPr>
+      </w:pPr>
+      <w:r>
+        <w:rPr>
+          <w:b/>
+          <w:bCs/>
+          <w:color w:val="1F3864" w:themeColor="accent1" w:themeShade="80"/>
+          <w:sz w:val="26"/>
+          <w:szCs w:val="26"/>
+        </w:rPr>
+        <w:t>Grading Policies</w:t>
+      </w:r>
+    </w:p>
+    <w:p>
+      <w:pPr>
+        <w:spacing w:after="0"/>
         <w:rPr>
           <w:rStyle w:val="Heading4Char"/>
-          <w:color w:val="1F3864" w:themeColor="accent1" w:themeShade="80"/>
-        </w:rPr>
-        <w:t>Learning Outcome 1 (LO1)</w:t>
-      </w:r>
-      <w:r>
-        <w:t>:</w:t>
-      </w:r>
-    </w:p>
-    <w:p>
-      <w:pPr>
-        <w:pStyle w:val="ListParagraph"/>
-        <w:numPr>
-          <w:ilvl w:val="0"/>
-          <w:numId w:val="1"/>
-        </w:numPr>
-        <w:spacing w:after="0"/>
-      </w:pPr>
-      <w:r>
+          <w:b/>
+          <w:bCs/>
+          <w:color w:val="1F3864" w:themeColor="accent1" w:themeShade="80"/>
+        </w:rPr>
+      </w:pPr>
+    </w:p>
+    <w:p>
+      <w:pPr>
+        <w:spacing w:after="0"/>
         <w:rPr>
           <w:rStyle w:val="Heading4Char"/>
-          <w:color w:val="1F3864" w:themeColor="accent1" w:themeShade="80"/>
-        </w:rPr>
-        <w:t>Learning Outcome 2 (LO2)</w:t>
-      </w:r>
-      <w:r>
-        <w:t>:</w:t>
-      </w:r>
-    </w:p>
-    <w:p>
-      <w:pPr>
-        <w:pStyle w:val="ListParagraph"/>
-        <w:numPr>
-          <w:ilvl w:val="0"/>
-          <w:numId w:val="1"/>
-        </w:numPr>
-        <w:spacing w:after="0"/>
+          <w:rFonts w:asciiTheme="minorHAnsi" w:hAnsiTheme="minorHAnsi" w:cstheme="minorHAnsi"/>
+          <w:i w:val="0"/>
+          <w:iCs w:val="0"/>
+          <w:color w:val="auto"/>
+        </w:rPr>
       </w:pPr>
       <w:r>
         <w:rPr>
           <w:rStyle w:val="Heading4Char"/>
-          <w:color w:val="1F3864" w:themeColor="accent1" w:themeShade="80"/>
-        </w:rPr>
-        <w:t>Learning Outcome 3 (LO3)</w:t>
-      </w:r>
-      <w:r>
-        <w:t>:</w:t>
-      </w:r>
-    </w:p>
-    <w:p>
-      <w:pPr>
-        <w:pStyle w:val="ListParagraph"/>
-        <w:numPr>
-          <w:ilvl w:val="0"/>
-          <w:numId w:val="1"/>
-        </w:numPr>
-        <w:spacing w:after="0"/>
-      </w:pPr>
+          <w:rFonts w:asciiTheme="minorHAnsi" w:hAnsiTheme="minorHAnsi" w:cstheme="minorHAnsi"/>
+          <w:i w:val="0"/>
+          <w:iCs w:val="0"/>
+          <w:color w:val="auto"/>
+        </w:rPr>
+        <w:t>${</w:t>
+      </w:r>
+      <w:proofErr w:type="spellStart"/>
       <w:r>
         <w:rPr>
           <w:rStyle w:val="Heading4Char"/>
-          <w:color w:val="1F3864" w:themeColor="accent1" w:themeShade="80"/>
-        </w:rPr>
-        <w:t>Learning Outcome 4 (LO4)</w:t>
-      </w:r>
-      <w:r>
-        <w:t>:</w:t>
-      </w:r>
-    </w:p>
-    <w:p>
-      <w:pPr>
-        <w:spacing w:after="0"/>
-      </w:pPr>
-    </w:p>
-    <w:p>
-      <w:pPr>
-        <w:spacing w:after="0"/>
-        <w:rPr>
-          <w:rFonts w:asciiTheme="majorHAnsi" w:eastAsiaTheme="majorEastAsia" w:hAnsiTheme="majorHAnsi" w:cstheme="majorBidi"/>
-          <w:b/>
-          <w:bCs/>
-          <w:color w:val="1F3864" w:themeColor="accent1" w:themeShade="80"/>
-          <w:sz w:val="26"/>
-          <w:szCs w:val="26"/>
-        </w:rPr>
-      </w:pPr>
-      <w:r>
-        <w:rPr>
-          <w:rFonts w:asciiTheme="majorHAnsi" w:eastAsiaTheme="majorEastAsia" w:hAnsiTheme="majorHAnsi" w:cstheme="majorBidi"/>
-          <w:b/>
-          <w:bCs/>
-          <w:color w:val="1F3864" w:themeColor="accent1" w:themeShade="80"/>
-          <w:sz w:val="26"/>
-          <w:szCs w:val="26"/>
-        </w:rPr>
-        <w:t>High Impact Practices</w:t>
-      </w:r>
-    </w:p>
-    <w:p>
-      <w:r>
-        <w:t xml:space="preserve">High Impact practices are shown to increase student efficacy and learning. These practices aim at helping students to apply what they are learning in </w:t>
-      </w:r>
-      <w:r>
-        <w:t xml:space="preserve">academic and real-world contexts. </w:t>
-      </w:r>
-    </w:p>
-    <w:p>
-      <w:pPr>
-        <w:spacing w:after="0"/>
-        <w:rPr>
-          <w:rFonts w:asciiTheme="majorHAnsi" w:eastAsiaTheme="majorEastAsia" w:hAnsiTheme="majorHAnsi" w:cstheme="majorBidi"/>
-          <w:b/>
-          <w:bCs/>
-          <w:color w:val="1F3864" w:themeColor="accent1" w:themeShade="80"/>
-          <w:sz w:val="26"/>
-          <w:szCs w:val="26"/>
-        </w:rPr>
-      </w:pPr>
-    </w:p>
-    <w:p>
-      <w:pPr>
-        <w:spacing w:after="0"/>
-        <w:rPr>
-          <w:rFonts w:asciiTheme="majorHAnsi" w:eastAsiaTheme="majorEastAsia" w:hAnsiTheme="majorHAnsi" w:cstheme="majorBidi"/>
-          <w:b/>
-          <w:bCs/>
-          <w:color w:val="1F3864" w:themeColor="accent1" w:themeShade="80"/>
-          <w:sz w:val="26"/>
-          <w:szCs w:val="26"/>
-        </w:rPr>
-      </w:pPr>
-      <w:r>
-        <w:rPr>
-          <w:rFonts w:asciiTheme="majorHAnsi" w:eastAsiaTheme="majorEastAsia" w:hAnsiTheme="majorHAnsi" w:cstheme="majorBidi"/>
-          <w:b/>
-          <w:bCs/>
-          <w:color w:val="1F3864" w:themeColor="accent1" w:themeShade="80"/>
-          <w:sz w:val="26"/>
-          <w:szCs w:val="26"/>
-        </w:rPr>
-        <w:t>Learning Resources</w:t>
-      </w:r>
-    </w:p>
-    <w:p>
-      <w:pPr>
-        <w:spacing w:after="0"/>
-      </w:pPr>
-    </w:p>
-    <w:p>
-      <w:pPr>
-        <w:spacing w:after="0"/>
-        <w:rPr>
-          <w:rFonts w:asciiTheme="majorHAnsi" w:eastAsiaTheme="majorEastAsia" w:hAnsiTheme="majorHAnsi" w:cstheme="majorBidi"/>
-          <w:b/>
-          <w:bCs/>
-          <w:color w:val="1F3864" w:themeColor="accent1" w:themeShade="80"/>
-          <w:sz w:val="26"/>
-          <w:szCs w:val="26"/>
-        </w:rPr>
-      </w:pPr>
-      <w:r>
-        <w:rPr>
-          <w:rFonts w:asciiTheme="majorHAnsi" w:eastAsiaTheme="majorEastAsia" w:hAnsiTheme="majorHAnsi" w:cstheme="majorBidi"/>
-          <w:b/>
-          <w:bCs/>
-          <w:color w:val="1F3864" w:themeColor="accent1" w:themeShade="80"/>
-          <w:sz w:val="26"/>
-          <w:szCs w:val="26"/>
-        </w:rPr>
-        <w:t>Assessments</w:t>
-      </w:r>
-    </w:p>
-    <w:p>
-      <w:pPr>
-        <w:spacing w:after="0"/>
-      </w:pPr>
-      <w:r>
-        <w:t>The final course grade will be calculated using the following assessments:</w:t>
-      </w:r>
-    </w:p>
-    <w:tbl>
-      <w:tblPr>
-        <w:tblStyle w:val="TableGrid"/>
-        <w:tblW w:w="0" w:type="auto"/>
-        <w:tblLook w:val="04A0" w:firstRow="1" w:lastRow="0" w:firstColumn="1" w:lastColumn="0" w:noHBand="0" w:noVBand="1"/>
-      </w:tblPr>
-      <w:tblGrid>
-        <w:gridCol w:w="2947"/>
-        <w:gridCol w:w="1691"/>
-      </w:tblGrid>
-      <w:tr>
-        <w:trPr>
-          <w:trHeight w:val="382"/>
-        </w:trPr>
-        <w:tc>
-          <w:tcPr>
-            <w:tcW w:w="2947" w:type="dxa"/>
-            <w:tcBorders>
-              <w:top w:val="nil"/>
-              <w:left w:val="nil"/>
-            </w:tcBorders>
-          </w:tcPr>
-          <w:p>
-            <w:pPr>
-              <w:pStyle w:val="Heading3"/>
-              <w:outlineLvl w:val="2"/>
-              <w:rPr>
-                <w:b/>
-                <w:bCs/>
-              </w:rPr>
-            </w:pPr>
-            <w:r>
-              <w:rPr>
-                <w:b/>
-                <w:bCs/>
-                <w:color w:val="1F3864" w:themeColor="accent1" w:themeShade="80"/>
-              </w:rPr>
-              <w:t>Assessment</w:t>
-            </w:r>
-          </w:p>
-        </w:tc>
-        <w:tc>
-          <w:tcPr>
-            <w:tcW w:w="1691" w:type="dxa"/>
-            <w:tcBorders>
-              <w:top w:val="nil"/>
-              <w:right w:val="nil"/>
-            </w:tcBorders>
-          </w:tcPr>
-          <w:p>
-            <w:pPr>
-              <w:pStyle w:val="Heading3"/>
-              <w:outlineLvl w:val="2"/>
-              <w:rPr>
-                <w:b/>
-                <w:bCs/>
-              </w:rPr>
-            </w:pPr>
-            <w:r>
-              <w:rPr>
-                <w:b/>
-                <w:bCs/>
-              </w:rPr>
-              <w:t>Percentage of final grade</w:t>
-            </w:r>
-          </w:p>
-        </w:tc>
-      </w:tr>
-      <w:tr>
-        <w:trPr>
-          <w:trHeight w:val="300"/>
-        </w:trPr>
-        <w:tc>
-          <w:tcPr>
-            <w:tcW w:w="2947" w:type="dxa"/>
-            <w:tcBorders>
-              <w:left w:val="nil"/>
-            </w:tcBorders>
-          </w:tcPr>
-          <w:p/>
-        </w:tc>
-        <w:tc>
-          <w:tcPr>
-            <w:tcW w:w="1691" w:type="dxa"/>
-            <w:tcBorders>
-              <w:right w:val="nil"/>
-            </w:tcBorders>
-          </w:tcPr>
-          <w:p/>
-        </w:tc>
-      </w:tr>
-      <w:tr>
-        <w:trPr>
-          <w:trHeight w:val="300"/>
-        </w:trPr>
-        <w:tc>
-          <w:tcPr>
-            <w:tcW w:w="2947" w:type="dxa"/>
-            <w:tcBorders>
-              <w:left w:val="nil"/>
-            </w:tcBorders>
-          </w:tcPr>
-          <w:p/>
-        </w:tc>
-        <w:tc>
-          <w:tcPr>
-            <w:tcW w:w="1691" w:type="dxa"/>
-            <w:tcBorders>
-              <w:right w:val="nil"/>
-            </w:tcBorders>
-          </w:tcPr>
-          <w:p/>
-        </w:tc>
-      </w:tr>
-      <w:tr>
-        <w:trPr>
-          <w:trHeight w:val="300"/>
-        </w:trPr>
-        <w:tc>
-          <w:tcPr>
-            <w:tcW w:w="2947" w:type="dxa"/>
-            <w:tcBorders>
-              <w:left w:val="nil"/>
-            </w:tcBorders>
-          </w:tcPr>
-          <w:p/>
-        </w:tc>
-        <w:tc>
-          <w:tcPr>
-            <w:tcW w:w="1691" w:type="dxa"/>
-            <w:tcBorders>
-              <w:right w:val="nil"/>
-            </w:tcBorders>
-          </w:tcPr>
-          <w:p/>
-        </w:tc>
-      </w:tr>
-      <w:tr>
-        <w:trPr>
-          <w:trHeight w:val="300"/>
-        </w:trPr>
-        <w:tc>
-          <w:tcPr>
-            <w:tcW w:w="2947" w:type="dxa"/>
-            <w:tcBorders>
-              <w:left w:val="nil"/>
-            </w:tcBorders>
-          </w:tcPr>
-          <w:p/>
-        </w:tc>
-        <w:tc>
-          <w:tcPr>
-            <w:tcW w:w="1691" w:type="dxa"/>
-            <w:tcBorders>
-              <w:right w:val="nil"/>
-            </w:tcBorders>
-          </w:tcPr>
-          <w:p/>
-        </w:tc>
-      </w:tr>
-      <w:tr>
-        <w:trPr>
-          <w:trHeight w:val="300"/>
-        </w:trPr>
-        <w:tc>
-          <w:tcPr>
-            <w:tcW w:w="2947" w:type="dxa"/>
-            <w:tcBorders>
-              <w:left w:val="nil"/>
-            </w:tcBorders>
-          </w:tcPr>
-          <w:p/>
-        </w:tc>
-        <w:tc>
-          <w:tcPr>
-            <w:tcW w:w="1691" w:type="dxa"/>
-            <w:tcBorders>
-              <w:right w:val="nil"/>
-            </w:tcBorders>
-          </w:tcPr>
-          <w:p/>
-        </w:tc>
-      </w:tr>
-    </w:tbl>
-    <w:p>
-      <w:pPr>
-        <w:spacing w:after="0"/>
-      </w:pPr>
-    </w:p>
-    <w:p>
-      <w:pPr>
-        <w:spacing w:after="0"/>
+          <w:rFonts w:asciiTheme="minorHAnsi" w:hAnsiTheme="minorHAnsi" w:cstheme="minorHAnsi"/>
+          <w:i w:val="0"/>
+          <w:iCs w:val="0"/>
+          <w:color w:val="auto"/>
+        </w:rPr>
+        <w:t>grading_policies_syllabus_json</w:t>
+      </w:r>
+      <w:proofErr w:type="spellEnd"/>
+      <w:r>
         <w:rPr>
           <w:rStyle w:val="Heading4Char"/>
-          <w:b/>
-          <w:bCs/>
-          <w:color w:val="1F3864" w:themeColor="accent1" w:themeShade="80"/>
-        </w:rPr>
-      </w:pPr>
-    </w:p>
-    <w:p>
-      <w:pPr>
-        <w:spacing w:after="0"/>
-      </w:pPr>
-      <w:r>
-        <w:rPr>
-          <w:rStyle w:val="Heading4Char"/>
-          <w:b/>
-          <w:bCs/>
-          <w:color w:val="1F3864" w:themeColor="accent1" w:themeShade="80"/>
-        </w:rPr>
-        <w:t xml:space="preserve">Brief Description of </w:t>
-      </w:r>
-      <w:r>
-        <w:rPr>
-          <w:rStyle w:val="Heading4Char"/>
-          <w:b/>
-          <w:bCs/>
-          <w:color w:val="1F3864" w:themeColor="accent1" w:themeShade="80"/>
-        </w:rPr>
-        <w:t>Assessment</w:t>
-      </w:r>
-      <w:r>
-        <w:rPr>
-          <w:rStyle w:val="Heading4Char"/>
-          <w:b/>
-          <w:bCs/>
-          <w:color w:val="1F3864" w:themeColor="accent1" w:themeShade="80"/>
-        </w:rPr>
-        <w:t xml:space="preserve"> 1</w:t>
-      </w:r>
-      <w:r>
-        <w:t xml:space="preserve">: </w:t>
-      </w:r>
-    </w:p>
-    <w:p>
-      <w:pPr>
-        <w:spacing w:after="0"/>
-      </w:pPr>
-      <w:r>
-        <w:rPr>
-          <w:rStyle w:val="Heading4Char"/>
-          <w:b/>
-          <w:bCs/>
-          <w:color w:val="1F3864" w:themeColor="accent1" w:themeShade="80"/>
-        </w:rPr>
-        <w:t>Brief Description of Assessment 2</w:t>
-      </w:r>
-      <w:r>
-        <w:t xml:space="preserve">: </w:t>
-      </w:r>
-    </w:p>
-    <w:p>
-      <w:pPr>
-        <w:spacing w:after="0"/>
-      </w:pPr>
-      <w:r>
-        <w:rPr>
-          <w:rStyle w:val="Heading4Char"/>
-          <w:b/>
-          <w:bCs/>
-          <w:color w:val="1F3864" w:themeColor="accent1" w:themeShade="80"/>
-        </w:rPr>
-        <w:t>Brief Description of Assessment 3</w:t>
-      </w:r>
-      <w:r>
-        <w:t xml:space="preserve">: </w:t>
-      </w:r>
-    </w:p>
-    <w:p>
-      <w:pPr>
-        <w:spacing w:after="0"/>
-      </w:pPr>
-      <w:r>
-        <w:rPr>
-          <w:rStyle w:val="Heading4Char"/>
-          <w:b/>
-          <w:bCs/>
-          <w:color w:val="1F3864" w:themeColor="accent1" w:themeShade="80"/>
-        </w:rPr>
-        <w:t>Brief Description of Assessment 4</w:t>
-      </w:r>
-      <w:r>
-        <w:t xml:space="preserve">: </w:t>
-      </w:r>
-    </w:p>
-    <w:p>
-      <w:pPr>
-        <w:spacing w:after="0"/>
-      </w:pPr>
-      <w:r>
-        <w:rPr>
-          <w:rStyle w:val="Heading4Char"/>
-          <w:b/>
-          <w:bCs/>
-          <w:color w:val="1F3864" w:themeColor="accent1" w:themeShade="80"/>
-        </w:rPr>
-        <w:t>Brief Description of Assessment 5</w:t>
-      </w:r>
-      <w:r>
-        <w:t>:</w:t>
-      </w:r>
-      <w:r>
-        <w:t xml:space="preserve"> </w:t>
-      </w:r>
-      <w:r>
-        <w:t xml:space="preserve"> </w:t>
-      </w:r>
-    </w:p>
-    <w:p>
-      <w:pPr>
-        <w:spacing w:after="0"/>
-      </w:pPr>
-    </w:p>
-    <w:p>
-      <w:pPr>
-        <w:spacing w:after="0"/>
-      </w:pPr>
-      <w:r>
-        <w:t>Students will be assigned the following final letter grades, based on the calculations coming from the course assessment section.</w:t>
-      </w:r>
-    </w:p>
-    <w:tbl>
-      <w:tblPr>
-        <w:tblStyle w:val="TableGrid"/>
-        <w:tblW w:w="0" w:type="auto"/>
-        <w:tblLook w:val="04A0" w:firstRow="1" w:lastRow="0" w:firstColumn="1" w:lastColumn="0" w:noHBand="0" w:noVBand="1"/>
-      </w:tblPr>
-      <w:tblGrid>
-        <w:gridCol w:w="2463"/>
-        <w:gridCol w:w="2463"/>
-      </w:tblGrid>
-      <w:tr>
-        <w:trPr>
-          <w:trHeight w:val="250"/>
-        </w:trPr>
-        <w:tc>
-          <w:tcPr>
-            <w:tcW w:w="2463" w:type="dxa"/>
-            <w:tcBorders>
-              <w:top w:val="nil"/>
-              <w:left w:val="nil"/>
-            </w:tcBorders>
-          </w:tcPr>
-          <w:p>
-            <w:r>
-              <w:rPr>
-                <w:rFonts w:asciiTheme="majorHAnsi" w:eastAsiaTheme="majorEastAsia" w:hAnsiTheme="majorHAnsi" w:cstheme="majorBidi"/>
-                <w:b/>
-                <w:bCs/>
-                <w:color w:val="1F3864" w:themeColor="accent1" w:themeShade="80"/>
-                <w:sz w:val="24"/>
-                <w:szCs w:val="24"/>
-              </w:rPr>
-              <w:t>Grade</w:t>
-            </w:r>
-          </w:p>
-        </w:tc>
-        <w:tc>
-          <w:tcPr>
-            <w:tcW w:w="2463" w:type="dxa"/>
-            <w:tcBorders>
-              <w:top w:val="nil"/>
-              <w:right w:val="nil"/>
-            </w:tcBorders>
-          </w:tcPr>
-          <w:p>
-            <w:r>
-              <w:rPr>
-                <w:rFonts w:asciiTheme="majorHAnsi" w:eastAsiaTheme="majorEastAsia" w:hAnsiTheme="majorHAnsi" w:cstheme="majorBidi"/>
-                <w:b/>
-                <w:bCs/>
-                <w:color w:val="1F3864" w:themeColor="accent1" w:themeShade="80"/>
-                <w:sz w:val="24"/>
-                <w:szCs w:val="24"/>
-              </w:rPr>
-              <w:t>Percentage Interval</w:t>
-            </w:r>
-          </w:p>
-        </w:tc>
-      </w:tr>
-      <w:tr>
-        <w:trPr>
-          <w:trHeight w:val="250"/>
-        </w:trPr>
-        <w:tc>
-          <w:tcPr>
-            <w:tcW w:w="2463" w:type="dxa"/>
-            <w:tcBorders>
-              <w:left w:val="nil"/>
-            </w:tcBorders>
-          </w:tcPr>
-          <w:p>
-            <w:r>
-              <w:t>A</w:t>
-            </w:r>
-          </w:p>
-        </w:tc>
-        <w:tc>
-          <w:tcPr>
-            <w:tcW w:w="2463" w:type="dxa"/>
-            <w:tcBorders>
-              <w:right w:val="nil"/>
-            </w:tcBorders>
-          </w:tcPr>
-          <w:p>
-            <w:r>
-              <w:t>94-100% or XX-XX points</w:t>
-            </w:r>
-          </w:p>
-        </w:tc>
-      </w:tr>
-      <w:tr>
-        <w:trPr>
-          <w:trHeight w:val="262"/>
-        </w:trPr>
-        <w:tc>
-          <w:tcPr>
-            <w:tcW w:w="2463" w:type="dxa"/>
-            <w:tcBorders>
-              <w:left w:val="nil"/>
-            </w:tcBorders>
-          </w:tcPr>
-          <w:p>
-            <w:r>
-              <w:t>A-</w:t>
-            </w:r>
-          </w:p>
-        </w:tc>
-        <w:tc>
-          <w:tcPr>
-            <w:tcW w:w="2463" w:type="dxa"/>
-            <w:tcBorders>
-              <w:right w:val="nil"/>
-            </w:tcBorders>
-          </w:tcPr>
-          <w:p/>
-        </w:tc>
-      </w:tr>
-      <w:tr>
-        <w:trPr>
-          <w:trHeight w:val="250"/>
-        </w:trPr>
-        <w:tc>
-          <w:tcPr>
-            <w:tcW w:w="2463" w:type="dxa"/>
-            <w:tcBorders>
-              <w:left w:val="nil"/>
-            </w:tcBorders>
-          </w:tcPr>
-          <w:p>
-            <w:r>
-              <w:t>B+</w:t>
-            </w:r>
-          </w:p>
-        </w:tc>
-        <w:tc>
-          <w:tcPr>
-            <w:tcW w:w="2463" w:type="dxa"/>
-            <w:tcBorders>
-              <w:right w:val="nil"/>
-            </w:tcBorders>
-          </w:tcPr>
-          <w:p/>
-        </w:tc>
-      </w:tr>
-      <w:tr>
-        <w:trPr>
-          <w:trHeight w:val="250"/>
-        </w:trPr>
-        <w:tc>
-          <w:tcPr>
-            <w:tcW w:w="2463" w:type="dxa"/>
-            <w:tcBorders>
-              <w:left w:val="nil"/>
-            </w:tcBorders>
-          </w:tcPr>
-          <w:p>
-            <w:r>
-              <w:t>B</w:t>
-            </w:r>
-          </w:p>
-        </w:tc>
-        <w:tc>
-          <w:tcPr>
-            <w:tcW w:w="2463" w:type="dxa"/>
-            <w:tcBorders>
-              <w:right w:val="nil"/>
-            </w:tcBorders>
-          </w:tcPr>
-          <w:p/>
-        </w:tc>
-      </w:tr>
-      <w:tr>
-        <w:trPr>
-          <w:trHeight w:val="250"/>
-        </w:trPr>
-        <w:tc>
-          <w:tcPr>
-            <w:tcW w:w="2463" w:type="dxa"/>
-            <w:tcBorders>
-              <w:left w:val="nil"/>
-            </w:tcBorders>
-          </w:tcPr>
-          <w:p>
-            <w:r>
-              <w:t>B-</w:t>
-            </w:r>
-          </w:p>
-        </w:tc>
-        <w:tc>
-          <w:tcPr>
-            <w:tcW w:w="2463" w:type="dxa"/>
-            <w:tcBorders>
-              <w:right w:val="nil"/>
-            </w:tcBorders>
-          </w:tcPr>
-          <w:p/>
-        </w:tc>
-      </w:tr>
-      <w:tr>
-        <w:trPr>
-          <w:trHeight w:val="250"/>
-        </w:trPr>
-        <w:tc>
-          <w:tcPr>
-            <w:tcW w:w="2463" w:type="dxa"/>
-            <w:tcBorders>
-              <w:left w:val="nil"/>
-            </w:tcBorders>
-          </w:tcPr>
-          <w:p>
-            <w:r>
-              <w:t>C+</w:t>
-            </w:r>
-          </w:p>
-        </w:tc>
-        <w:tc>
-          <w:tcPr>
-            <w:tcW w:w="2463" w:type="dxa"/>
-            <w:tcBorders>
-              <w:right w:val="nil"/>
-            </w:tcBorders>
-          </w:tcPr>
-          <w:p/>
-        </w:tc>
-      </w:tr>
-      <w:tr>
-        <w:trPr>
-          <w:trHeight w:val="262"/>
-        </w:trPr>
-        <w:tc>
-          <w:tcPr>
-            <w:tcW w:w="2463" w:type="dxa"/>
-            <w:tcBorders>
-              <w:left w:val="nil"/>
-            </w:tcBorders>
-          </w:tcPr>
-          <w:p>
-            <w:r>
-              <w:t>C</w:t>
-            </w:r>
-          </w:p>
-        </w:tc>
-        <w:tc>
-          <w:tcPr>
-            <w:tcW w:w="2463" w:type="dxa"/>
-            <w:tcBorders>
-              <w:right w:val="nil"/>
-            </w:tcBorders>
-          </w:tcPr>
-          <w:p/>
-        </w:tc>
-      </w:tr>
-      <w:tr>
-        <w:trPr>
-          <w:trHeight w:val="250"/>
-        </w:trPr>
-        <w:tc>
-          <w:tcPr>
-            <w:tcW w:w="2463" w:type="dxa"/>
-            <w:tcBorders>
-              <w:left w:val="nil"/>
-            </w:tcBorders>
-          </w:tcPr>
-          <w:p>
-            <w:r>
-              <w:t>C-</w:t>
-            </w:r>
-          </w:p>
-        </w:tc>
-        <w:tc>
-          <w:tcPr>
-            <w:tcW w:w="2463" w:type="dxa"/>
-            <w:tcBorders>
-              <w:right w:val="nil"/>
-            </w:tcBorders>
-          </w:tcPr>
-          <w:p/>
-        </w:tc>
-      </w:tr>
-      <w:tr>
-        <w:trPr>
-          <w:trHeight w:val="250"/>
-        </w:trPr>
-        <w:tc>
-          <w:tcPr>
-            <w:tcW w:w="2463" w:type="dxa"/>
-            <w:tcBorders>
-              <w:left w:val="nil"/>
-            </w:tcBorders>
-          </w:tcPr>
-          <w:p>
-            <w:r>
-              <w:t>D+</w:t>
-            </w:r>
-          </w:p>
-        </w:tc>
-        <w:tc>
-          <w:tcPr>
-            <w:tcW w:w="2463" w:type="dxa"/>
-            <w:tcBorders>
-              <w:right w:val="nil"/>
-            </w:tcBorders>
-          </w:tcPr>
-          <w:p/>
-        </w:tc>
-      </w:tr>
-      <w:tr>
-        <w:trPr>
-          <w:trHeight w:val="250"/>
-        </w:trPr>
-        <w:tc>
-          <w:tcPr>
-            <w:tcW w:w="2463" w:type="dxa"/>
-            <w:tcBorders>
-              <w:left w:val="nil"/>
-            </w:tcBorders>
-          </w:tcPr>
-          <w:p>
-            <w:r>
-              <w:t>D</w:t>
-            </w:r>
-          </w:p>
-        </w:tc>
-        <w:tc>
-          <w:tcPr>
-            <w:tcW w:w="2463" w:type="dxa"/>
-            <w:tcBorders>
-              <w:right w:val="nil"/>
-            </w:tcBorders>
-          </w:tcPr>
-          <w:p/>
-        </w:tc>
-      </w:tr>
-      <w:tr>
-        <w:trPr>
-          <w:trHeight w:val="250"/>
-        </w:trPr>
-        <w:tc>
-          <w:tcPr>
-            <w:tcW w:w="2463" w:type="dxa"/>
-            <w:tcBorders>
-              <w:left w:val="nil"/>
-            </w:tcBorders>
-          </w:tcPr>
-          <w:p>
-            <w:r>
-              <w:t>F</w:t>
-            </w:r>
-          </w:p>
-        </w:tc>
-        <w:tc>
-          <w:tcPr>
-            <w:tcW w:w="2463" w:type="dxa"/>
-            <w:tcBorders>
-              <w:right w:val="nil"/>
-            </w:tcBorders>
-          </w:tcPr>
-          <w:p/>
-        </w:tc>
-      </w:tr>
-    </w:tbl>
+          <w:rFonts w:asciiTheme="minorHAnsi" w:hAnsiTheme="minorHAnsi" w:cstheme="minorHAnsi"/>
+          <w:i w:val="0"/>
+          <w:iCs w:val="0"/>
+          <w:color w:val="auto"/>
+        </w:rPr>
+        <w:t>}</w:t>
+      </w:r>
+    </w:p>
     <w:p>
       <w:pPr>
         <w:spacing w:after="0"/>
@@ -2083,64 +1587,45 @@
           <w:sz w:val="26"/>
           <w:szCs w:val="26"/>
         </w:rPr>
-        <w:t>Grading Policies</w:t>
-      </w:r>
-    </w:p>
-    <w:p>
-      <w:pPr>
-        <w:spacing w:after="0"/>
-      </w:pPr>
-      <w:r>
-        <w:rPr>
-          <w:rStyle w:val="Heading4Char"/>
-          <w:b/>
-          <w:bCs/>
-          <w:color w:val="1F3864" w:themeColor="accent1" w:themeShade="80"/>
-        </w:rPr>
-        <w:t>Late Work Policy:</w:t>
-      </w:r>
-      <w:r>
-        <w:t xml:space="preserve"> </w:t>
-      </w:r>
-    </w:p>
-    <w:p>
-      <w:pPr>
-        <w:spacing w:after="0"/>
-      </w:pPr>
-      <w:r>
-        <w:rPr>
-          <w:rStyle w:val="Heading4Char"/>
-          <w:b/>
-          <w:bCs/>
-          <w:color w:val="1F3864" w:themeColor="accent1" w:themeShade="80"/>
-        </w:rPr>
-        <w:t>Re-grade or Re-submission Policy</w:t>
-      </w:r>
-      <w:r>
-        <w:t xml:space="preserve">: </w:t>
-      </w:r>
-    </w:p>
-    <w:p>
-      <w:pPr>
-        <w:spacing w:after="0"/>
-      </w:pPr>
-      <w:r>
-        <w:rPr>
-          <w:rStyle w:val="Heading4Char"/>
-          <w:b/>
-          <w:bCs/>
-          <w:color w:val="1F3864" w:themeColor="accent1" w:themeShade="80"/>
-        </w:rPr>
-        <w:t>Attendance and/or participation policy</w:t>
-      </w:r>
-      <w:r>
-        <w:t xml:space="preserve">: </w:t>
-      </w:r>
-    </w:p>
-    <w:p>
-      <w:pPr>
-        <w:spacing w:after="0"/>
-      </w:pPr>
+        <w:t>Course and University Policies</w:t>
+      </w:r>
+      <w:r>
+        <w:rPr>
+          <w:b/>
+          <w:bCs/>
+          <w:color w:val="1F3864" w:themeColor="accent1" w:themeShade="80"/>
+          <w:sz w:val="26"/>
+          <w:szCs w:val="26"/>
+        </w:rPr>
+        <w:t xml:space="preserve"> and Resources</w:t>
+      </w:r>
+    </w:p>
+    <w:p/>
+    <w:p>
+      <w:r>
+        <w:t>${</w:t>
+      </w:r>
+      <w:proofErr w:type="spellStart"/>
+      <w:r>
+        <w:t>policy_statements</w:t>
+      </w:r>
+      <w:proofErr w:type="spellEnd"/>
+      <w:r>
+        <w:t>}</w:t>
+      </w:r>
+    </w:p>
+    <w:p>
+      <w:r>
+        <w:t>${</w:t>
+      </w:r>
+      <w:proofErr w:type="spellStart"/>
+      <w:r>
+        <w:t>university_resources</w:t>
+      </w:r>
+      <w:proofErr w:type="spellEnd"/>
+      <w:r>
+        <w:t>}</w:t>
+      </w:r>
     </w:p>
     <w:p>
       <w:pPr>
@@ -2153,26 +1638,6 @@
           <w:szCs w:val="26"/>
         </w:rPr>
       </w:pPr>
-      <w:r>
-        <w:rPr>
-          <w:b/>
-          <w:bCs/>
-          <w:color w:val="1F3864" w:themeColor="accent1" w:themeShade="80"/>
-          <w:sz w:val="26"/>
-          <w:szCs w:val="26"/>
-        </w:rPr>
-        <w:t>Course and University Policies</w:t>
-      </w:r>
-      <w:r>
-        <w:rPr>
-          <w:b/>
-          <w:bCs/>
-          <w:color w:val="1F3864" w:themeColor="accent1" w:themeShade="80"/>
-          <w:sz w:val="26"/>
-          <w:szCs w:val="26"/>
-        </w:rPr>
-        <w:t xml:space="preserve"> and Resources</w:t>
-      </w:r>
     </w:p>
     <w:p>
       <w:pPr>
@@ -2185,18 +1650,6 @@
           <w:szCs w:val="26"/>
         </w:rPr>
       </w:pPr>
-    </w:p>
-    <w:p>
-      <w:pPr>
-        <w:pStyle w:val="Heading3"/>
-        <w:rPr>
-          <w:b/>
-          <w:bCs/>
-          <w:color w:val="1F3864" w:themeColor="accent1" w:themeShade="80"/>
-          <w:sz w:val="26"/>
-          <w:szCs w:val="26"/>
-        </w:rPr>
-      </w:pPr>
       <w:r>
         <w:rPr>
           <w:b/>
@@ -2208,307 +1661,20 @@
         <w:t>Course Schedule</w:t>
       </w:r>
     </w:p>
-    <w:tbl>
-      <w:tblPr>
-        <w:tblStyle w:val="TableGrid"/>
-        <w:tblW w:w="0" w:type="auto"/>
-        <w:tblLook w:val="04A0" w:firstRow="1" w:lastRow="0" w:firstColumn="1" w:lastColumn="0" w:noHBand="0" w:noVBand="1"/>
-      </w:tblPr>
-      <w:tblGrid>
-        <w:gridCol w:w="1255"/>
-        <w:gridCol w:w="2698"/>
-        <w:gridCol w:w="2698"/>
-        <w:gridCol w:w="2699"/>
-      </w:tblGrid>
-      <w:tr>
-        <w:tc>
-          <w:tcPr>
-            <w:tcW w:w="1255" w:type="dxa"/>
-            <w:tcBorders>
-              <w:top w:val="nil"/>
-              <w:left w:val="nil"/>
-            </w:tcBorders>
-            <w:vAlign w:val="center"/>
-          </w:tcPr>
-          <w:p>
-            <w:pPr>
-              <w:jc w:val="center"/>
-              <w:rPr>
-                <w:b/>
-                <w:bCs/>
-                <w:color w:val="1F3864" w:themeColor="accent1" w:themeShade="80"/>
-                <w:sz w:val="24"/>
-                <w:szCs w:val="24"/>
-              </w:rPr>
-            </w:pPr>
-            <w:r>
-              <w:rPr>
-                <w:b/>
-                <w:bCs/>
-                <w:color w:val="1F3864" w:themeColor="accent1" w:themeShade="80"/>
-                <w:sz w:val="24"/>
-                <w:szCs w:val="24"/>
-              </w:rPr>
-              <w:t>Date</w:t>
-            </w:r>
-          </w:p>
-        </w:tc>
-        <w:tc>
-          <w:tcPr>
-            <w:tcW w:w="2698" w:type="dxa"/>
-            <w:tcBorders>
-              <w:top w:val="nil"/>
-            </w:tcBorders>
-            <w:vAlign w:val="center"/>
-          </w:tcPr>
-          <w:p>
-            <w:pPr>
-              <w:jc w:val="center"/>
-              <w:rPr>
-                <w:b/>
-                <w:bCs/>
-                <w:color w:val="1F3864" w:themeColor="accent1" w:themeShade="80"/>
-                <w:sz w:val="24"/>
-                <w:szCs w:val="24"/>
-              </w:rPr>
-            </w:pPr>
-            <w:r>
-              <w:rPr>
-                <w:b/>
-                <w:bCs/>
-                <w:color w:val="1F3864" w:themeColor="accent1" w:themeShade="80"/>
-                <w:sz w:val="24"/>
-                <w:szCs w:val="24"/>
-              </w:rPr>
-              <w:t>Theme/Topic</w:t>
-            </w:r>
-          </w:p>
-        </w:tc>
-        <w:tc>
-          <w:tcPr>
-            <w:tcW w:w="2698" w:type="dxa"/>
-            <w:tcBorders>
-              <w:top w:val="nil"/>
-            </w:tcBorders>
-            <w:vAlign w:val="center"/>
-          </w:tcPr>
-          <w:p>
-            <w:pPr>
-              <w:jc w:val="center"/>
-              <w:rPr>
-                <w:b/>
-                <w:bCs/>
-                <w:color w:val="1F3864" w:themeColor="accent1" w:themeShade="80"/>
-                <w:sz w:val="24"/>
-                <w:szCs w:val="24"/>
-              </w:rPr>
-            </w:pPr>
-            <w:r>
-              <w:rPr>
-                <w:b/>
-                <w:bCs/>
-                <w:color w:val="1F3864" w:themeColor="accent1" w:themeShade="80"/>
-                <w:sz w:val="24"/>
-                <w:szCs w:val="24"/>
-              </w:rPr>
-              <w:t>Learning Outcomes Addressed</w:t>
-            </w:r>
-          </w:p>
-        </w:tc>
-        <w:tc>
-          <w:tcPr>
-            <w:tcW w:w="2699" w:type="dxa"/>
-            <w:tcBorders>
-              <w:top w:val="nil"/>
-              <w:right w:val="nil"/>
-            </w:tcBorders>
-            <w:vAlign w:val="center"/>
-          </w:tcPr>
-          <w:p>
-            <w:pPr>
-              <w:jc w:val="center"/>
-              <w:rPr>
-                <w:b/>
-                <w:bCs/>
-                <w:color w:val="1F3864" w:themeColor="accent1" w:themeShade="80"/>
-                <w:sz w:val="24"/>
-                <w:szCs w:val="24"/>
-              </w:rPr>
-            </w:pPr>
-            <w:r>
-              <w:rPr>
-                <w:b/>
-                <w:bCs/>
-                <w:color w:val="1F3864" w:themeColor="accent1" w:themeShade="80"/>
-                <w:sz w:val="24"/>
-                <w:szCs w:val="24"/>
-              </w:rPr>
-              <w:t>Readings/Assignments Due</w:t>
-            </w:r>
-          </w:p>
-        </w:tc>
-      </w:tr>
-      <w:tr>
-        <w:tc>
-          <w:tcPr>
-            <w:tcW w:w="1255" w:type="dxa"/>
-            <w:tcBorders>
-              <w:left w:val="nil"/>
-            </w:tcBorders>
-          </w:tcPr>
-          <w:p/>
-        </w:tc>
-        <w:tc>
-          <w:tcPr>
-            <w:tcW w:w="2698" w:type="dxa"/>
-          </w:tcPr>
-          <w:p/>
-        </w:tc>
-        <w:tc>
-          <w:tcPr>
-            <w:tcW w:w="2698" w:type="dxa"/>
-          </w:tcPr>
-          <w:p/>
-        </w:tc>
-        <w:tc>
-          <w:tcPr>
-            <w:tcW w:w="2699" w:type="dxa"/>
-            <w:tcBorders>
-              <w:right w:val="nil"/>
-            </w:tcBorders>
-          </w:tcPr>
-          <w:p/>
-        </w:tc>
-      </w:tr>
-      <w:tr>
-        <w:tc>
-          <w:tcPr>
-            <w:tcW w:w="1255" w:type="dxa"/>
-            <w:tcBorders>
-              <w:left w:val="nil"/>
-            </w:tcBorders>
-          </w:tcPr>
-          <w:p/>
-        </w:tc>
-        <w:tc>
-          <w:tcPr>
-            <w:tcW w:w="2698" w:type="dxa"/>
-          </w:tcPr>
-          <w:p/>
-        </w:tc>
-        <w:tc>
-          <w:tcPr>
-            <w:tcW w:w="2698" w:type="dxa"/>
-          </w:tcPr>
-          <w:p/>
-        </w:tc>
-        <w:tc>
-          <w:tcPr>
-            <w:tcW w:w="2699" w:type="dxa"/>
-            <w:tcBorders>
-              <w:right w:val="nil"/>
-            </w:tcBorders>
-          </w:tcPr>
-          <w:p/>
-        </w:tc>
-      </w:tr>
-      <w:tr>
-        <w:tc>
-          <w:tcPr>
-            <w:tcW w:w="1255" w:type="dxa"/>
-            <w:tcBorders>
-              <w:left w:val="nil"/>
-            </w:tcBorders>
-          </w:tcPr>
-          <w:p/>
-        </w:tc>
-        <w:tc>
-          <w:tcPr>
-            <w:tcW w:w="2698" w:type="dxa"/>
-          </w:tcPr>
-          <w:p/>
-        </w:tc>
-        <w:tc>
-          <w:tcPr>
-            <w:tcW w:w="2698" w:type="dxa"/>
-          </w:tcPr>
-          <w:p/>
-        </w:tc>
-        <w:tc>
-          <w:tcPr>
-            <w:tcW w:w="2699" w:type="dxa"/>
-            <w:tcBorders>
-              <w:right w:val="nil"/>
-            </w:tcBorders>
-          </w:tcPr>
-          <w:p/>
-        </w:tc>
-      </w:tr>
-      <w:tr>
-        <w:tc>
-          <w:tcPr>
-            <w:tcW w:w="1255" w:type="dxa"/>
-            <w:tcBorders>
-              <w:left w:val="nil"/>
-            </w:tcBorders>
-          </w:tcPr>
-          <w:p/>
-        </w:tc>
-        <w:tc>
-          <w:tcPr>
-            <w:tcW w:w="2698" w:type="dxa"/>
-          </w:tcPr>
-          <w:p/>
-        </w:tc>
-        <w:tc>
-          <w:tcPr>
-            <w:tcW w:w="2698" w:type="dxa"/>
-          </w:tcPr>
-          <w:p/>
-        </w:tc>
-        <w:tc>
-          <w:tcPr>
-            <w:tcW w:w="2699" w:type="dxa"/>
-            <w:tcBorders>
-              <w:right w:val="nil"/>
-            </w:tcBorders>
-          </w:tcPr>
-          <w:p/>
-        </w:tc>
-      </w:tr>
-      <w:tr>
-        <w:tc>
-          <w:tcPr>
-            <w:tcW w:w="1255" w:type="dxa"/>
-            <w:tcBorders>
-              <w:left w:val="nil"/>
-            </w:tcBorders>
-          </w:tcPr>
-          <w:p/>
-        </w:tc>
-        <w:tc>
-          <w:tcPr>
-            <w:tcW w:w="2698" w:type="dxa"/>
-          </w:tcPr>
-          <w:p/>
-        </w:tc>
-        <w:tc>
-          <w:tcPr>
-            <w:tcW w:w="2698" w:type="dxa"/>
-          </w:tcPr>
-          <w:p/>
-        </w:tc>
-        <w:tc>
-          <w:tcPr>
-            <w:tcW w:w="2699" w:type="dxa"/>
-            <w:tcBorders>
-              <w:right w:val="nil"/>
-            </w:tcBorders>
-          </w:tcPr>
-          <w:p/>
-        </w:tc>
-      </w:tr>
-    </w:tbl>
+    <w:p/>
+    <w:p>
+      <w:r>
+        <w:t>${</w:t>
+      </w:r>
+      <w:proofErr w:type="spellStart"/>
+      <w:r>
+        <w:t>course_schedule_list</w:t>
+      </w:r>
+      <w:proofErr w:type="spellEnd"/>
+      <w:r>
+        <w:t>}</w:t>
+      </w:r>
+    </w:p>
     <w:p>
       <w:pPr>
         <w:spacing w:after="0"/>
@@ -3866,6 +3032,21 @@
 </file>
 
 <file path=customXml/item1.xml><?xml version="1.0" encoding="utf-8"?>
+<p:properties xmlns:p="http://schemas.microsoft.com/office/2006/metadata/properties" xmlns:xsi="http://www.w3.org/2001/XMLSchema-instance" xmlns:pc="http://schemas.microsoft.com/office/infopath/2007/PartnerControls">
+  <documentManagement/>
+</p:properties>
+</file>
+
+<file path=customXml/item2.xml><?xml version="1.0" encoding="utf-8"?>
+<?mso-contentType ?>
+<FormTemplates xmlns="http://schemas.microsoft.com/sharepoint/v3/contenttype/forms">
+  <Display>DocumentLibraryForm</Display>
+  <Edit>DocumentLibraryForm</Edit>
+  <New>DocumentLibraryForm</New>
+</FormTemplates>
+</file>
+
+<file path=customXml/item3.xml><?xml version="1.0" encoding="utf-8"?>
 <ct:contentTypeSchema xmlns:ct="http://schemas.microsoft.com/office/2006/metadata/contentType" xmlns:ma="http://schemas.microsoft.com/office/2006/metadata/properties/metaAttributes" ct:_="" ma:_="" ma:contentTypeName="Document" ma:contentTypeID="0x01010043AC30EE3931924C951949B01581249A" ma:contentTypeVersion="3" ma:contentTypeDescription="Create a new document." ma:contentTypeScope="" ma:versionID="ecba60cf1f3c2b4798aa357a3e04473e">
   <xsd:schema xmlns:xsd="http://www.w3.org/2001/XMLSchema" xmlns:xs="http://www.w3.org/2001/XMLSchema" xmlns:p="http://schemas.microsoft.com/office/2006/metadata/properties" xmlns:ns2="5e46cd92-5281-4aec-af6d-ce68d6323cf6" targetNamespace="http://schemas.microsoft.com/office/2006/metadata/properties" ma:root="true" ma:fieldsID="749246a7d39d1518a48c156f5ef050f5" ns2:_="">
     <xsd:import namespace="5e46cd92-5281-4aec-af6d-ce68d6323cf6"/>
@@ -4003,26 +3184,28 @@
 </ct:contentTypeSchema>
 </file>
 
-<file path=customXml/item2.xml><?xml version="1.0" encoding="utf-8"?>
+<file path=customXml/item4.xml><?xml version="1.0" encoding="utf-8"?>
 <b:Sources xmlns:b="http://schemas.openxmlformats.org/officeDocument/2006/bibliography" xmlns="http://schemas.openxmlformats.org/officeDocument/2006/bibliography" SelectedStyle="\APASixthEditionOfficeOnline.xsl" StyleName="APA" Version="6"/>
 </file>
 
-<file path=customXml/item3.xml><?xml version="1.0" encoding="utf-8"?>
-<p:properties xmlns:p="http://schemas.microsoft.com/office/2006/metadata/properties" xmlns:xsi="http://www.w3.org/2001/XMLSchema-instance" xmlns:pc="http://schemas.microsoft.com/office/infopath/2007/PartnerControls">
-  <documentManagement/>
-</p:properties>
+<file path=customXml/itemProps1.xml><?xml version="1.0" encoding="utf-8"?>
+<ds:datastoreItem xmlns:ds="http://schemas.openxmlformats.org/officeDocument/2006/customXml" ds:itemID="{509D1927-145B-4147-AE53-B018C6899FD0}">
+  <ds:schemaRefs>
+    <ds:schemaRef ds:uri="http://schemas.microsoft.com/office/2006/metadata/properties"/>
+    <ds:schemaRef ds:uri="http://schemas.microsoft.com/office/infopath/2007/PartnerControls"/>
+  </ds:schemaRefs>
+</ds:datastoreItem>
 </file>
 
-<file path=customXml/item4.xml><?xml version="1.0" encoding="utf-8"?>
-<?mso-contentType ?>
-<FormTemplates xmlns="http://schemas.microsoft.com/sharepoint/v3/contenttype/forms">
-  <Display>DocumentLibraryForm</Display>
-  <Edit>DocumentLibraryForm</Edit>
-  <New>DocumentLibraryForm</New>
-</FormTemplates>
+<file path=customXml/itemProps2.xml><?xml version="1.0" encoding="utf-8"?>
+<ds:datastoreItem xmlns:ds="http://schemas.openxmlformats.org/officeDocument/2006/customXml" ds:itemID="{E5876C36-A6F2-4B44-960A-B8B4B435ECCD}">
+  <ds:schemaRefs>
+    <ds:schemaRef ds:uri="http://schemas.microsoft.com/sharepoint/v3/contenttype/forms"/>
+  </ds:schemaRefs>
+</ds:datastoreItem>
 </file>
 
-<file path=customXml/itemProps1.xml><?xml version="1.0" encoding="utf-8"?>
+<file path=customXml/itemProps3.xml><?xml version="1.0" encoding="utf-8"?>
 <ds:datastoreItem xmlns:ds="http://schemas.openxmlformats.org/officeDocument/2006/customXml" ds:itemID="{D4AD5993-87D2-4E47-8D6E-96B6100FF46D}">
   <ds:schemaRefs>
     <ds:schemaRef ds:uri="http://schemas.microsoft.com/office/2006/metadata/contentType"/>
@@ -4040,27 +3223,10 @@
 </ds:datastoreItem>
 </file>
 
-<file path=customXml/itemProps2.xml><?xml version="1.0" encoding="utf-8"?>
+<file path=customXml/itemProps4.xml><?xml version="1.0" encoding="utf-8"?>
 <ds:datastoreItem xmlns:ds="http://schemas.openxmlformats.org/officeDocument/2006/customXml" ds:itemID="{99DD2AA0-78B3-40EA-8C1D-954E770C8D8A}">
   <ds:schemaRefs>
     <ds:schemaRef ds:uri="http://schemas.openxmlformats.org/officeDocument/2006/bibliography"/>
   </ds:schemaRefs>
 </ds:datastoreItem>
-</file>
-
-<file path=customXml/itemProps3.xml><?xml version="1.0" encoding="utf-8"?>
-<ds:datastoreItem xmlns:ds="http://schemas.openxmlformats.org/officeDocument/2006/customXml" ds:itemID="{509D1927-145B-4147-AE53-B018C6899FD0}">
-  <ds:schemaRefs>
-    <ds:schemaRef ds:uri="http://schemas.microsoft.com/office/2006/metadata/properties"/>
-    <ds:schemaRef ds:uri="http://schemas.microsoft.com/office/infopath/2007/PartnerControls"/>
-  </ds:schemaRefs>
-</ds:datastoreItem>
-</file>
-
-<file path=customXml/itemProps4.xml><?xml version="1.0" encoding="utf-8"?>
-<ds:datastoreItem xmlns:ds="http://schemas.openxmlformats.org/officeDocument/2006/customXml" ds:itemID="{E5876C36-A6F2-4B44-960A-B8B4B435ECCD}">
-  <ds:schemaRefs>
-    <ds:schemaRef ds:uri="http://schemas.microsoft.com/sharepoint/v3/contenttype/forms"/>
-  </ds:schemaRefs>
-</ds:datastoreItem>
 </file>
</xml_diff>

<commit_message>
Can generate everything in syllabus but univirsity resources (Still need to fix font))
</commit_message>
<xml_diff>
--- a/backend/docx/SyllabusTemplate.docx
+++ b/backend/docx/SyllabusTemplate.docx
@@ -1,6 +1,6 @@
 
 <file path=word/document.xml><?xml version="1.0" encoding="utf-8"?>
-<w:document xmlns:wpc="http://schemas.microsoft.com/office/word/2010/wordprocessingCanvas" xmlns:cx="http://schemas.microsoft.com/office/drawing/2014/chartex" xmlns:cx1="http://schemas.microsoft.com/office/drawing/2015/9/8/chartex" xmlns:cx2="http://schemas.microsoft.com/office/drawing/2015/10/21/chartex" xmlns:cx3="http://schemas.microsoft.com/office/drawing/2016/5/9/chartex" xmlns:cx4="http://schemas.microsoft.com/office/drawing/2016/5/10/chartex" xmlns:cx5="http://schemas.microsoft.com/office/drawing/2016/5/11/chartex" xmlns:cx6="http://schemas.microsoft.com/office/drawing/2016/5/12/chartex" xmlns:cx7="http://schemas.microsoft.com/office/drawing/2016/5/13/chartex" xmlns:cx8="http://schemas.microsoft.com/office/drawing/2016/5/14/chartex" xmlns:mc="http://schemas.openxmlformats.org/markup-compatibility/2006" xmlns:aink="http://schemas.microsoft.com/office/drawing/2016/ink" xmlns:am3d="http://schemas.microsoft.com/office/drawing/2017/model3d" xmlns:o="urn:schemas-microsoft-com:office:office" xmlns:oel="http://schemas.microsoft.com/office/2019/extlst" xmlns:r="http://schemas.openxmlformats.org/officeDocument/2006/relationships" xmlns:m="http://schemas.openxmlformats.org/officeDocument/2006/math" xmlns:v="urn:schemas-microsoft-com:vml" xmlns:wp14="http://schemas.microsoft.com/office/word/2010/wordprocessingDrawing" xmlns:wp="http://schemas.openxmlformats.org/drawingml/2006/wordprocessingDrawing" xmlns:w10="urn:schemas-microsoft-com:office:word" xmlns:w="http://schemas.openxmlformats.org/wordprocessingml/2006/main" xmlns:w14="http://schemas.microsoft.com/office/word/2010/wordml" xmlns:w15="http://schemas.microsoft.com/office/word/2012/wordml" xmlns:w16cex="http://schemas.microsoft.com/office/word/2018/wordml/cex" xmlns:w16cid="http://schemas.microsoft.com/office/word/2016/wordml/cid" xmlns:w16="http://schemas.microsoft.com/office/word/2018/wordml" xmlns:w16sdtdh="http://schemas.microsoft.com/office/word/2020/wordml/sdtdatahash" xmlns:w16se="http://schemas.microsoft.com/office/word/2015/wordml/symex" xmlns:wpg="http://schemas.microsoft.com/office/word/2010/wordprocessingGroup" xmlns:wpi="http://schemas.microsoft.com/office/word/2010/wordprocessingInk" xmlns:wne="http://schemas.microsoft.com/office/word/2006/wordml" xmlns:wps="http://schemas.microsoft.com/office/word/2010/wordprocessingShape" mc:Ignorable="w14 w15 w16se w16cid w16 w16cex w16sdtdh wp14">
+<w:document xmlns:wpc="http://schemas.microsoft.com/office/word/2010/wordprocessingCanvas" xmlns:cx="http://schemas.microsoft.com/office/drawing/2014/chartex" xmlns:cx1="http://schemas.microsoft.com/office/drawing/2015/9/8/chartex" xmlns:cx2="http://schemas.microsoft.com/office/drawing/2015/10/21/chartex" xmlns:cx3="http://schemas.microsoft.com/office/drawing/2016/5/9/chartex" xmlns:cx4="http://schemas.microsoft.com/office/drawing/2016/5/10/chartex" xmlns:cx5="http://schemas.microsoft.com/office/drawing/2016/5/11/chartex" xmlns:cx6="http://schemas.microsoft.com/office/drawing/2016/5/12/chartex" xmlns:cx7="http://schemas.microsoft.com/office/drawing/2016/5/13/chartex" xmlns:cx8="http://schemas.microsoft.com/office/drawing/2016/5/14/chartex" xmlns:mc="http://schemas.openxmlformats.org/markup-compatibility/2006" xmlns:aink="http://schemas.microsoft.com/office/drawing/2016/ink" xmlns:am3d="http://schemas.microsoft.com/office/drawing/2017/model3d" xmlns:o="urn:schemas-microsoft-com:office:office" xmlns:r="http://schemas.openxmlformats.org/officeDocument/2006/relationships" xmlns:m="http://schemas.openxmlformats.org/officeDocument/2006/math" xmlns:v="urn:schemas-microsoft-com:vml" xmlns:wp14="http://schemas.microsoft.com/office/word/2010/wordprocessingDrawing" xmlns:wp="http://schemas.openxmlformats.org/drawingml/2006/wordprocessingDrawing" xmlns:w10="urn:schemas-microsoft-com:office:word" xmlns:w="http://schemas.openxmlformats.org/wordprocessingml/2006/main" xmlns:w14="http://schemas.microsoft.com/office/word/2010/wordml" xmlns:w15="http://schemas.microsoft.com/office/word/2012/wordml" xmlns:w16cex="http://schemas.microsoft.com/office/word/2018/wordml/cex" xmlns:w16cid="http://schemas.microsoft.com/office/word/2016/wordml/cid" xmlns:w16="http://schemas.microsoft.com/office/word/2018/wordml" xmlns:w16sdtdh="http://schemas.microsoft.com/office/word/2020/wordml/sdtdatahash" xmlns:w16se="http://schemas.microsoft.com/office/word/2015/wordml/symex" xmlns:wpg="http://schemas.microsoft.com/office/word/2010/wordprocessingGroup" xmlns:wpi="http://schemas.microsoft.com/office/word/2010/wordprocessingInk" xmlns:wne="http://schemas.microsoft.com/office/word/2006/wordml" xmlns:wps="http://schemas.microsoft.com/office/word/2010/wordprocessingShape" mc:Ignorable="w14 w15 w16se w16cid w16 w16cex w16sdtdh wp14">
   <w:body>
     <w:p>
       <w:pPr>
@@ -80,7 +80,7 @@
               </wp:anchor>
             </w:drawing>
           </mc:Choice>
-          <mc:Fallback>
+          <mc:Fallback xmlns:oel="http://schemas.microsoft.com/office/2019/extlst">
             <w:pict>
               <v:line w14:anchorId="583C21A8" id="Straight Connector 4" o:spid="_x0000_s1026" style="position:absolute;z-index:251662336;visibility:visible;mso-wrap-style:square;mso-wrap-distance-left:9pt;mso-wrap-distance-top:0;mso-wrap-distance-right:9pt;mso-wrap-distance-bottom:0;mso-position-horizontal:absolute;mso-position-horizontal-relative:text;mso-position-vertical:absolute;mso-position-vertical-relative:text" from="110.1pt,-4.75pt" to="110.7pt,92.45pt" o:gfxdata="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" strokecolor="#1f3763 [1604]" strokeweight="1pt">
                 <v:stroke joinstyle="miter"/>
@@ -247,7 +247,7 @@
               </wp:anchor>
             </w:drawing>
           </mc:Choice>
-          <mc:Fallback xmlns:a="http://schemas.openxmlformats.org/drawingml/2006/main" xmlns:pic="http://schemas.openxmlformats.org/drawingml/2006/picture" xmlns:a14="http://schemas.microsoft.com/office/drawing/2010/main">
+          <mc:Fallback xmlns:a14="http://schemas.microsoft.com/office/drawing/2010/main" xmlns:pic="http://schemas.openxmlformats.org/drawingml/2006/picture" xmlns:a="http://schemas.openxmlformats.org/drawingml/2006/main" xmlns:oel="http://schemas.microsoft.com/office/2019/extlst">
             <w:pict w14:anchorId="08122B22">
               <v:line id="Straight Connector 3" style="position:absolute;z-index:251640832;visibility:visible;mso-wrap-style:square;mso-wrap-distance-left:9pt;mso-wrap-distance-top:0;mso-wrap-distance-right:9pt;mso-wrap-distance-bottom:0;mso-position-horizontal:absolute;mso-position-horizontal-relative:text;mso-position-vertical:absolute;mso-position-vertical-relative:text" o:spid="_x0000_s1026" strokecolor="#1f3763 [1604]" strokeweight="1pt" from="104.4pt,-5.4pt" to="105pt,91.8pt" w14:anchorId="328FC97B" o:gfxdata="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">
                 <v:stroke joinstyle="miter"/>
@@ -322,7 +322,7 @@
               </wp:anchor>
             </w:drawing>
           </mc:Choice>
-          <mc:Fallback xmlns:a="http://schemas.openxmlformats.org/drawingml/2006/main" xmlns:pic="http://schemas.openxmlformats.org/drawingml/2006/picture" xmlns:a14="http://schemas.microsoft.com/office/drawing/2010/main">
+          <mc:Fallback xmlns:a14="http://schemas.microsoft.com/office/drawing/2010/main" xmlns:pic="http://schemas.openxmlformats.org/drawingml/2006/picture" xmlns:a="http://schemas.openxmlformats.org/drawingml/2006/main" xmlns:oel="http://schemas.microsoft.com/office/2019/extlst">
             <w:pict w14:anchorId="0F3FCE19">
               <v:line id="Straight Connector 2" style="position:absolute;z-index:251639808;visibility:visible;mso-wrap-style:square;mso-wrap-distance-left:9pt;mso-wrap-distance-top:0;mso-wrap-distance-right:9pt;mso-wrap-distance-bottom:0;mso-position-horizontal:absolute;mso-position-horizontal-relative:text;mso-position-vertical:absolute;mso-position-vertical-relative:text" o:spid="_x0000_s1026" strokecolor="#1f3763 [1604]" strokeweight="1pt" from="0,91.8pt" to="466.8pt,91.8pt" w14:anchorId="7ED6B9A8" o:gfxdata="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">
                 <v:stroke joinstyle="miter"/>
@@ -351,7 +351,6 @@
         </w:rPr>
         <w:t>${</w:t>
       </w:r>
-      <w:proofErr w:type="spellStart"/>
       <w:r>
         <w:rPr>
           <w:b/>
@@ -362,7 +361,6 @@
         </w:rPr>
         <w:t>subj_code</w:t>
       </w:r>
-      <w:proofErr w:type="spellEnd"/>
       <w:r>
         <w:rPr>
           <w:b/>
@@ -393,7 +391,6 @@
         </w:rPr>
         <w:t>{</w:t>
       </w:r>
-      <w:proofErr w:type="spellStart"/>
       <w:r>
         <w:rPr>
           <w:b/>
@@ -434,7 +431,6 @@
         </w:rPr>
         <w:t>ber</w:t>
       </w:r>
-      <w:proofErr w:type="spellEnd"/>
       <w:r>
         <w:rPr>
           <w:b/>
@@ -475,7 +471,6 @@
         </w:rPr>
         <w:t>{</w:t>
       </w:r>
-      <w:proofErr w:type="spellStart"/>
       <w:r>
         <w:rPr>
           <w:b/>
@@ -486,7 +481,6 @@
         </w:rPr>
         <w:t>course_title</w:t>
       </w:r>
-      <w:proofErr w:type="spellEnd"/>
       <w:r>
         <w:rPr>
           <w:b/>
@@ -714,11 +708,9 @@
       <w:r>
         <w:t>${</w:t>
       </w:r>
-      <w:proofErr w:type="spellStart"/>
       <w:r>
         <w:t>instructor_name</w:t>
       </w:r>
-      <w:proofErr w:type="spellEnd"/>
       <w:r>
         <w:t>}</w:t>
       </w:r>
@@ -734,11 +726,9 @@
       <w:r>
         <w:t>${</w:t>
       </w:r>
-      <w:proofErr w:type="spellStart"/>
       <w:r>
         <w:t>instructor_title</w:t>
       </w:r>
-      <w:proofErr w:type="spellEnd"/>
       <w:r>
         <w:t>}</w:t>
       </w:r>
@@ -749,15 +739,7 @@
         <w:t xml:space="preserve"> </w:t>
       </w:r>
       <w:r>
-        <w:t>&lt;</w:t>
-      </w:r>
-      <w:proofErr w:type="spellStart"/>
-      <w:r>
-        <w:t>foa</w:t>
-      </w:r>
-      <w:proofErr w:type="spellEnd"/>
-      <w:r>
-        <w:t>&gt;</w:t>
+        <w:t>&lt;foa&gt;</w:t>
       </w:r>
       <w:r>
         <w:t>(</w:t>
@@ -765,11 +747,9 @@
       <w:r>
         <w:t>${</w:t>
       </w:r>
-      <w:proofErr w:type="spellStart"/>
       <w:r>
         <w:t>form_of_address</w:t>
       </w:r>
-      <w:proofErr w:type="spellEnd"/>
       <w:r>
         <w:t>}</w:t>
       </w:r>
@@ -777,15 +757,7 @@
         <w:t>)</w:t>
       </w:r>
       <w:r>
-        <w:t>&lt;?</w:t>
-      </w:r>
-      <w:proofErr w:type="spellStart"/>
-      <w:r>
-        <w:t>foa</w:t>
-      </w:r>
-      <w:proofErr w:type="spellEnd"/>
-      <w:r>
-        <w:t>&gt;</w:t>
+        <w:t>&lt;?foa&gt;</w:t>
       </w:r>
     </w:p>
     <w:p>
@@ -845,11 +817,9 @@
       <w:r>
         <w:t>${</w:t>
       </w:r>
-      <w:proofErr w:type="spellStart"/>
       <w:r>
         <w:t>office_location</w:t>
       </w:r>
-      <w:proofErr w:type="spellEnd"/>
       <w:r>
         <w:t>}</w:t>
       </w:r>
@@ -870,11 +840,9 @@
       <w:r>
         <w:t>${</w:t>
       </w:r>
-      <w:proofErr w:type="spellStart"/>
       <w:r>
         <w:t>office_hours</w:t>
       </w:r>
-      <w:proofErr w:type="spellEnd"/>
       <w:r>
         <w:t>}</w:t>
       </w:r>
@@ -887,25 +855,38 @@
     <w:p>
       <w:pPr>
         <w:spacing w:after="0"/>
-      </w:pPr>
-      <w:r>
+        <w:rPr>
+          <w:lang w:val="fr-FR"/>
+        </w:rPr>
+      </w:pPr>
+      <w:r>
+        <w:rPr>
+          <w:lang w:val="fr-FR"/>
+        </w:rPr>
         <w:t>${</w:t>
       </w:r>
-      <w:proofErr w:type="spellStart"/>
-      <w:r>
-        <w:t>additional_contact_info</w:t>
-      </w:r>
-      <w:r>
-        <w:t>_syllabus</w:t>
-      </w:r>
-      <w:proofErr w:type="spellEnd"/>
-      <w:r>
+      <w:r>
+        <w:t xml:space="preserve"> </w:t>
+      </w:r>
+      <w:r>
+        <w:rPr>
+          <w:lang w:val="fr-FR"/>
+        </w:rPr>
+        <w:t>additional_sections_syllabus_json</w:t>
+      </w:r>
+      <w:r>
+        <w:rPr>
+          <w:lang w:val="fr-FR"/>
+        </w:rPr>
         <w:t>}</w:t>
       </w:r>
     </w:p>
     <w:p>
       <w:pPr>
         <w:spacing w:after="0"/>
+        <w:rPr>
+          <w:lang w:val="fr-FR"/>
+        </w:rPr>
       </w:pPr>
     </w:p>
     <w:p>
@@ -918,6 +899,7 @@
           <w:color w:val="1F3864" w:themeColor="accent1" w:themeShade="80"/>
           <w:sz w:val="26"/>
           <w:szCs w:val="26"/>
+          <w:lang w:val="fr-FR"/>
         </w:rPr>
       </w:pPr>
       <w:r>
@@ -928,6 +910,7 @@
           <w:color w:val="1F3864" w:themeColor="accent1" w:themeShade="80"/>
           <w:sz w:val="26"/>
           <w:szCs w:val="26"/>
+          <w:lang w:val="fr-FR"/>
         </w:rPr>
         <w:t>Course Description</w:t>
       </w:r>
@@ -935,27 +918,43 @@
     <w:p>
       <w:pPr>
         <w:spacing w:after="0"/>
-      </w:pPr>
-    </w:p>
-    <w:p>
-      <w:pPr>
-        <w:spacing w:after="0"/>
-      </w:pPr>
-      <w:r>
+        <w:rPr>
+          <w:lang w:val="fr-FR"/>
+        </w:rPr>
+      </w:pPr>
+    </w:p>
+    <w:p>
+      <w:pPr>
+        <w:spacing w:after="0"/>
+        <w:rPr>
+          <w:lang w:val="fr-FR"/>
+        </w:rPr>
+      </w:pPr>
+      <w:r>
+        <w:rPr>
+          <w:lang w:val="fr-FR"/>
+        </w:rPr>
         <w:t>${</w:t>
       </w:r>
-      <w:proofErr w:type="spellStart"/>
-      <w:r>
+      <w:r>
+        <w:rPr>
+          <w:lang w:val="fr-FR"/>
+        </w:rPr>
         <w:t>course_description</w:t>
       </w:r>
-      <w:proofErr w:type="spellEnd"/>
-      <w:r>
+      <w:r>
+        <w:rPr>
+          <w:lang w:val="fr-FR"/>
+        </w:rPr>
         <w:t>}</w:t>
       </w:r>
     </w:p>
     <w:p>
       <w:pPr>
         <w:spacing w:after="0"/>
+        <w:rPr>
+          <w:lang w:val="fr-FR"/>
+        </w:rPr>
       </w:pPr>
     </w:p>
     <w:p>
@@ -1159,7 +1158,7 @@
               </wp:anchor>
             </w:drawing>
           </mc:Choice>
-          <mc:Fallback xmlns:a="http://schemas.openxmlformats.org/drawingml/2006/main" xmlns:pic="http://schemas.openxmlformats.org/drawingml/2006/picture" xmlns:a14="http://schemas.microsoft.com/office/drawing/2010/main">
+          <mc:Fallback xmlns:a14="http://schemas.microsoft.com/office/drawing/2010/main" xmlns:pic="http://schemas.openxmlformats.org/drawingml/2006/picture" xmlns:a="http://schemas.openxmlformats.org/drawingml/2006/main" xmlns:oel="http://schemas.microsoft.com/office/2019/extlst">
             <w:pict w14:anchorId="474F2540">
               <v:group id="Group 9" style="position:absolute;margin-left:414.8pt;margin-top:12.15pt;width:52.55pt;height:282.7pt;z-index:251660288" coordsize="6673,35901" o:spid="_x0000_s1026" w14:anchorId="122F3E6F" o:gfxdata="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">
                 <v:shapetype id="_x0000_t75" coordsize="21600,21600" filled="f" stroked="f" o:spt="75" o:preferrelative="t" path="m@4@5l@4@11@9@11@9@5xe">
@@ -1224,15 +1223,7 @@
         <w:spacing w:after="0"/>
       </w:pPr>
       <w:r>
-        <w:t>${</w:t>
-      </w:r>
-      <w:proofErr w:type="spellStart"/>
-      <w:r>
-        <w:t>learning_outcomes_syllabus</w:t>
-      </w:r>
-      <w:proofErr w:type="spellEnd"/>
-      <w:r>
-        <w:t>}</w:t>
+        <w:t>${learning_outcomes}</w:t>
       </w:r>
     </w:p>
     <w:p>
@@ -1274,15 +1265,13 @@
         <w:spacing w:after="0"/>
       </w:pPr>
       <w:r>
-        <w:t>$(</w:t>
-      </w:r>
-      <w:proofErr w:type="spellStart"/>
-      <w:r>
-        <w:t>hip_syllabus</w:t>
-      </w:r>
-      <w:proofErr w:type="spellEnd"/>
-      <w:r>
-        <w:t>}</w:t>
+        <w:t>$</w:t>
+      </w:r>
+      <w:r>
+        <w:t>{</w:t>
+      </w:r>
+      <w:r>
+        <w:t>hip}</w:t>
       </w:r>
     </w:p>
     <w:p>
@@ -1332,15 +1321,7 @@
         <w:spacing w:after="0"/>
       </w:pPr>
       <w:r>
-        <w:t>${</w:t>
-      </w:r>
-      <w:proofErr w:type="spellStart"/>
-      <w:r>
-        <w:t>course_materials_syllabus</w:t>
-      </w:r>
-      <w:proofErr w:type="spellEnd"/>
-      <w:r>
-        <w:t>}</w:t>
+        <w:t>${course_materials}</w:t>
       </w:r>
     </w:p>
     <w:p>
@@ -1358,6 +1339,7 @@
           <w:color w:val="1F3864" w:themeColor="accent1" w:themeShade="80"/>
           <w:sz w:val="26"/>
           <w:szCs w:val="26"/>
+          <w:lang w:val="fr-FR"/>
         </w:rPr>
       </w:pPr>
       <w:r>
@@ -1368,6 +1350,7 @@
           <w:color w:val="1F3864" w:themeColor="accent1" w:themeShade="80"/>
           <w:sz w:val="26"/>
           <w:szCs w:val="26"/>
+          <w:lang w:val="fr-FR"/>
         </w:rPr>
         <w:t>Assessments</w:t>
       </w:r>
@@ -1382,6 +1365,7 @@
           <w:i w:val="0"/>
           <w:iCs w:val="0"/>
           <w:color w:val="1F3864" w:themeColor="accent1" w:themeShade="80"/>
+          <w:lang w:val="fr-FR"/>
         </w:rPr>
       </w:pPr>
     </w:p>
@@ -1394,6 +1378,7 @@
           <w:i w:val="0"/>
           <w:iCs w:val="0"/>
           <w:color w:val="auto"/>
+          <w:lang w:val="fr-FR"/>
         </w:rPr>
       </w:pPr>
       <w:r>
@@ -1403,11 +1388,100 @@
           <w:i w:val="0"/>
           <w:iCs w:val="0"/>
           <w:color w:val="auto"/>
-        </w:rPr>
-        <w:t>${</w:t>
-      </w:r>
-      <w:proofErr w:type="spellStart"/>
-      <w:r>
+          <w:lang w:val="fr-FR"/>
+        </w:rPr>
+        <w:t>${assmt_assignments_syllabus_json}</w:t>
+      </w:r>
+    </w:p>
+    <w:p>
+      <w:pPr>
+        <w:spacing w:after="0"/>
+        <w:rPr>
+          <w:rStyle w:val="Heading4Char"/>
+          <w:b/>
+          <w:bCs/>
+          <w:i w:val="0"/>
+          <w:iCs w:val="0"/>
+          <w:color w:val="1F3864" w:themeColor="accent1" w:themeShade="80"/>
+          <w:lang w:val="fr-FR"/>
+        </w:rPr>
+      </w:pPr>
+    </w:p>
+    <w:p>
+      <w:pPr>
+        <w:spacing w:after="0"/>
+        <w:rPr>
+          <w:lang w:val="fr-FR"/>
+        </w:rPr>
+      </w:pPr>
+    </w:p>
+    <w:p>
+      <w:pPr>
+        <w:spacing w:after="0"/>
+      </w:pPr>
+      <w:r>
+        <w:t>Students will be assigned the following final letter grades, based on the calculations coming from the course assessment section.</w:t>
+      </w:r>
+    </w:p>
+    <w:p>
+      <w:pPr>
+        <w:spacing w:after="0"/>
+      </w:pPr>
+    </w:p>
+    <w:p>
+      <w:pPr>
+        <w:spacing w:after="0"/>
+      </w:pPr>
+      <w:r>
+        <w:t>${grade_table_syllabus_list}</w:t>
+      </w:r>
+    </w:p>
+    <w:p>
+      <w:pPr>
+        <w:spacing w:after="0"/>
+      </w:pPr>
+    </w:p>
+    <w:p>
+      <w:pPr>
+        <w:spacing w:after="0"/>
+      </w:pPr>
+    </w:p>
+    <w:p>
+      <w:pPr>
+        <w:pStyle w:val="Heading3"/>
+        <w:rPr>
+          <w:b/>
+          <w:bCs/>
+          <w:color w:val="1F3864" w:themeColor="accent1" w:themeShade="80"/>
+          <w:sz w:val="26"/>
+          <w:szCs w:val="26"/>
+        </w:rPr>
+      </w:pPr>
+      <w:r>
+        <w:rPr>
+          <w:b/>
+          <w:bCs/>
+          <w:color w:val="1F3864" w:themeColor="accent1" w:themeShade="80"/>
+          <w:sz w:val="26"/>
+          <w:szCs w:val="26"/>
+        </w:rPr>
+        <w:t>Grading Policies</w:t>
+      </w:r>
+    </w:p>
+    <w:p>
+      <w:pPr>
+        <w:spacing w:after="0"/>
+        <w:rPr>
+          <w:rStyle w:val="Heading4Char"/>
+          <w:b/>
+          <w:bCs/>
+          <w:color w:val="1F3864" w:themeColor="accent1" w:themeShade="80"/>
+        </w:rPr>
+      </w:pPr>
+    </w:p>
+    <w:p>
+      <w:pPr>
+        <w:spacing w:after="0"/>
         <w:rPr>
           <w:rStyle w:val="Heading4Char"/>
           <w:rFonts w:asciiTheme="minorHAnsi" w:hAnsiTheme="minorHAnsi" w:cstheme="minorHAnsi"/>
@@ -1415,9 +1489,7 @@
           <w:iCs w:val="0"/>
           <w:color w:val="auto"/>
         </w:rPr>
-        <w:t>assmt_assignments_syllabus_json</w:t>
-      </w:r>
-      <w:proofErr w:type="spellEnd"/>
+      </w:pPr>
       <w:r>
         <w:rPr>
           <w:rStyle w:val="Heading4Char"/>
@@ -1426,65 +1498,59 @@
           <w:iCs w:val="0"/>
           <w:color w:val="auto"/>
         </w:rPr>
-        <w:t>}</w:t>
-      </w:r>
-    </w:p>
-    <w:p>
-      <w:pPr>
-        <w:spacing w:after="0"/>
-        <w:rPr>
-          <w:rStyle w:val="Heading4Char"/>
-          <w:b/>
-          <w:bCs/>
-          <w:i w:val="0"/>
-          <w:iCs w:val="0"/>
-          <w:color w:val="1F3864" w:themeColor="accent1" w:themeShade="80"/>
-        </w:rPr>
-      </w:pPr>
-    </w:p>
-    <w:p>
-      <w:pPr>
-        <w:spacing w:after="0"/>
-      </w:pPr>
-    </w:p>
-    <w:p>
-      <w:pPr>
-        <w:spacing w:after="0"/>
-      </w:pPr>
-      <w:r>
-        <w:t>Students will be assigned the following final letter grades, based on the calculations coming from the course assessment section.</w:t>
-      </w:r>
-    </w:p>
-    <w:p>
-      <w:pPr>
-        <w:spacing w:after="0"/>
-      </w:pPr>
-    </w:p>
-    <w:p>
-      <w:pPr>
-        <w:spacing w:after="0"/>
-      </w:pPr>
+        <w:t>${grading_policies_syllabus_json}</w:t>
+      </w:r>
+    </w:p>
+    <w:p>
+      <w:pPr>
+        <w:spacing w:after="0"/>
+      </w:pPr>
+    </w:p>
+    <w:p>
+      <w:pPr>
+        <w:pStyle w:val="Heading3"/>
+        <w:rPr>
+          <w:b/>
+          <w:bCs/>
+          <w:color w:val="1F3864" w:themeColor="accent1" w:themeShade="80"/>
+          <w:sz w:val="26"/>
+          <w:szCs w:val="26"/>
+        </w:rPr>
+      </w:pPr>
+      <w:r>
+        <w:rPr>
+          <w:b/>
+          <w:bCs/>
+          <w:color w:val="1F3864" w:themeColor="accent1" w:themeShade="80"/>
+          <w:sz w:val="26"/>
+          <w:szCs w:val="26"/>
+        </w:rPr>
+        <w:t>Course and University Policies</w:t>
+      </w:r>
+      <w:r>
+        <w:rPr>
+          <w:b/>
+          <w:bCs/>
+          <w:color w:val="1F3864" w:themeColor="accent1" w:themeShade="80"/>
+          <w:sz w:val="26"/>
+          <w:szCs w:val="26"/>
+        </w:rPr>
+        <w:t xml:space="preserve"> and Resources</w:t>
+      </w:r>
+    </w:p>
+    <w:p/>
+    <w:p>
       <w:r>
         <w:t>${</w:t>
       </w:r>
-      <w:proofErr w:type="spellStart"/>
-      <w:r>
-        <w:t>grade_table_syllabus_list</w:t>
-      </w:r>
-      <w:proofErr w:type="spellEnd"/>
-      <w:r>
-        <w:t>}</w:t>
-      </w:r>
-    </w:p>
-    <w:p>
-      <w:pPr>
-        <w:spacing w:after="0"/>
-      </w:pPr>
-    </w:p>
-    <w:p>
-      <w:pPr>
-        <w:spacing w:after="0"/>
-      </w:pPr>
+      <w:r>
+        <w:t>policy_statements}</w:t>
+      </w:r>
+    </w:p>
+    <w:p>
+      <w:r>
+        <w:t>${university_resources}</w:t>
+      </w:r>
     </w:p>
     <w:p>
       <w:pPr>
@@ -1497,76 +1563,6 @@
           <w:szCs w:val="26"/>
         </w:rPr>
       </w:pPr>
-      <w:r>
-        <w:rPr>
-          <w:b/>
-          <w:bCs/>
-          <w:color w:val="1F3864" w:themeColor="accent1" w:themeShade="80"/>
-          <w:sz w:val="26"/>
-          <w:szCs w:val="26"/>
-        </w:rPr>
-        <w:t>Grading Policies</w:t>
-      </w:r>
-    </w:p>
-    <w:p>
-      <w:pPr>
-        <w:spacing w:after="0"/>
-        <w:rPr>
-          <w:rStyle w:val="Heading4Char"/>
-          <w:b/>
-          <w:bCs/>
-          <w:color w:val="1F3864" w:themeColor="accent1" w:themeShade="80"/>
-        </w:rPr>
-      </w:pPr>
-    </w:p>
-    <w:p>
-      <w:pPr>
-        <w:spacing w:after="0"/>
-        <w:rPr>
-          <w:rStyle w:val="Heading4Char"/>
-          <w:rFonts w:asciiTheme="minorHAnsi" w:hAnsiTheme="minorHAnsi" w:cstheme="minorHAnsi"/>
-          <w:i w:val="0"/>
-          <w:iCs w:val="0"/>
-          <w:color w:val="auto"/>
-        </w:rPr>
-      </w:pPr>
-      <w:r>
-        <w:rPr>
-          <w:rStyle w:val="Heading4Char"/>
-          <w:rFonts w:asciiTheme="minorHAnsi" w:hAnsiTheme="minorHAnsi" w:cstheme="minorHAnsi"/>
-          <w:i w:val="0"/>
-          <w:iCs w:val="0"/>
-          <w:color w:val="auto"/>
-        </w:rPr>
-        <w:t>${</w:t>
-      </w:r>
-      <w:proofErr w:type="spellStart"/>
-      <w:r>
-        <w:rPr>
-          <w:rStyle w:val="Heading4Char"/>
-          <w:rFonts w:asciiTheme="minorHAnsi" w:hAnsiTheme="minorHAnsi" w:cstheme="minorHAnsi"/>
-          <w:i w:val="0"/>
-          <w:iCs w:val="0"/>
-          <w:color w:val="auto"/>
-        </w:rPr>
-        <w:t>grading_policies_syllabus_json</w:t>
-      </w:r>
-      <w:proofErr w:type="spellEnd"/>
-      <w:r>
-        <w:rPr>
-          <w:rStyle w:val="Heading4Char"/>
-          <w:rFonts w:asciiTheme="minorHAnsi" w:hAnsiTheme="minorHAnsi" w:cstheme="minorHAnsi"/>
-          <w:i w:val="0"/>
-          <w:iCs w:val="0"/>
-          <w:color w:val="auto"/>
-        </w:rPr>
-        <w:t>}</w:t>
-      </w:r>
-    </w:p>
-    <w:p>
-      <w:pPr>
-        <w:spacing w:after="0"/>
-      </w:pPr>
     </w:p>
     <w:p>
       <w:pPr>
@@ -1587,92 +1583,13 @@
           <w:sz w:val="26"/>
           <w:szCs w:val="26"/>
         </w:rPr>
-        <w:t>Course and University Policies</w:t>
-      </w:r>
-      <w:r>
-        <w:rPr>
-          <w:b/>
-          <w:bCs/>
-          <w:color w:val="1F3864" w:themeColor="accent1" w:themeShade="80"/>
-          <w:sz w:val="26"/>
-          <w:szCs w:val="26"/>
-        </w:rPr>
-        <w:t xml:space="preserve"> and Resources</w:t>
+        <w:t>Course Schedule</w:t>
       </w:r>
     </w:p>
     <w:p/>
     <w:p>
       <w:r>
-        <w:t>${</w:t>
-      </w:r>
-      <w:proofErr w:type="spellStart"/>
-      <w:r>
-        <w:t>policy_statements</w:t>
-      </w:r>
-      <w:proofErr w:type="spellEnd"/>
-      <w:r>
-        <w:t>}</w:t>
-      </w:r>
-    </w:p>
-    <w:p>
-      <w:r>
-        <w:t>${</w:t>
-      </w:r>
-      <w:proofErr w:type="spellStart"/>
-      <w:r>
-        <w:t>university_resources</w:t>
-      </w:r>
-      <w:proofErr w:type="spellEnd"/>
-      <w:r>
-        <w:t>}</w:t>
-      </w:r>
-    </w:p>
-    <w:p>
-      <w:pPr>
-        <w:pStyle w:val="Heading3"/>
-        <w:rPr>
-          <w:b/>
-          <w:bCs/>
-          <w:color w:val="1F3864" w:themeColor="accent1" w:themeShade="80"/>
-          <w:sz w:val="26"/>
-          <w:szCs w:val="26"/>
-        </w:rPr>
-      </w:pPr>
-    </w:p>
-    <w:p>
-      <w:pPr>
-        <w:pStyle w:val="Heading3"/>
-        <w:rPr>
-          <w:b/>
-          <w:bCs/>
-          <w:color w:val="1F3864" w:themeColor="accent1" w:themeShade="80"/>
-          <w:sz w:val="26"/>
-          <w:szCs w:val="26"/>
-        </w:rPr>
-      </w:pPr>
-      <w:r>
-        <w:rPr>
-          <w:b/>
-          <w:bCs/>
-          <w:color w:val="1F3864" w:themeColor="accent1" w:themeShade="80"/>
-          <w:sz w:val="26"/>
-          <w:szCs w:val="26"/>
-        </w:rPr>
-        <w:t>Course Schedule</w:t>
-      </w:r>
-    </w:p>
-    <w:p/>
-    <w:p>
-      <w:r>
-        <w:t>${</w:t>
-      </w:r>
-      <w:proofErr w:type="spellStart"/>
-      <w:r>
-        <w:t>course_schedule_list</w:t>
-      </w:r>
-      <w:proofErr w:type="spellEnd"/>
-      <w:r>
-        <w:t>}</w:t>
+        <w:t>${course_schedule_list}</w:t>
       </w:r>
     </w:p>
     <w:p>
@@ -1697,7 +1614,7 @@
 </file>
 
 <file path=word/endnotes.xml><?xml version="1.0" encoding="utf-8"?>
-<w:endnotes xmlns:wpc="http://schemas.microsoft.com/office/word/2010/wordprocessingCanvas" xmlns:cx="http://schemas.microsoft.com/office/drawing/2014/chartex" xmlns:cx1="http://schemas.microsoft.com/office/drawing/2015/9/8/chartex" xmlns:cx2="http://schemas.microsoft.com/office/drawing/2015/10/21/chartex" xmlns:cx3="http://schemas.microsoft.com/office/drawing/2016/5/9/chartex" xmlns:cx4="http://schemas.microsoft.com/office/drawing/2016/5/10/chartex" xmlns:cx5="http://schemas.microsoft.com/office/drawing/2016/5/11/chartex" xmlns:cx6="http://schemas.microsoft.com/office/drawing/2016/5/12/chartex" xmlns:cx7="http://schemas.microsoft.com/office/drawing/2016/5/13/chartex" xmlns:cx8="http://schemas.microsoft.com/office/drawing/2016/5/14/chartex" xmlns:mc="http://schemas.openxmlformats.org/markup-compatibility/2006" xmlns:aink="http://schemas.microsoft.com/office/drawing/2016/ink" xmlns:am3d="http://schemas.microsoft.com/office/drawing/2017/model3d" xmlns:o="urn:schemas-microsoft-com:office:office" xmlns:oel="http://schemas.microsoft.com/office/2019/extlst" xmlns:r="http://schemas.openxmlformats.org/officeDocument/2006/relationships" xmlns:m="http://schemas.openxmlformats.org/officeDocument/2006/math" xmlns:v="urn:schemas-microsoft-com:vml" xmlns:wp14="http://schemas.microsoft.com/office/word/2010/wordprocessingDrawing" xmlns:wp="http://schemas.openxmlformats.org/drawingml/2006/wordprocessingDrawing" xmlns:w10="urn:schemas-microsoft-com:office:word" xmlns:w="http://schemas.openxmlformats.org/wordprocessingml/2006/main" xmlns:w14="http://schemas.microsoft.com/office/word/2010/wordml" xmlns:w15="http://schemas.microsoft.com/office/word/2012/wordml" xmlns:w16cex="http://schemas.microsoft.com/office/word/2018/wordml/cex" xmlns:w16cid="http://schemas.microsoft.com/office/word/2016/wordml/cid" xmlns:w16="http://schemas.microsoft.com/office/word/2018/wordml" xmlns:w16sdtdh="http://schemas.microsoft.com/office/word/2020/wordml/sdtdatahash" xmlns:w16se="http://schemas.microsoft.com/office/word/2015/wordml/symex" xmlns:wpg="http://schemas.microsoft.com/office/word/2010/wordprocessingGroup" xmlns:wpi="http://schemas.microsoft.com/office/word/2010/wordprocessingInk" xmlns:wne="http://schemas.microsoft.com/office/word/2006/wordml" xmlns:wps="http://schemas.microsoft.com/office/word/2010/wordprocessingShape" mc:Ignorable="w14 w15 w16se w16cid w16 w16cex w16sdtdh wp14">
+<w:endnotes xmlns:wpc="http://schemas.microsoft.com/office/word/2010/wordprocessingCanvas" xmlns:cx="http://schemas.microsoft.com/office/drawing/2014/chartex" xmlns:cx1="http://schemas.microsoft.com/office/drawing/2015/9/8/chartex" xmlns:cx2="http://schemas.microsoft.com/office/drawing/2015/10/21/chartex" xmlns:cx3="http://schemas.microsoft.com/office/drawing/2016/5/9/chartex" xmlns:cx4="http://schemas.microsoft.com/office/drawing/2016/5/10/chartex" xmlns:cx5="http://schemas.microsoft.com/office/drawing/2016/5/11/chartex" xmlns:cx6="http://schemas.microsoft.com/office/drawing/2016/5/12/chartex" xmlns:cx7="http://schemas.microsoft.com/office/drawing/2016/5/13/chartex" xmlns:cx8="http://schemas.microsoft.com/office/drawing/2016/5/14/chartex" xmlns:mc="http://schemas.openxmlformats.org/markup-compatibility/2006" xmlns:aink="http://schemas.microsoft.com/office/drawing/2016/ink" xmlns:am3d="http://schemas.microsoft.com/office/drawing/2017/model3d" xmlns:o="urn:schemas-microsoft-com:office:office" xmlns:r="http://schemas.openxmlformats.org/officeDocument/2006/relationships" xmlns:m="http://schemas.openxmlformats.org/officeDocument/2006/math" xmlns:v="urn:schemas-microsoft-com:vml" xmlns:wp14="http://schemas.microsoft.com/office/word/2010/wordprocessingDrawing" xmlns:wp="http://schemas.openxmlformats.org/drawingml/2006/wordprocessingDrawing" xmlns:w10="urn:schemas-microsoft-com:office:word" xmlns:w="http://schemas.openxmlformats.org/wordprocessingml/2006/main" xmlns:w14="http://schemas.microsoft.com/office/word/2010/wordml" xmlns:w15="http://schemas.microsoft.com/office/word/2012/wordml" xmlns:w16cex="http://schemas.microsoft.com/office/word/2018/wordml/cex" xmlns:w16cid="http://schemas.microsoft.com/office/word/2016/wordml/cid" xmlns:w16="http://schemas.microsoft.com/office/word/2018/wordml" xmlns:w16sdtdh="http://schemas.microsoft.com/office/word/2020/wordml/sdtdatahash" xmlns:w16se="http://schemas.microsoft.com/office/word/2015/wordml/symex" xmlns:wpg="http://schemas.microsoft.com/office/word/2010/wordprocessingGroup" xmlns:wpi="http://schemas.microsoft.com/office/word/2010/wordprocessingInk" xmlns:wne="http://schemas.microsoft.com/office/word/2006/wordml" xmlns:wps="http://schemas.microsoft.com/office/word/2010/wordprocessingShape" mc:Ignorable="w14 w15 w16se w16cid w16 w16cex w16sdtdh wp14">
   <w:endnote w:type="separator" w:id="-1">
     <w:p>
       <w:pPr>
@@ -1722,7 +1639,7 @@
 </file>
 
 <file path=word/footer1.xml><?xml version="1.0" encoding="utf-8"?>
-<w:ftr xmlns:wpc="http://schemas.microsoft.com/office/word/2010/wordprocessingCanvas" xmlns:cx="http://schemas.microsoft.com/office/drawing/2014/chartex" xmlns:cx1="http://schemas.microsoft.com/office/drawing/2015/9/8/chartex" xmlns:cx2="http://schemas.microsoft.com/office/drawing/2015/10/21/chartex" xmlns:cx3="http://schemas.microsoft.com/office/drawing/2016/5/9/chartex" xmlns:cx4="http://schemas.microsoft.com/office/drawing/2016/5/10/chartex" xmlns:cx5="http://schemas.microsoft.com/office/drawing/2016/5/11/chartex" xmlns:cx6="http://schemas.microsoft.com/office/drawing/2016/5/12/chartex" xmlns:cx7="http://schemas.microsoft.com/office/drawing/2016/5/13/chartex" xmlns:cx8="http://schemas.microsoft.com/office/drawing/2016/5/14/chartex" xmlns:mc="http://schemas.openxmlformats.org/markup-compatibility/2006" xmlns:aink="http://schemas.microsoft.com/office/drawing/2016/ink" xmlns:am3d="http://schemas.microsoft.com/office/drawing/2017/model3d" xmlns:o="urn:schemas-microsoft-com:office:office" xmlns:oel="http://schemas.microsoft.com/office/2019/extlst" xmlns:r="http://schemas.openxmlformats.org/officeDocument/2006/relationships" xmlns:m="http://schemas.openxmlformats.org/officeDocument/2006/math" xmlns:v="urn:schemas-microsoft-com:vml" xmlns:wp14="http://schemas.microsoft.com/office/word/2010/wordprocessingDrawing" xmlns:wp="http://schemas.openxmlformats.org/drawingml/2006/wordprocessingDrawing" xmlns:w10="urn:schemas-microsoft-com:office:word" xmlns:w="http://schemas.openxmlformats.org/wordprocessingml/2006/main" xmlns:w14="http://schemas.microsoft.com/office/word/2010/wordml" xmlns:w15="http://schemas.microsoft.com/office/word/2012/wordml" xmlns:w16cex="http://schemas.microsoft.com/office/word/2018/wordml/cex" xmlns:w16cid="http://schemas.microsoft.com/office/word/2016/wordml/cid" xmlns:w16="http://schemas.microsoft.com/office/word/2018/wordml" xmlns:w16sdtdh="http://schemas.microsoft.com/office/word/2020/wordml/sdtdatahash" xmlns:w16se="http://schemas.microsoft.com/office/word/2015/wordml/symex" xmlns:wpg="http://schemas.microsoft.com/office/word/2010/wordprocessingGroup" xmlns:wpi="http://schemas.microsoft.com/office/word/2010/wordprocessingInk" xmlns:wne="http://schemas.microsoft.com/office/word/2006/wordml" xmlns:wps="http://schemas.microsoft.com/office/word/2010/wordprocessingShape" mc:Ignorable="w14 w15 w16se w16cid w16 w16cex w16sdtdh wp14">
+<w:ftr xmlns:wpc="http://schemas.microsoft.com/office/word/2010/wordprocessingCanvas" xmlns:cx="http://schemas.microsoft.com/office/drawing/2014/chartex" xmlns:cx1="http://schemas.microsoft.com/office/drawing/2015/9/8/chartex" xmlns:cx2="http://schemas.microsoft.com/office/drawing/2015/10/21/chartex" xmlns:cx3="http://schemas.microsoft.com/office/drawing/2016/5/9/chartex" xmlns:cx4="http://schemas.microsoft.com/office/drawing/2016/5/10/chartex" xmlns:cx5="http://schemas.microsoft.com/office/drawing/2016/5/11/chartex" xmlns:cx6="http://schemas.microsoft.com/office/drawing/2016/5/12/chartex" xmlns:cx7="http://schemas.microsoft.com/office/drawing/2016/5/13/chartex" xmlns:cx8="http://schemas.microsoft.com/office/drawing/2016/5/14/chartex" xmlns:mc="http://schemas.openxmlformats.org/markup-compatibility/2006" xmlns:aink="http://schemas.microsoft.com/office/drawing/2016/ink" xmlns:am3d="http://schemas.microsoft.com/office/drawing/2017/model3d" xmlns:o="urn:schemas-microsoft-com:office:office" xmlns:r="http://schemas.openxmlformats.org/officeDocument/2006/relationships" xmlns:m="http://schemas.openxmlformats.org/officeDocument/2006/math" xmlns:v="urn:schemas-microsoft-com:vml" xmlns:wp14="http://schemas.microsoft.com/office/word/2010/wordprocessingDrawing" xmlns:wp="http://schemas.openxmlformats.org/drawingml/2006/wordprocessingDrawing" xmlns:w10="urn:schemas-microsoft-com:office:word" xmlns:w="http://schemas.openxmlformats.org/wordprocessingml/2006/main" xmlns:w14="http://schemas.microsoft.com/office/word/2010/wordml" xmlns:w15="http://schemas.microsoft.com/office/word/2012/wordml" xmlns:w16cex="http://schemas.microsoft.com/office/word/2018/wordml/cex" xmlns:w16cid="http://schemas.microsoft.com/office/word/2016/wordml/cid" xmlns:w16="http://schemas.microsoft.com/office/word/2018/wordml" xmlns:w16sdtdh="http://schemas.microsoft.com/office/word/2020/wordml/sdtdatahash" xmlns:w16se="http://schemas.microsoft.com/office/word/2015/wordml/symex" xmlns:wpg="http://schemas.microsoft.com/office/word/2010/wordprocessingGroup" xmlns:wpi="http://schemas.microsoft.com/office/word/2010/wordprocessingInk" xmlns:wne="http://schemas.microsoft.com/office/word/2006/wordml" xmlns:wps="http://schemas.microsoft.com/office/word/2010/wordprocessingShape" mc:Ignorable="w14 w15 w16se w16cid w16 w16cex w16sdtdh wp14">
   <w:sdt>
     <w:sdtPr>
       <w:id w:val="1982499631"/>
@@ -1775,7 +1692,7 @@
 </file>
 
 <file path=word/footnotes.xml><?xml version="1.0" encoding="utf-8"?>
-<w:footnotes xmlns:wpc="http://schemas.microsoft.com/office/word/2010/wordprocessingCanvas" xmlns:cx="http://schemas.microsoft.com/office/drawing/2014/chartex" xmlns:cx1="http://schemas.microsoft.com/office/drawing/2015/9/8/chartex" xmlns:cx2="http://schemas.microsoft.com/office/drawing/2015/10/21/chartex" xmlns:cx3="http://schemas.microsoft.com/office/drawing/2016/5/9/chartex" xmlns:cx4="http://schemas.microsoft.com/office/drawing/2016/5/10/chartex" xmlns:cx5="http://schemas.microsoft.com/office/drawing/2016/5/11/chartex" xmlns:cx6="http://schemas.microsoft.com/office/drawing/2016/5/12/chartex" xmlns:cx7="http://schemas.microsoft.com/office/drawing/2016/5/13/chartex" xmlns:cx8="http://schemas.microsoft.com/office/drawing/2016/5/14/chartex" xmlns:mc="http://schemas.openxmlformats.org/markup-compatibility/2006" xmlns:aink="http://schemas.microsoft.com/office/drawing/2016/ink" xmlns:am3d="http://schemas.microsoft.com/office/drawing/2017/model3d" xmlns:o="urn:schemas-microsoft-com:office:office" xmlns:oel="http://schemas.microsoft.com/office/2019/extlst" xmlns:r="http://schemas.openxmlformats.org/officeDocument/2006/relationships" xmlns:m="http://schemas.openxmlformats.org/officeDocument/2006/math" xmlns:v="urn:schemas-microsoft-com:vml" xmlns:wp14="http://schemas.microsoft.com/office/word/2010/wordprocessingDrawing" xmlns:wp="http://schemas.openxmlformats.org/drawingml/2006/wordprocessingDrawing" xmlns:w10="urn:schemas-microsoft-com:office:word" xmlns:w="http://schemas.openxmlformats.org/wordprocessingml/2006/main" xmlns:w14="http://schemas.microsoft.com/office/word/2010/wordml" xmlns:w15="http://schemas.microsoft.com/office/word/2012/wordml" xmlns:w16cex="http://schemas.microsoft.com/office/word/2018/wordml/cex" xmlns:w16cid="http://schemas.microsoft.com/office/word/2016/wordml/cid" xmlns:w16="http://schemas.microsoft.com/office/word/2018/wordml" xmlns:w16sdtdh="http://schemas.microsoft.com/office/word/2020/wordml/sdtdatahash" xmlns:w16se="http://schemas.microsoft.com/office/word/2015/wordml/symex" xmlns:wpg="http://schemas.microsoft.com/office/word/2010/wordprocessingGroup" xmlns:wpi="http://schemas.microsoft.com/office/word/2010/wordprocessingInk" xmlns:wne="http://schemas.microsoft.com/office/word/2006/wordml" xmlns:wps="http://schemas.microsoft.com/office/word/2010/wordprocessingShape" mc:Ignorable="w14 w15 w16se w16cid w16 w16cex w16sdtdh wp14">
+<w:footnotes xmlns:wpc="http://schemas.microsoft.com/office/word/2010/wordprocessingCanvas" xmlns:cx="http://schemas.microsoft.com/office/drawing/2014/chartex" xmlns:cx1="http://schemas.microsoft.com/office/drawing/2015/9/8/chartex" xmlns:cx2="http://schemas.microsoft.com/office/drawing/2015/10/21/chartex" xmlns:cx3="http://schemas.microsoft.com/office/drawing/2016/5/9/chartex" xmlns:cx4="http://schemas.microsoft.com/office/drawing/2016/5/10/chartex" xmlns:cx5="http://schemas.microsoft.com/office/drawing/2016/5/11/chartex" xmlns:cx6="http://schemas.microsoft.com/office/drawing/2016/5/12/chartex" xmlns:cx7="http://schemas.microsoft.com/office/drawing/2016/5/13/chartex" xmlns:cx8="http://schemas.microsoft.com/office/drawing/2016/5/14/chartex" xmlns:mc="http://schemas.openxmlformats.org/markup-compatibility/2006" xmlns:aink="http://schemas.microsoft.com/office/drawing/2016/ink" xmlns:am3d="http://schemas.microsoft.com/office/drawing/2017/model3d" xmlns:o="urn:schemas-microsoft-com:office:office" xmlns:r="http://schemas.openxmlformats.org/officeDocument/2006/relationships" xmlns:m="http://schemas.openxmlformats.org/officeDocument/2006/math" xmlns:v="urn:schemas-microsoft-com:vml" xmlns:wp14="http://schemas.microsoft.com/office/word/2010/wordprocessingDrawing" xmlns:wp="http://schemas.openxmlformats.org/drawingml/2006/wordprocessingDrawing" xmlns:w10="urn:schemas-microsoft-com:office:word" xmlns:w="http://schemas.openxmlformats.org/wordprocessingml/2006/main" xmlns:w14="http://schemas.microsoft.com/office/word/2010/wordml" xmlns:w15="http://schemas.microsoft.com/office/word/2012/wordml" xmlns:w16cex="http://schemas.microsoft.com/office/word/2018/wordml/cex" xmlns:w16cid="http://schemas.microsoft.com/office/word/2016/wordml/cid" xmlns:w16="http://schemas.microsoft.com/office/word/2018/wordml" xmlns:w16sdtdh="http://schemas.microsoft.com/office/word/2020/wordml/sdtdatahash" xmlns:w16se="http://schemas.microsoft.com/office/word/2015/wordml/symex" xmlns:wpg="http://schemas.microsoft.com/office/word/2010/wordprocessingGroup" xmlns:wpi="http://schemas.microsoft.com/office/word/2010/wordprocessingInk" xmlns:wne="http://schemas.microsoft.com/office/word/2006/wordml" xmlns:wps="http://schemas.microsoft.com/office/word/2010/wordprocessingShape" mc:Ignorable="w14 w15 w16se w16cid w16 w16cex w16sdtdh wp14">
   <w:footnote w:type="separator" w:id="-1">
     <w:p>
       <w:pPr>
@@ -1800,7 +1717,7 @@
 </file>
 
 <file path=word/numbering.xml><?xml version="1.0" encoding="utf-8"?>
-<w:numbering xmlns:wpc="http://schemas.microsoft.com/office/word/2010/wordprocessingCanvas" xmlns:cx="http://schemas.microsoft.com/office/drawing/2014/chartex" xmlns:cx1="http://schemas.microsoft.com/office/drawing/2015/9/8/chartex" xmlns:cx2="http://schemas.microsoft.com/office/drawing/2015/10/21/chartex" xmlns:cx3="http://schemas.microsoft.com/office/drawing/2016/5/9/chartex" xmlns:cx4="http://schemas.microsoft.com/office/drawing/2016/5/10/chartex" xmlns:cx5="http://schemas.microsoft.com/office/drawing/2016/5/11/chartex" xmlns:cx6="http://schemas.microsoft.com/office/drawing/2016/5/12/chartex" xmlns:cx7="http://schemas.microsoft.com/office/drawing/2016/5/13/chartex" xmlns:cx8="http://schemas.microsoft.com/office/drawing/2016/5/14/chartex" xmlns:mc="http://schemas.openxmlformats.org/markup-compatibility/2006" xmlns:aink="http://schemas.microsoft.com/office/drawing/2016/ink" xmlns:am3d="http://schemas.microsoft.com/office/drawing/2017/model3d" xmlns:o="urn:schemas-microsoft-com:office:office" xmlns:oel="http://schemas.microsoft.com/office/2019/extlst" xmlns:r="http://schemas.openxmlformats.org/officeDocument/2006/relationships" xmlns:m="http://schemas.openxmlformats.org/officeDocument/2006/math" xmlns:v="urn:schemas-microsoft-com:vml" xmlns:wp14="http://schemas.microsoft.com/office/word/2010/wordprocessingDrawing" xmlns:wp="http://schemas.openxmlformats.org/drawingml/2006/wordprocessingDrawing" xmlns:w10="urn:schemas-microsoft-com:office:word" xmlns:w="http://schemas.openxmlformats.org/wordprocessingml/2006/main" xmlns:w14="http://schemas.microsoft.com/office/word/2010/wordml" xmlns:w15="http://schemas.microsoft.com/office/word/2012/wordml" xmlns:w16cex="http://schemas.microsoft.com/office/word/2018/wordml/cex" xmlns:w16cid="http://schemas.microsoft.com/office/word/2016/wordml/cid" xmlns:w16="http://schemas.microsoft.com/office/word/2018/wordml" xmlns:w16sdtdh="http://schemas.microsoft.com/office/word/2020/wordml/sdtdatahash" xmlns:w16se="http://schemas.microsoft.com/office/word/2015/wordml/symex" xmlns:wpg="http://schemas.microsoft.com/office/word/2010/wordprocessingGroup" xmlns:wpi="http://schemas.microsoft.com/office/word/2010/wordprocessingInk" xmlns:wne="http://schemas.microsoft.com/office/word/2006/wordml" xmlns:wps="http://schemas.microsoft.com/office/word/2010/wordprocessingShape" mc:Ignorable="w14 w15 w16se w16cid w16 w16cex w16sdtdh wp14">
+<w:numbering xmlns:wpc="http://schemas.microsoft.com/office/word/2010/wordprocessingCanvas" xmlns:cx="http://schemas.microsoft.com/office/drawing/2014/chartex" xmlns:cx1="http://schemas.microsoft.com/office/drawing/2015/9/8/chartex" xmlns:cx2="http://schemas.microsoft.com/office/drawing/2015/10/21/chartex" xmlns:cx3="http://schemas.microsoft.com/office/drawing/2016/5/9/chartex" xmlns:cx4="http://schemas.microsoft.com/office/drawing/2016/5/10/chartex" xmlns:cx5="http://schemas.microsoft.com/office/drawing/2016/5/11/chartex" xmlns:cx6="http://schemas.microsoft.com/office/drawing/2016/5/12/chartex" xmlns:cx7="http://schemas.microsoft.com/office/drawing/2016/5/13/chartex" xmlns:cx8="http://schemas.microsoft.com/office/drawing/2016/5/14/chartex" xmlns:mc="http://schemas.openxmlformats.org/markup-compatibility/2006" xmlns:aink="http://schemas.microsoft.com/office/drawing/2016/ink" xmlns:am3d="http://schemas.microsoft.com/office/drawing/2017/model3d" xmlns:o="urn:schemas-microsoft-com:office:office" xmlns:r="http://schemas.openxmlformats.org/officeDocument/2006/relationships" xmlns:m="http://schemas.openxmlformats.org/officeDocument/2006/math" xmlns:v="urn:schemas-microsoft-com:vml" xmlns:wp14="http://schemas.microsoft.com/office/word/2010/wordprocessingDrawing" xmlns:wp="http://schemas.openxmlformats.org/drawingml/2006/wordprocessingDrawing" xmlns:w10="urn:schemas-microsoft-com:office:word" xmlns:w="http://schemas.openxmlformats.org/wordprocessingml/2006/main" xmlns:w14="http://schemas.microsoft.com/office/word/2010/wordml" xmlns:w15="http://schemas.microsoft.com/office/word/2012/wordml" xmlns:w16cex="http://schemas.microsoft.com/office/word/2018/wordml/cex" xmlns:w16cid="http://schemas.microsoft.com/office/word/2016/wordml/cid" xmlns:w16="http://schemas.microsoft.com/office/word/2018/wordml" xmlns:w16sdtdh="http://schemas.microsoft.com/office/word/2020/wordml/sdtdatahash" xmlns:w16se="http://schemas.microsoft.com/office/word/2015/wordml/symex" xmlns:wpg="http://schemas.microsoft.com/office/word/2010/wordprocessingGroup" xmlns:wpi="http://schemas.microsoft.com/office/word/2010/wordprocessingInk" xmlns:wne="http://schemas.microsoft.com/office/word/2006/wordml" xmlns:wps="http://schemas.microsoft.com/office/word/2010/wordprocessingShape" mc:Ignorable="w14 w15 w16se w16cid w16 w16cex w16sdtdh wp14">
   <w:abstractNum w:abstractNumId="0" w15:restartNumberingAfterBreak="0">
     <w:nsid w:val="5ACB5656"/>
     <w:multiLevelType w:val="hybridMultilevel"/>
@@ -1914,7 +1831,7 @@
       </w:rPr>
     </w:lvl>
   </w:abstractNum>
-  <w:num w:numId="1" w16cid:durableId="2045129774">
+  <w:num w:numId="1">
     <w:abstractNumId w:val="0"/>
   </w:num>
 </w:numbering>
@@ -3038,12 +2955,7 @@
 </file>
 
 <file path=customXml/item2.xml><?xml version="1.0" encoding="utf-8"?>
-<?mso-contentType ?>
-<FormTemplates xmlns="http://schemas.microsoft.com/sharepoint/v3/contenttype/forms">
-  <Display>DocumentLibraryForm</Display>
-  <Edit>DocumentLibraryForm</Edit>
-  <New>DocumentLibraryForm</New>
-</FormTemplates>
+<b:Sources xmlns:b="http://schemas.openxmlformats.org/officeDocument/2006/bibliography" xmlns="http://schemas.openxmlformats.org/officeDocument/2006/bibliography" SelectedStyle="\APASixthEditionOfficeOnline.xsl" StyleName="APA" Version="6"/>
 </file>
 
 <file path=customXml/item3.xml><?xml version="1.0" encoding="utf-8"?>
@@ -3185,7 +3097,12 @@
 </file>
 
 <file path=customXml/item4.xml><?xml version="1.0" encoding="utf-8"?>
-<b:Sources xmlns:b="http://schemas.openxmlformats.org/officeDocument/2006/bibliography" xmlns="http://schemas.openxmlformats.org/officeDocument/2006/bibliography" SelectedStyle="\APASixthEditionOfficeOnline.xsl" StyleName="APA" Version="6"/>
+<?mso-contentType ?>
+<FormTemplates xmlns="http://schemas.microsoft.com/sharepoint/v3/contenttype/forms">
+  <Display>DocumentLibraryForm</Display>
+  <Edit>DocumentLibraryForm</Edit>
+  <New>DocumentLibraryForm</New>
+</FormTemplates>
 </file>
 
 <file path=customXml/itemProps1.xml><?xml version="1.0" encoding="utf-8"?>
@@ -3198,9 +3115,9 @@
 </file>
 
 <file path=customXml/itemProps2.xml><?xml version="1.0" encoding="utf-8"?>
-<ds:datastoreItem xmlns:ds="http://schemas.openxmlformats.org/officeDocument/2006/customXml" ds:itemID="{E5876C36-A6F2-4B44-960A-B8B4B435ECCD}">
+<ds:datastoreItem xmlns:ds="http://schemas.openxmlformats.org/officeDocument/2006/customXml" ds:itemID="{99DD2AA0-78B3-40EA-8C1D-954E770C8D8A}">
   <ds:schemaRefs>
-    <ds:schemaRef ds:uri="http://schemas.microsoft.com/sharepoint/v3/contenttype/forms"/>
+    <ds:schemaRef ds:uri="http://schemas.openxmlformats.org/officeDocument/2006/bibliography"/>
   </ds:schemaRefs>
 </ds:datastoreItem>
 </file>
@@ -3224,9 +3141,9 @@
 </file>
 
 <file path=customXml/itemProps4.xml><?xml version="1.0" encoding="utf-8"?>
-<ds:datastoreItem xmlns:ds="http://schemas.openxmlformats.org/officeDocument/2006/customXml" ds:itemID="{99DD2AA0-78B3-40EA-8C1D-954E770C8D8A}">
+<ds:datastoreItem xmlns:ds="http://schemas.openxmlformats.org/officeDocument/2006/customXml" ds:itemID="{E5876C36-A6F2-4B44-960A-B8B4B435ECCD}">
   <ds:schemaRefs>
-    <ds:schemaRef ds:uri="http://schemas.openxmlformats.org/officeDocument/2006/bibliography"/>
+    <ds:schemaRef ds:uri="http://schemas.microsoft.com/sharepoint/v3/contenttype/forms"/>
   </ds:schemaRefs>
 </ds:datastoreItem>
 </file>
</xml_diff>

<commit_message>
Updated syllabus_generator.py,doc_editor.py, and SyllabusTemplate.docx
++syllabus_generator.py++
- Syllabus is now populating all placeholders, just need to get the line spacing and text formatting working
++doc_editor.py++
- Fixed logical errors in how block removal worked
++SyllabusTemplate.docx++
- Fixed typos in the template
</commit_message>
<xml_diff>
--- a/backend/docx/SyllabusTemplate.docx
+++ b/backend/docx/SyllabusTemplate.docx
@@ -724,237 +724,234 @@
         <w:t xml:space="preserve"> </w:t>
       </w:r>
       <w:r>
+        <w:t>$</w:t>
+      </w:r>
+      <w:r>
+        <w:t>{</w:t>
+      </w:r>
+      <w:r>
+        <w:t>instructor_title</w:t>
+      </w:r>
+      <w:r>
+        <w:t>}</w:t>
+      </w:r>
+      <w:r>
+        <w:t>&lt;/title&gt;</w:t>
+      </w:r>
+      <w:r>
+        <w:t xml:space="preserve"> </w:t>
+      </w:r>
+      <w:r>
+        <w:t>&lt;foa&gt;</w:t>
+      </w:r>
+      <w:r>
+        <w:t>(</w:t>
+      </w:r>
+      <w:r>
         <w:t>${</w:t>
       </w:r>
       <w:r>
-        <w:t>instructor_title</w:t>
+        <w:t>form_of_address</w:t>
       </w:r>
       <w:r>
         <w:t>}</w:t>
       </w:r>
       <w:r>
-        <w:t>&lt;/title&gt;</w:t>
-      </w:r>
-      <w:r>
+        <w:t>)</w:t>
+      </w:r>
+      <w:r>
+        <w:t>&lt;</w:t>
+      </w:r>
+      <w:r>
+        <w:t>/</w:t>
+      </w:r>
+      <w:r>
+        <w:t>foa&gt;</w:t>
+      </w:r>
+    </w:p>
+    <w:p>
+      <w:pPr>
+        <w:spacing w:after="0"/>
+      </w:pPr>
+      <w:r>
+        <w:t xml:space="preserve">Contact Info: </w:t>
+      </w:r>
+      <w:r>
+        <w:tab/>
+      </w:r>
+      <w:r>
+        <w:tab/>
+      </w:r>
+      <w:r>
+        <w:t>${</w:t>
+      </w:r>
+      <w:r>
+        <w:t>email</w:t>
+      </w:r>
+      <w:r>
+        <w:t>}</w:t>
+      </w:r>
+      <w:r>
+        <w:t>&lt;phone&gt;</w:t>
+      </w:r>
+      <w:r>
+        <w:t xml:space="preserve">, </w:t>
+      </w:r>
+      <w:r>
+        <w:t>${</w:t>
+      </w:r>
+      <w:r>
+        <w:t>phone</w:t>
+      </w:r>
+      <w:r>
+        <w:t>}</w:t>
+      </w:r>
+      <w:r>
+        <w:t>&lt;/phone&gt;</w:t>
+      </w:r>
+    </w:p>
+    <w:p>
+      <w:pPr>
+        <w:spacing w:after="0"/>
+      </w:pPr>
+      <w:r>
+        <w:t>Office Location:</w:t>
+      </w:r>
+      <w:r>
+        <w:tab/>
+      </w:r>
+      <w:r>
+        <w:tab/>
+      </w:r>
+      <w:r>
+        <w:t>${</w:t>
+      </w:r>
+      <w:r>
+        <w:t>office_location</w:t>
+      </w:r>
+      <w:r>
+        <w:t>}</w:t>
+      </w:r>
+    </w:p>
+    <w:p>
+      <w:pPr>
+        <w:spacing w:after="0"/>
+      </w:pPr>
+      <w:r>
+        <w:t>Office Hours:</w:t>
+      </w:r>
+      <w:r>
+        <w:tab/>
+      </w:r>
+      <w:r>
+        <w:tab/>
+      </w:r>
+      <w:r>
+        <w:t>${</w:t>
+      </w:r>
+      <w:r>
+        <w:t>office_hours</w:t>
+      </w:r>
+      <w:r>
+        <w:t>}</w:t>
+      </w:r>
+    </w:p>
+    <w:p>
+      <w:pPr>
+        <w:spacing w:after="0"/>
+      </w:pPr>
+    </w:p>
+    <w:p>
+      <w:pPr>
+        <w:spacing w:after="0"/>
+        <w:rPr>
+          <w:lang w:val="fr-FR"/>
+        </w:rPr>
+      </w:pPr>
+      <w:r>
+        <w:rPr>
+          <w:lang w:val="fr-FR"/>
+        </w:rPr>
+        <w:t>${</w:t>
+      </w:r>
+      <w:r>
+        <w:rPr>
+          <w:lang w:val="fr-FR"/>
+        </w:rPr>
         <w:t xml:space="preserve"> </w:t>
       </w:r>
       <w:r>
-        <w:t>&lt;foa&gt;</w:t>
-      </w:r>
-      <w:r>
-        <w:t>(</w:t>
-      </w:r>
+        <w:rPr>
+          <w:lang w:val="fr-FR"/>
+        </w:rPr>
+        <w:t>additional_sections_syllabus_json</w:t>
+      </w:r>
+      <w:r>
+        <w:rPr>
+          <w:lang w:val="fr-FR"/>
+        </w:rPr>
+        <w:t>}</w:t>
+      </w:r>
+    </w:p>
+    <w:p>
+      <w:pPr>
+        <w:spacing w:after="0"/>
+        <w:rPr>
+          <w:lang w:val="fr-FR"/>
+        </w:rPr>
+      </w:pPr>
+    </w:p>
+    <w:p>
+      <w:pPr>
+        <w:spacing w:after="0"/>
+        <w:rPr>
+          <w:rFonts w:asciiTheme="majorHAnsi" w:eastAsiaTheme="majorEastAsia" w:hAnsiTheme="majorHAnsi" w:cstheme="majorBidi"/>
+          <w:b/>
+          <w:bCs/>
+          <w:color w:val="1F3864" w:themeColor="accent1" w:themeShade="80"/>
+          <w:sz w:val="26"/>
+          <w:szCs w:val="26"/>
+          <w:lang w:val="fr-FR"/>
+        </w:rPr>
+      </w:pPr>
+      <w:r>
+        <w:rPr>
+          <w:rFonts w:asciiTheme="majorHAnsi" w:eastAsiaTheme="majorEastAsia" w:hAnsiTheme="majorHAnsi" w:cstheme="majorBidi"/>
+          <w:b/>
+          <w:bCs/>
+          <w:color w:val="1F3864" w:themeColor="accent1" w:themeShade="80"/>
+          <w:sz w:val="26"/>
+          <w:szCs w:val="26"/>
+          <w:lang w:val="fr-FR"/>
+        </w:rPr>
+        <w:t>Course Description</w:t>
+      </w:r>
+    </w:p>
+    <w:p>
+      <w:pPr>
+        <w:spacing w:after="0"/>
+        <w:rPr>
+          <w:lang w:val="fr-FR"/>
+        </w:rPr>
+      </w:pPr>
+    </w:p>
+    <w:p>
+      <w:pPr>
+        <w:spacing w:after="0"/>
+      </w:pPr>
       <w:r>
         <w:t>${</w:t>
       </w:r>
       <w:r>
-        <w:t>form_of_address</w:t>
+        <w:t>course_description</w:t>
       </w:r>
       <w:r>
         <w:t>}</w:t>
       </w:r>
-      <w:r>
-        <w:t>)</w:t>
-      </w:r>
-      <w:r>
-        <w:t>&lt;?foa&gt;</w:t>
-      </w:r>
-    </w:p>
-    <w:p>
-      <w:pPr>
-        <w:spacing w:after="0"/>
-      </w:pPr>
-      <w:r>
-        <w:t xml:space="preserve">Contact Info: </w:t>
-      </w:r>
-      <w:r>
-        <w:tab/>
-      </w:r>
-      <w:r>
-        <w:tab/>
-      </w:r>
-      <w:r>
-        <w:t>${</w:t>
-      </w:r>
-      <w:r>
-        <w:t>email</w:t>
-      </w:r>
-      <w:r>
-        <w:t>}</w:t>
-      </w:r>
-      <w:r>
-        <w:t>&lt;phone&gt;</w:t>
-      </w:r>
-      <w:r>
-        <w:t xml:space="preserve">, </w:t>
-      </w:r>
-      <w:r>
-        <w:t>${</w:t>
-      </w:r>
-      <w:r>
-        <w:t>phone</w:t>
-      </w:r>
-      <w:r>
-        <w:t>}</w:t>
-      </w:r>
-      <w:r>
-        <w:t>&lt;/phone&gt;</w:t>
-      </w:r>
-    </w:p>
-    <w:p>
-      <w:pPr>
-        <w:spacing w:after="0"/>
-      </w:pPr>
-      <w:r>
-        <w:t>Office Location:</w:t>
-      </w:r>
-      <w:r>
-        <w:tab/>
-      </w:r>
-      <w:r>
-        <w:tab/>
-      </w:r>
-      <w:r>
-        <w:t>${</w:t>
-      </w:r>
-      <w:r>
-        <w:t>office_location</w:t>
-      </w:r>
-      <w:r>
-        <w:t>}</w:t>
-      </w:r>
-    </w:p>
-    <w:p>
-      <w:pPr>
-        <w:spacing w:after="0"/>
-      </w:pPr>
-      <w:r>
-        <w:t>Office Hours:</w:t>
-      </w:r>
-      <w:r>
-        <w:tab/>
-      </w:r>
-      <w:r>
-        <w:tab/>
-      </w:r>
-      <w:r>
-        <w:t>${</w:t>
-      </w:r>
-      <w:r>
-        <w:t>office_hours</w:t>
-      </w:r>
-      <w:r>
-        <w:t>}</w:t>
-      </w:r>
-    </w:p>
-    <w:p>
-      <w:pPr>
-        <w:spacing w:after="0"/>
-      </w:pPr>
-    </w:p>
-    <w:p>
-      <w:pPr>
-        <w:spacing w:after="0"/>
-        <w:rPr>
-          <w:lang w:val="fr-FR"/>
-        </w:rPr>
-      </w:pPr>
-      <w:r>
-        <w:rPr>
-          <w:lang w:val="fr-FR"/>
-        </w:rPr>
-        <w:t>${</w:t>
-      </w:r>
-      <w:r>
-        <w:t xml:space="preserve"> </w:t>
-      </w:r>
-      <w:r>
-        <w:rPr>
-          <w:lang w:val="fr-FR"/>
-        </w:rPr>
-        <w:t>additional_sections_syllabus_json</w:t>
-      </w:r>
-      <w:r>
-        <w:rPr>
-          <w:lang w:val="fr-FR"/>
-        </w:rPr>
-        <w:t>}</w:t>
-      </w:r>
-    </w:p>
-    <w:p>
-      <w:pPr>
-        <w:spacing w:after="0"/>
-        <w:rPr>
-          <w:lang w:val="fr-FR"/>
-        </w:rPr>
-      </w:pPr>
-    </w:p>
-    <w:p>
-      <w:pPr>
-        <w:spacing w:after="0"/>
-        <w:rPr>
-          <w:rFonts w:asciiTheme="majorHAnsi" w:eastAsiaTheme="majorEastAsia" w:hAnsiTheme="majorHAnsi" w:cstheme="majorBidi"/>
-          <w:b/>
-          <w:bCs/>
-          <w:color w:val="1F3864" w:themeColor="accent1" w:themeShade="80"/>
-          <w:sz w:val="26"/>
-          <w:szCs w:val="26"/>
-          <w:lang w:val="fr-FR"/>
-        </w:rPr>
-      </w:pPr>
-      <w:r>
-        <w:rPr>
-          <w:rFonts w:asciiTheme="majorHAnsi" w:eastAsiaTheme="majorEastAsia" w:hAnsiTheme="majorHAnsi" w:cstheme="majorBidi"/>
-          <w:b/>
-          <w:bCs/>
-          <w:color w:val="1F3864" w:themeColor="accent1" w:themeShade="80"/>
-          <w:sz w:val="26"/>
-          <w:szCs w:val="26"/>
-          <w:lang w:val="fr-FR"/>
-        </w:rPr>
-        <w:t>Course Description</w:t>
-      </w:r>
-    </w:p>
-    <w:p>
-      <w:pPr>
-        <w:spacing w:after="0"/>
-        <w:rPr>
-          <w:lang w:val="fr-FR"/>
-        </w:rPr>
-      </w:pPr>
-    </w:p>
-    <w:p>
-      <w:pPr>
-        <w:spacing w:after="0"/>
-        <w:rPr>
-          <w:lang w:val="fr-FR"/>
-        </w:rPr>
-      </w:pPr>
-      <w:r>
-        <w:rPr>
-          <w:lang w:val="fr-FR"/>
-        </w:rPr>
-        <w:t>${</w:t>
-      </w:r>
-      <w:r>
-        <w:rPr>
-          <w:lang w:val="fr-FR"/>
-        </w:rPr>
-        <w:t>course_description</w:t>
-      </w:r>
-      <w:r>
-        <w:rPr>
-          <w:lang w:val="fr-FR"/>
-        </w:rPr>
-        <w:t>}</w:t>
-      </w:r>
-    </w:p>
-    <w:p>
-      <w:pPr>
-        <w:spacing w:after="0"/>
-        <w:rPr>
-          <w:lang w:val="fr-FR"/>
-        </w:rPr>
+    </w:p>
+    <w:p>
+      <w:pPr>
+        <w:spacing w:after="0"/>
       </w:pPr>
     </w:p>
     <w:p>
@@ -1339,7 +1336,6 @@
           <w:color w:val="1F3864" w:themeColor="accent1" w:themeShade="80"/>
           <w:sz w:val="26"/>
           <w:szCs w:val="26"/>
-          <w:lang w:val="fr-FR"/>
         </w:rPr>
       </w:pPr>
       <w:r>
@@ -1350,7 +1346,6 @@
           <w:color w:val="1F3864" w:themeColor="accent1" w:themeShade="80"/>
           <w:sz w:val="26"/>
           <w:szCs w:val="26"/>
-          <w:lang w:val="fr-FR"/>
         </w:rPr>
         <w:t>Assessments</w:t>
       </w:r>
@@ -1365,7 +1360,6 @@
           <w:i w:val="0"/>
           <w:iCs w:val="0"/>
           <w:color w:val="1F3864" w:themeColor="accent1" w:themeShade="80"/>
-          <w:lang w:val="fr-FR"/>
         </w:rPr>
       </w:pPr>
     </w:p>
@@ -1378,7 +1372,6 @@
           <w:i w:val="0"/>
           <w:iCs w:val="0"/>
           <w:color w:val="auto"/>
-          <w:lang w:val="fr-FR"/>
         </w:rPr>
       </w:pPr>
       <w:r>
@@ -1388,7 +1381,6 @@
           <w:i w:val="0"/>
           <w:iCs w:val="0"/>
           <w:color w:val="auto"/>
-          <w:lang w:val="fr-FR"/>
         </w:rPr>
         <w:t>${assmt_assignments_syllabus_json}</w:t>
       </w:r>
@@ -1403,16 +1395,12 @@
           <w:i w:val="0"/>
           <w:iCs w:val="0"/>
           <w:color w:val="1F3864" w:themeColor="accent1" w:themeShade="80"/>
-          <w:lang w:val="fr-FR"/>
-        </w:rPr>
-      </w:pPr>
-    </w:p>
-    <w:p>
-      <w:pPr>
-        <w:spacing w:after="0"/>
-        <w:rPr>
-          <w:lang w:val="fr-FR"/>
-        </w:rPr>
+        </w:rPr>
+      </w:pPr>
+    </w:p>
+    <w:p>
+      <w:pPr>
+        <w:spacing w:after="0"/>
       </w:pPr>
     </w:p>
     <w:p>
@@ -2949,16 +2937,25 @@
 </file>
 
 <file path=customXml/item1.xml><?xml version="1.0" encoding="utf-8"?>
+<?mso-contentType ?>
+<FormTemplates xmlns="http://schemas.microsoft.com/sharepoint/v3/contenttype/forms">
+  <Display>DocumentLibraryForm</Display>
+  <Edit>DocumentLibraryForm</Edit>
+  <New>DocumentLibraryForm</New>
+</FormTemplates>
+</file>
+
+<file path=customXml/item2.xml><?xml version="1.0" encoding="utf-8"?>
 <p:properties xmlns:p="http://schemas.microsoft.com/office/2006/metadata/properties" xmlns:xsi="http://www.w3.org/2001/XMLSchema-instance" xmlns:pc="http://schemas.microsoft.com/office/infopath/2007/PartnerControls">
   <documentManagement/>
 </p:properties>
 </file>
 
-<file path=customXml/item2.xml><?xml version="1.0" encoding="utf-8"?>
+<file path=customXml/item3.xml><?xml version="1.0" encoding="utf-8"?>
 <b:Sources xmlns:b="http://schemas.openxmlformats.org/officeDocument/2006/bibliography" xmlns="http://schemas.openxmlformats.org/officeDocument/2006/bibliography" SelectedStyle="\APASixthEditionOfficeOnline.xsl" StyleName="APA" Version="6"/>
 </file>
 
-<file path=customXml/item3.xml><?xml version="1.0" encoding="utf-8"?>
+<file path=customXml/item4.xml><?xml version="1.0" encoding="utf-8"?>
 <ct:contentTypeSchema xmlns:ct="http://schemas.microsoft.com/office/2006/metadata/contentType" xmlns:ma="http://schemas.microsoft.com/office/2006/metadata/properties/metaAttributes" ct:_="" ma:_="" ma:contentTypeName="Document" ma:contentTypeID="0x01010043AC30EE3931924C951949B01581249A" ma:contentTypeVersion="3" ma:contentTypeDescription="Create a new document." ma:contentTypeScope="" ma:versionID="ecba60cf1f3c2b4798aa357a3e04473e">
   <xsd:schema xmlns:xsd="http://www.w3.org/2001/XMLSchema" xmlns:xs="http://www.w3.org/2001/XMLSchema" xmlns:p="http://schemas.microsoft.com/office/2006/metadata/properties" xmlns:ns2="5e46cd92-5281-4aec-af6d-ce68d6323cf6" targetNamespace="http://schemas.microsoft.com/office/2006/metadata/properties" ma:root="true" ma:fieldsID="749246a7d39d1518a48c156f5ef050f5" ns2:_="">
     <xsd:import namespace="5e46cd92-5281-4aec-af6d-ce68d6323cf6"/>
@@ -3096,16 +3093,15 @@
 </ct:contentTypeSchema>
 </file>
 
-<file path=customXml/item4.xml><?xml version="1.0" encoding="utf-8"?>
-<?mso-contentType ?>
-<FormTemplates xmlns="http://schemas.microsoft.com/sharepoint/v3/contenttype/forms">
-  <Display>DocumentLibraryForm</Display>
-  <Edit>DocumentLibraryForm</Edit>
-  <New>DocumentLibraryForm</New>
-</FormTemplates>
+<file path=customXml/itemProps1.xml><?xml version="1.0" encoding="utf-8"?>
+<ds:datastoreItem xmlns:ds="http://schemas.openxmlformats.org/officeDocument/2006/customXml" ds:itemID="{E5876C36-A6F2-4B44-960A-B8B4B435ECCD}">
+  <ds:schemaRefs>
+    <ds:schemaRef ds:uri="http://schemas.microsoft.com/sharepoint/v3/contenttype/forms"/>
+  </ds:schemaRefs>
+</ds:datastoreItem>
 </file>
 
-<file path=customXml/itemProps1.xml><?xml version="1.0" encoding="utf-8"?>
+<file path=customXml/itemProps2.xml><?xml version="1.0" encoding="utf-8"?>
 <ds:datastoreItem xmlns:ds="http://schemas.openxmlformats.org/officeDocument/2006/customXml" ds:itemID="{509D1927-145B-4147-AE53-B018C6899FD0}">
   <ds:schemaRefs>
     <ds:schemaRef ds:uri="http://schemas.microsoft.com/office/2006/metadata/properties"/>
@@ -3114,7 +3110,7 @@
 </ds:datastoreItem>
 </file>
 
-<file path=customXml/itemProps2.xml><?xml version="1.0" encoding="utf-8"?>
+<file path=customXml/itemProps3.xml><?xml version="1.0" encoding="utf-8"?>
 <ds:datastoreItem xmlns:ds="http://schemas.openxmlformats.org/officeDocument/2006/customXml" ds:itemID="{99DD2AA0-78B3-40EA-8C1D-954E770C8D8A}">
   <ds:schemaRefs>
     <ds:schemaRef ds:uri="http://schemas.openxmlformats.org/officeDocument/2006/bibliography"/>
@@ -3122,7 +3118,7 @@
 </ds:datastoreItem>
 </file>
 
-<file path=customXml/itemProps3.xml><?xml version="1.0" encoding="utf-8"?>
+<file path=customXml/itemProps4.xml><?xml version="1.0" encoding="utf-8"?>
 <ds:datastoreItem xmlns:ds="http://schemas.openxmlformats.org/officeDocument/2006/customXml" ds:itemID="{D4AD5993-87D2-4E47-8D6E-96B6100FF46D}">
   <ds:schemaRefs>
     <ds:schemaRef ds:uri="http://schemas.microsoft.com/office/2006/metadata/contentType"/>
@@ -3138,12 +3134,4 @@
     <ds:schemaRef ds:uri="http://schemas.microsoft.com/internal/obd"/>
   </ds:schemaRefs>
 </ds:datastoreItem>
-</file>
-
-<file path=customXml/itemProps4.xml><?xml version="1.0" encoding="utf-8"?>
-<ds:datastoreItem xmlns:ds="http://schemas.openxmlformats.org/officeDocument/2006/customXml" ds:itemID="{E5876C36-A6F2-4B44-960A-B8B4B435ECCD}">
-  <ds:schemaRefs>
-    <ds:schemaRef ds:uri="http://schemas.microsoft.com/sharepoint/v3/contenttype/forms"/>
-  </ds:schemaRefs>
-</ds:datastoreItem>
 </file>
</xml_diff>

<commit_message>
Updates to syllabus generation
</commit_message>
<xml_diff>
--- a/backend/docx/SyllabusTemplate.docx
+++ b/backend/docx/SyllabusTemplate.docx
@@ -247,7 +247,7 @@
               </wp:anchor>
             </w:drawing>
           </mc:Choice>
-          <mc:Fallback xmlns:a="http://schemas.openxmlformats.org/drawingml/2006/main" xmlns:pic="http://schemas.openxmlformats.org/drawingml/2006/picture" xmlns:a14="http://schemas.microsoft.com/office/drawing/2010/main">
+          <mc:Fallback xmlns:a14="http://schemas.microsoft.com/office/drawing/2010/main" xmlns:pic="http://schemas.openxmlformats.org/drawingml/2006/picture" xmlns:a="http://schemas.openxmlformats.org/drawingml/2006/main">
             <w:pict w14:anchorId="08122B22">
               <v:line id="Straight Connector 3" style="position:absolute;z-index:251640832;visibility:visible;mso-wrap-style:square;mso-wrap-distance-left:9pt;mso-wrap-distance-top:0;mso-wrap-distance-right:9pt;mso-wrap-distance-bottom:0;mso-position-horizontal:absolute;mso-position-horizontal-relative:text;mso-position-vertical:absolute;mso-position-vertical-relative:text" o:spid="_x0000_s1026" strokecolor="#1f3763 [1604]" strokeweight="1pt" from="104.4pt,-5.4pt" to="105pt,91.8pt" w14:anchorId="328FC97B" o:gfxdata="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">
                 <v:stroke joinstyle="miter"/>
@@ -322,7 +322,7 @@
               </wp:anchor>
             </w:drawing>
           </mc:Choice>
-          <mc:Fallback xmlns:a="http://schemas.openxmlformats.org/drawingml/2006/main" xmlns:pic="http://schemas.openxmlformats.org/drawingml/2006/picture" xmlns:a14="http://schemas.microsoft.com/office/drawing/2010/main">
+          <mc:Fallback xmlns:a14="http://schemas.microsoft.com/office/drawing/2010/main" xmlns:pic="http://schemas.openxmlformats.org/drawingml/2006/picture" xmlns:a="http://schemas.openxmlformats.org/drawingml/2006/main">
             <w:pict w14:anchorId="0F3FCE19">
               <v:line id="Straight Connector 2" style="position:absolute;z-index:251639808;visibility:visible;mso-wrap-style:square;mso-wrap-distance-left:9pt;mso-wrap-distance-top:0;mso-wrap-distance-right:9pt;mso-wrap-distance-bottom:0;mso-position-horizontal:absolute;mso-position-horizontal-relative:text;mso-position-vertical:absolute;mso-position-vertical-relative:text" o:spid="_x0000_s1026" strokecolor="#1f3763 [1604]" strokeweight="1pt" from="0,91.8pt" to="466.8pt,91.8pt" w14:anchorId="7ED6B9A8" o:gfxdata="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">
                 <v:stroke joinstyle="miter"/>
@@ -351,7 +351,6 @@
         </w:rPr>
         <w:t>${</w:t>
       </w:r>
-      <w:proofErr w:type="spellStart"/>
       <w:r>
         <w:rPr>
           <w:b/>
@@ -362,7 +361,6 @@
         </w:rPr>
         <w:t>subj_code</w:t>
       </w:r>
-      <w:proofErr w:type="spellEnd"/>
       <w:r>
         <w:rPr>
           <w:b/>
@@ -381,6 +379,16 @@
           <w:sz w:val="26"/>
           <w:szCs w:val="26"/>
         </w:rPr>
+        <w:t xml:space="preserve"> </w:t>
+      </w:r>
+      <w:r>
+        <w:rPr>
+          <w:b/>
+          <w:bCs/>
+          <w:color w:val="1F3864" w:themeColor="accent1" w:themeShade="80"/>
+          <w:sz w:val="26"/>
+          <w:szCs w:val="26"/>
+        </w:rPr>
         <w:t>$</w:t>
       </w:r>
       <w:r>
@@ -393,7 +401,6 @@
         </w:rPr>
         <w:t>{</w:t>
       </w:r>
-      <w:proofErr w:type="spellStart"/>
       <w:r>
         <w:rPr>
           <w:b/>
@@ -434,7 +441,6 @@
         </w:rPr>
         <w:t>ber</w:t>
       </w:r>
-      <w:proofErr w:type="spellEnd"/>
       <w:r>
         <w:rPr>
           <w:b/>
@@ -453,7 +459,17 @@
           <w:sz w:val="26"/>
           <w:szCs w:val="26"/>
         </w:rPr>
-        <w:t xml:space="preserve">, </w:t>
+        <w:t>:</w:t>
+      </w:r>
+      <w:r>
+        <w:rPr>
+          <w:b/>
+          <w:bCs/>
+          <w:color w:val="1F3864" w:themeColor="accent1" w:themeShade="80"/>
+          <w:sz w:val="26"/>
+          <w:szCs w:val="26"/>
+        </w:rPr>
+        <w:t xml:space="preserve"> </w:t>
       </w:r>
       <w:r>
         <w:rPr>
@@ -475,7 +491,6 @@
         </w:rPr>
         <w:t>{</w:t>
       </w:r>
-      <w:proofErr w:type="spellStart"/>
       <w:r>
         <w:rPr>
           <w:b/>
@@ -486,7 +501,6 @@
         </w:rPr>
         <w:t>course_title</w:t>
       </w:r>
-      <w:proofErr w:type="spellEnd"/>
       <w:r>
         <w:rPr>
           <w:b/>
@@ -714,11 +728,9 @@
       <w:r>
         <w:t>${</w:t>
       </w:r>
-      <w:proofErr w:type="spellStart"/>
       <w:r>
         <w:t>instructor_name</w:t>
       </w:r>
-      <w:proofErr w:type="spellEnd"/>
       <w:r>
         <w:t>}</w:t>
       </w:r>
@@ -726,266 +738,229 @@
         <w:t>&lt;title&gt;</w:t>
       </w:r>
       <w:r>
+        <w:t xml:space="preserve"> (</w:t>
+      </w:r>
+      <w:r>
+        <w:t>$</w:t>
+      </w:r>
+      <w:r>
+        <w:t>{</w:t>
+      </w:r>
+      <w:r>
+        <w:t>instructor_title</w:t>
+      </w:r>
+      <w:r>
+        <w:t>}</w:t>
+      </w:r>
+      <w:r>
+        <w:t>)</w:t>
+      </w:r>
+      <w:r>
+        <w:t>&lt;/title&gt;</w:t>
+      </w:r>
+      <w:r>
+        <w:t xml:space="preserve"> </w:t>
+      </w:r>
+    </w:p>
+    <w:p>
+      <w:pPr>
+        <w:spacing w:after="0"/>
+      </w:pPr>
+      <w:r>
+        <w:t xml:space="preserve">Contact Info: </w:t>
+      </w:r>
+      <w:r>
+        <w:tab/>
+      </w:r>
+      <w:r>
+        <w:tab/>
+      </w:r>
+      <w:r>
+        <w:t xml:space="preserve">E-mail: </w:t>
+      </w:r>
+      <w:r>
+        <w:t>${</w:t>
+      </w:r>
+      <w:r>
+        <w:t>email</w:t>
+      </w:r>
+      <w:r>
+        <w:t>}</w:t>
+      </w:r>
+      <w:r>
+        <w:t>&lt;phone&gt;</w:t>
+      </w:r>
+      <w:r>
         <w:t>,</w:t>
       </w:r>
       <w:r>
+        <w:t xml:space="preserve"> Phone:</w:t>
+      </w:r>
+      <w:r>
         <w:t xml:space="preserve"> </w:t>
       </w:r>
       <w:r>
-        <w:t>$</w:t>
-      </w:r>
-      <w:r>
-        <w:t>{</w:t>
-      </w:r>
-      <w:proofErr w:type="spellStart"/>
-      <w:r>
-        <w:t>instructor_title</w:t>
-      </w:r>
-      <w:proofErr w:type="spellEnd"/>
+        <w:t>${</w:t>
+      </w:r>
+      <w:r>
+        <w:t>phone</w:t>
+      </w:r>
       <w:r>
         <w:t>}</w:t>
       </w:r>
       <w:r>
-        <w:t>&lt;/title&gt;</w:t>
-      </w:r>
-      <w:r>
+        <w:t>&lt;/phone&gt;</w:t>
+      </w:r>
+    </w:p>
+    <w:p>
+      <w:pPr>
+        <w:spacing w:after="0"/>
+      </w:pPr>
+      <w:r>
+        <w:t>Office Location:</w:t>
+      </w:r>
+      <w:r>
+        <w:tab/>
+      </w:r>
+      <w:r>
+        <w:tab/>
+      </w:r>
+      <w:r>
+        <w:t>${</w:t>
+      </w:r>
+      <w:r>
+        <w:t>office_location</w:t>
+      </w:r>
+      <w:r>
+        <w:t>}</w:t>
+      </w:r>
+    </w:p>
+    <w:p>
+      <w:pPr>
+        <w:spacing w:after="0"/>
+      </w:pPr>
+      <w:r>
+        <w:t>Office Hours:</w:t>
+      </w:r>
+      <w:r>
+        <w:tab/>
+      </w:r>
+      <w:r>
+        <w:tab/>
+      </w:r>
+      <w:r>
+        <w:t>${</w:t>
+      </w:r>
+      <w:r>
+        <w:t>office_hours</w:t>
+      </w:r>
+      <w:r>
+        <w:t>}</w:t>
+      </w:r>
+    </w:p>
+    <w:p>
+      <w:pPr>
+        <w:spacing w:after="0"/>
+      </w:pPr>
+    </w:p>
+    <w:p>
+      <w:pPr>
+        <w:spacing w:after="0"/>
+      </w:pPr>
+      <w:r>
+        <w:t>&lt;instructor_additional_information&gt;</w:t>
+      </w:r>
+    </w:p>
+    <w:p>
+      <w:pPr>
+        <w:spacing w:after="0"/>
+        <w:rPr>
+          <w:lang w:val="fr-FR"/>
+        </w:rPr>
+      </w:pPr>
+      <w:r>
+        <w:rPr>
+          <w:lang w:val="fr-FR"/>
+        </w:rPr>
+        <w:t>${</w:t>
+      </w:r>
+      <w:r>
+        <w:rPr>
+          <w:lang w:val="fr-FR"/>
+        </w:rPr>
         <w:t xml:space="preserve"> </w:t>
       </w:r>
       <w:r>
-        <w:t>&lt;</w:t>
-      </w:r>
-      <w:proofErr w:type="spellStart"/>
-      <w:r>
-        <w:t>foa</w:t>
-      </w:r>
-      <w:proofErr w:type="spellEnd"/>
-      <w:r>
-        <w:t>&gt;</w:t>
-      </w:r>
-      <w:r>
-        <w:t>(</w:t>
-      </w:r>
+        <w:rPr>
+          <w:lang w:val="fr-FR"/>
+        </w:rPr>
+        <w:t>instructor_additional_information</w:t>
+      </w:r>
+      <w:r>
+        <w:rPr>
+          <w:lang w:val="fr-FR"/>
+        </w:rPr>
+        <w:t>}</w:t>
+      </w:r>
+    </w:p>
+    <w:p>
+      <w:pPr>
+        <w:spacing w:after="0"/>
+        <w:rPr>
+          <w:lang w:val="fr-FR"/>
+        </w:rPr>
+      </w:pPr>
+      <w:r>
+        <w:rPr>
+          <w:lang w:val="fr-FR"/>
+        </w:rPr>
+        <w:t>&lt;/instructor_additional_information&gt;</w:t>
+      </w:r>
+    </w:p>
+    <w:p>
+      <w:pPr>
+        <w:spacing w:after="0"/>
+        <w:rPr>
+          <w:lang w:val="fr-FR"/>
+        </w:rPr>
+      </w:pPr>
+    </w:p>
+    <w:p>
+      <w:pPr>
+        <w:spacing w:after="0"/>
+        <w:rPr>
+          <w:rFonts w:asciiTheme="majorHAnsi" w:eastAsiaTheme="majorEastAsia" w:hAnsiTheme="majorHAnsi" w:cstheme="majorBidi"/>
+          <w:b/>
+          <w:bCs/>
+          <w:color w:val="1F3864" w:themeColor="accent1" w:themeShade="80"/>
+          <w:sz w:val="26"/>
+          <w:szCs w:val="26"/>
+          <w:lang w:val="fr-FR"/>
+        </w:rPr>
+      </w:pPr>
+      <w:r>
+        <w:rPr>
+          <w:rFonts w:asciiTheme="majorHAnsi" w:eastAsiaTheme="majorEastAsia" w:hAnsiTheme="majorHAnsi" w:cstheme="majorBidi"/>
+          <w:b/>
+          <w:bCs/>
+          <w:color w:val="1F3864" w:themeColor="accent1" w:themeShade="80"/>
+          <w:sz w:val="26"/>
+          <w:szCs w:val="26"/>
+          <w:lang w:val="fr-FR"/>
+        </w:rPr>
+        <w:t>Course Description</w:t>
+      </w:r>
+    </w:p>
+    <w:p>
+      <w:pPr>
+        <w:spacing w:after="0"/>
+      </w:pPr>
       <w:r>
         <w:t>${</w:t>
       </w:r>
-      <w:proofErr w:type="spellStart"/>
-      <w:r>
-        <w:t>form_of_address</w:t>
-      </w:r>
-      <w:proofErr w:type="spellEnd"/>
-      <w:r>
-        <w:t>}</w:t>
-      </w:r>
-      <w:r>
-        <w:t>)</w:t>
-      </w:r>
-      <w:r>
-        <w:t>&lt;</w:t>
-      </w:r>
-      <w:r>
-        <w:t>/</w:t>
-      </w:r>
-      <w:proofErr w:type="spellStart"/>
-      <w:r>
-        <w:t>foa</w:t>
-      </w:r>
-      <w:proofErr w:type="spellEnd"/>
-      <w:r>
-        <w:t>&gt;</w:t>
-      </w:r>
-    </w:p>
-    <w:p>
-      <w:pPr>
-        <w:spacing w:after="0"/>
-      </w:pPr>
-      <w:r>
-        <w:t xml:space="preserve">Contact Info: </w:t>
-      </w:r>
-      <w:r>
-        <w:tab/>
-      </w:r>
-      <w:r>
-        <w:tab/>
-      </w:r>
-      <w:r>
-        <w:t>${</w:t>
-      </w:r>
-      <w:r>
-        <w:t>email</w:t>
-      </w:r>
-      <w:r>
-        <w:t>}</w:t>
-      </w:r>
-      <w:r>
-        <w:t>&lt;phone&gt;</w:t>
-      </w:r>
-      <w:r>
-        <w:t xml:space="preserve">, </w:t>
-      </w:r>
-      <w:r>
-        <w:t>${</w:t>
-      </w:r>
-      <w:r>
-        <w:t>phone</w:t>
-      </w:r>
-      <w:r>
-        <w:t>}</w:t>
-      </w:r>
-      <w:r>
-        <w:t>&lt;/phone&gt;</w:t>
-      </w:r>
-    </w:p>
-    <w:p>
-      <w:pPr>
-        <w:spacing w:after="0"/>
-      </w:pPr>
-      <w:r>
-        <w:t>Office Location:</w:t>
-      </w:r>
-      <w:r>
-        <w:tab/>
-      </w:r>
-      <w:r>
-        <w:tab/>
-      </w:r>
-      <w:r>
-        <w:t>${</w:t>
-      </w:r>
-      <w:proofErr w:type="spellStart"/>
-      <w:r>
-        <w:t>office_location</w:t>
-      </w:r>
-      <w:proofErr w:type="spellEnd"/>
-      <w:r>
-        <w:t>}</w:t>
-      </w:r>
-    </w:p>
-    <w:p>
-      <w:pPr>
-        <w:spacing w:after="0"/>
-      </w:pPr>
-      <w:r>
-        <w:t>Office Hours:</w:t>
-      </w:r>
-      <w:r>
-        <w:tab/>
-      </w:r>
-      <w:r>
-        <w:tab/>
-      </w:r>
-      <w:r>
-        <w:t>${</w:t>
-      </w:r>
-      <w:proofErr w:type="spellStart"/>
-      <w:r>
-        <w:t>office_hours</w:t>
-      </w:r>
-      <w:proofErr w:type="spellEnd"/>
-      <w:r>
-        <w:t>}</w:t>
-      </w:r>
-    </w:p>
-    <w:p>
-      <w:pPr>
-        <w:spacing w:after="0"/>
-      </w:pPr>
-    </w:p>
-    <w:p>
-      <w:pPr>
-        <w:spacing w:after="0"/>
-        <w:rPr>
-          <w:lang w:val="fr-FR"/>
-        </w:rPr>
-      </w:pPr>
-      <w:proofErr w:type="gramStart"/>
-      <w:r>
-        <w:rPr>
-          <w:lang w:val="fr-FR"/>
-        </w:rPr>
-        <w:t>${</w:t>
-      </w:r>
-      <w:r>
-        <w:rPr>
-          <w:lang w:val="fr-FR"/>
-        </w:rPr>
-        <w:t xml:space="preserve"> </w:t>
-      </w:r>
-      <w:proofErr w:type="spellStart"/>
-      <w:r>
-        <w:rPr>
-          <w:lang w:val="fr-FR"/>
-        </w:rPr>
-        <w:t>additional</w:t>
-      </w:r>
-      <w:proofErr w:type="gramEnd"/>
-      <w:r>
-        <w:rPr>
-          <w:lang w:val="fr-FR"/>
-        </w:rPr>
-        <w:t>_sections_syllabus_json</w:t>
-      </w:r>
-      <w:proofErr w:type="spellEnd"/>
-      <w:r>
-        <w:rPr>
-          <w:lang w:val="fr-FR"/>
-        </w:rPr>
-        <w:t>}</w:t>
-      </w:r>
-    </w:p>
-    <w:p>
-      <w:pPr>
-        <w:spacing w:after="0"/>
-        <w:rPr>
-          <w:lang w:val="fr-FR"/>
-        </w:rPr>
-      </w:pPr>
-    </w:p>
-    <w:p>
-      <w:pPr>
-        <w:spacing w:after="0"/>
-        <w:rPr>
-          <w:rFonts w:asciiTheme="majorHAnsi" w:eastAsiaTheme="majorEastAsia" w:hAnsiTheme="majorHAnsi" w:cstheme="majorBidi"/>
-          <w:b/>
-          <w:bCs/>
-          <w:color w:val="1F3864" w:themeColor="accent1" w:themeShade="80"/>
-          <w:sz w:val="26"/>
-          <w:szCs w:val="26"/>
-          <w:lang w:val="fr-FR"/>
-        </w:rPr>
-      </w:pPr>
-      <w:r>
-        <w:rPr>
-          <w:rFonts w:asciiTheme="majorHAnsi" w:eastAsiaTheme="majorEastAsia" w:hAnsiTheme="majorHAnsi" w:cstheme="majorBidi"/>
-          <w:b/>
-          <w:bCs/>
-          <w:color w:val="1F3864" w:themeColor="accent1" w:themeShade="80"/>
-          <w:sz w:val="26"/>
-          <w:szCs w:val="26"/>
-          <w:lang w:val="fr-FR"/>
-        </w:rPr>
-        <w:t>Course Description</w:t>
-      </w:r>
-    </w:p>
-    <w:p>
-      <w:pPr>
-        <w:spacing w:after="0"/>
-        <w:rPr>
-          <w:lang w:val="fr-FR"/>
-        </w:rPr>
-      </w:pPr>
-    </w:p>
-    <w:p>
-      <w:pPr>
-        <w:spacing w:after="0"/>
-      </w:pPr>
-      <w:r>
-        <w:t>${</w:t>
-      </w:r>
-      <w:proofErr w:type="spellStart"/>
       <w:r>
         <w:t>course_description</w:t>
       </w:r>
-      <w:proofErr w:type="spellEnd"/>
       <w:r>
         <w:t>}</w:t>
       </w:r>
@@ -1196,7 +1171,7 @@
               </wp:anchor>
             </w:drawing>
           </mc:Choice>
-          <mc:Fallback xmlns:a="http://schemas.openxmlformats.org/drawingml/2006/main" xmlns:pic="http://schemas.openxmlformats.org/drawingml/2006/picture" xmlns:a14="http://schemas.microsoft.com/office/drawing/2010/main">
+          <mc:Fallback xmlns:a14="http://schemas.microsoft.com/office/drawing/2010/main" xmlns:pic="http://schemas.openxmlformats.org/drawingml/2006/picture" xmlns:a="http://schemas.openxmlformats.org/drawingml/2006/main">
             <w:pict w14:anchorId="474F2540">
               <v:group id="Group 9" style="position:absolute;margin-left:414.8pt;margin-top:12.15pt;width:52.55pt;height:282.7pt;z-index:251660288" coordsize="6673,35901" o:spid="_x0000_s1026" w14:anchorId="122F3E6F" o:gfxdata="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">
                 <v:shapetype id="_x0000_t75" coordsize="21600,21600" filled="f" stroked="f" o:spt="75" o:preferrelative="t" path="m@4@5l@4@11@9@11@9@5xe">
@@ -1253,8 +1228,17 @@
     </w:p>
     <w:p>
       <w:pPr>
-        <w:spacing w:after="0"/>
-      </w:pPr>
+        <w:pStyle w:val="Heading3"/>
+        <w:rPr>
+          <w:color w:val="1F3864" w:themeColor="accent1" w:themeShade="80"/>
+        </w:rPr>
+      </w:pPr>
+      <w:r>
+        <w:rPr>
+          <w:color w:val="1F3864" w:themeColor="accent1" w:themeShade="80"/>
+        </w:rPr>
+        <w:t>Upon completing this course, students will be able to:</w:t>
+      </w:r>
     </w:p>
     <w:p>
       <w:pPr>
@@ -1263,166 +1247,7 @@
       <w:r>
         <w:t>${</w:t>
       </w:r>
-      <w:proofErr w:type="spellStart"/>
-      <w:r>
-        <w:t>learning_outcomes</w:t>
-      </w:r>
-      <w:proofErr w:type="spellEnd"/>
-      <w:r>
-        <w:t>}</w:t>
-      </w:r>
-    </w:p>
-    <w:p>
-      <w:pPr>
-        <w:spacing w:after="0"/>
-      </w:pPr>
-    </w:p>
-    <w:p>
-      <w:pPr>
-        <w:spacing w:after="0"/>
-        <w:rPr>
-          <w:rFonts w:asciiTheme="majorHAnsi" w:eastAsiaTheme="majorEastAsia" w:hAnsiTheme="majorHAnsi" w:cstheme="majorBidi"/>
-          <w:b/>
-          <w:bCs/>
-          <w:color w:val="1F3864" w:themeColor="accent1" w:themeShade="80"/>
-          <w:sz w:val="26"/>
-          <w:szCs w:val="26"/>
-        </w:rPr>
-      </w:pPr>
-      <w:r>
-        <w:rPr>
-          <w:rFonts w:asciiTheme="majorHAnsi" w:eastAsiaTheme="majorEastAsia" w:hAnsiTheme="majorHAnsi" w:cstheme="majorBidi"/>
-          <w:b/>
-          <w:bCs/>
-          <w:color w:val="1F3864" w:themeColor="accent1" w:themeShade="80"/>
-          <w:sz w:val="26"/>
-          <w:szCs w:val="26"/>
-        </w:rPr>
-        <w:t>High Impact Practices</w:t>
-      </w:r>
-    </w:p>
-    <w:p>
-      <w:pPr>
-        <w:spacing w:after="0"/>
-      </w:pPr>
-    </w:p>
-    <w:p>
-      <w:pPr>
-        <w:spacing w:after="0"/>
-      </w:pPr>
-      <w:r>
-        <w:t>$</w:t>
-      </w:r>
-      <w:r>
-        <w:t>{</w:t>
-      </w:r>
-      <w:r>
-        <w:t>hip}</w:t>
-      </w:r>
-    </w:p>
-    <w:p>
-      <w:pPr>
-        <w:spacing w:after="0"/>
-        <w:rPr>
-          <w:rFonts w:asciiTheme="majorHAnsi" w:eastAsiaTheme="majorEastAsia" w:hAnsiTheme="majorHAnsi" w:cstheme="majorBidi"/>
-          <w:b/>
-          <w:bCs/>
-          <w:color w:val="1F3864" w:themeColor="accent1" w:themeShade="80"/>
-          <w:sz w:val="26"/>
-          <w:szCs w:val="26"/>
-        </w:rPr>
-      </w:pPr>
-    </w:p>
-    <w:p>
-      <w:pPr>
-        <w:spacing w:after="0"/>
-        <w:rPr>
-          <w:rFonts w:asciiTheme="majorHAnsi" w:eastAsiaTheme="majorEastAsia" w:hAnsiTheme="majorHAnsi" w:cstheme="majorBidi"/>
-          <w:b/>
-          <w:bCs/>
-          <w:color w:val="1F3864" w:themeColor="accent1" w:themeShade="80"/>
-          <w:sz w:val="26"/>
-          <w:szCs w:val="26"/>
-        </w:rPr>
-      </w:pPr>
-      <w:r>
-        <w:rPr>
-          <w:rFonts w:asciiTheme="majorHAnsi" w:eastAsiaTheme="majorEastAsia" w:hAnsiTheme="majorHAnsi" w:cstheme="majorBidi"/>
-          <w:b/>
-          <w:bCs/>
-          <w:color w:val="1F3864" w:themeColor="accent1" w:themeShade="80"/>
-          <w:sz w:val="26"/>
-          <w:szCs w:val="26"/>
-        </w:rPr>
-        <w:t>Learning Resources</w:t>
-      </w:r>
-    </w:p>
-    <w:p>
-      <w:pPr>
-        <w:spacing w:after="0"/>
-      </w:pPr>
-    </w:p>
-    <w:p>
-      <w:pPr>
-        <w:spacing w:after="0"/>
-      </w:pPr>
-      <w:r>
-        <w:t>${</w:t>
-      </w:r>
-      <w:proofErr w:type="spellStart"/>
-      <w:r>
-        <w:t>course_materials</w:t>
-      </w:r>
-      <w:proofErr w:type="spellEnd"/>
-      <w:r>
-        <w:t>}</w:t>
-      </w:r>
-    </w:p>
-    <w:p>
-      <w:pPr>
-        <w:spacing w:after="0"/>
-      </w:pPr>
-    </w:p>
-    <w:p>
-      <w:pPr>
-        <w:spacing w:after="0"/>
-        <w:rPr>
-          <w:rFonts w:asciiTheme="majorHAnsi" w:eastAsiaTheme="majorEastAsia" w:hAnsiTheme="majorHAnsi" w:cstheme="majorBidi"/>
-          <w:b/>
-          <w:bCs/>
-          <w:color w:val="1F3864" w:themeColor="accent1" w:themeShade="80"/>
-          <w:sz w:val="26"/>
-          <w:szCs w:val="26"/>
-        </w:rPr>
-      </w:pPr>
-      <w:r>
-        <w:rPr>
-          <w:rFonts w:asciiTheme="majorHAnsi" w:eastAsiaTheme="majorEastAsia" w:hAnsiTheme="majorHAnsi" w:cstheme="majorBidi"/>
-          <w:b/>
-          <w:bCs/>
-          <w:color w:val="1F3864" w:themeColor="accent1" w:themeShade="80"/>
-          <w:sz w:val="26"/>
-          <w:szCs w:val="26"/>
-        </w:rPr>
-        <w:t>Assessments</w:t>
-      </w:r>
-    </w:p>
-    <w:p>
-      <w:pPr>
-        <w:spacing w:after="0"/>
-        <w:rPr>
-          <w:rStyle w:val="Heading4Char"/>
-          <w:b/>
-          <w:bCs/>
-          <w:i w:val="0"/>
-          <w:iCs w:val="0"/>
-          <w:color w:val="1F3864" w:themeColor="accent1" w:themeShade="80"/>
-        </w:rPr>
-      </w:pPr>
-    </w:p>
-    <w:p>
-      <w:pPr>
-        <w:spacing w:after="0"/>
+      <w:r>
         <w:rPr>
           <w:rStyle w:val="Heading4Char"/>
           <w:rFonts w:asciiTheme="minorHAnsi" w:hAnsiTheme="minorHAnsi" w:cstheme="minorHAnsi"/>
@@ -1430,7 +1255,8 @@
           <w:iCs w:val="0"/>
           <w:color w:val="auto"/>
         </w:rPr>
-      </w:pPr>
+        <w:t xml:space="preserve"> </w:t>
+      </w:r>
       <w:r>
         <w:rPr>
           <w:rStyle w:val="Heading4Char"/>
@@ -1439,10 +1265,178 @@
           <w:iCs w:val="0"/>
           <w:color w:val="auto"/>
         </w:rPr>
-        <w:t>${</w:t>
-      </w:r>
-      <w:proofErr w:type="spellStart"/>
-      <w:r>
+        <w:t>lo_syllabus_json</w:t>
+      </w:r>
+      <w:r>
+        <w:t xml:space="preserve"> </w:t>
+      </w:r>
+      <w:r>
+        <w:t>}</w:t>
+      </w:r>
+    </w:p>
+    <w:p>
+      <w:pPr>
+        <w:spacing w:after="0"/>
+      </w:pPr>
+    </w:p>
+    <w:p>
+      <w:pPr>
+        <w:spacing w:after="0"/>
+      </w:pPr>
+      <w:r>
+        <w:t>&lt;HIP&gt;</w:t>
+      </w:r>
+    </w:p>
+    <w:p>
+      <w:pPr>
+        <w:spacing w:after="0"/>
+        <w:rPr>
+          <w:rFonts w:asciiTheme="majorHAnsi" w:eastAsiaTheme="majorEastAsia" w:hAnsiTheme="majorHAnsi" w:cstheme="majorBidi"/>
+          <w:b/>
+          <w:bCs/>
+          <w:color w:val="1F3864" w:themeColor="accent1" w:themeShade="80"/>
+          <w:sz w:val="26"/>
+          <w:szCs w:val="26"/>
+        </w:rPr>
+      </w:pPr>
+      <w:r>
+        <w:rPr>
+          <w:rFonts w:asciiTheme="majorHAnsi" w:eastAsiaTheme="majorEastAsia" w:hAnsiTheme="majorHAnsi" w:cstheme="majorBidi"/>
+          <w:b/>
+          <w:bCs/>
+          <w:color w:val="1F3864" w:themeColor="accent1" w:themeShade="80"/>
+          <w:sz w:val="26"/>
+          <w:szCs w:val="26"/>
+        </w:rPr>
+        <w:t>High Impact Practices</w:t>
+      </w:r>
+    </w:p>
+    <w:p>
+      <w:pPr>
+        <w:spacing w:after="0"/>
+      </w:pPr>
+      <w:r>
+        <w:t>$</w:t>
+      </w:r>
+      <w:r>
+        <w:t>{</w:t>
+      </w:r>
+      <w:r>
+        <w:t xml:space="preserve"> </w:t>
+      </w:r>
+      <w:r>
+        <w:t>hip</w:t>
+      </w:r>
+      <w:r>
+        <w:t xml:space="preserve"> </w:t>
+      </w:r>
+      <w:r>
+        <w:t>}</w:t>
+      </w:r>
+    </w:p>
+    <w:p>
+      <w:pPr>
+        <w:spacing w:after="0"/>
+      </w:pPr>
+      <w:r>
+        <w:t>&lt;/HIP&gt;</w:t>
+      </w:r>
+    </w:p>
+    <w:p>
+      <w:pPr>
+        <w:spacing w:after="0"/>
+        <w:rPr>
+          <w:rFonts w:asciiTheme="majorHAnsi" w:eastAsiaTheme="majorEastAsia" w:hAnsiTheme="majorHAnsi" w:cstheme="majorBidi"/>
+          <w:b/>
+          <w:bCs/>
+          <w:color w:val="1F3864" w:themeColor="accent1" w:themeShade="80"/>
+          <w:sz w:val="26"/>
+          <w:szCs w:val="26"/>
+        </w:rPr>
+      </w:pPr>
+    </w:p>
+    <w:p>
+      <w:pPr>
+        <w:spacing w:after="0"/>
+        <w:rPr>
+          <w:rFonts w:asciiTheme="majorHAnsi" w:eastAsiaTheme="majorEastAsia" w:hAnsiTheme="majorHAnsi" w:cstheme="majorBidi"/>
+          <w:b/>
+          <w:bCs/>
+          <w:color w:val="1F3864" w:themeColor="accent1" w:themeShade="80"/>
+          <w:sz w:val="26"/>
+          <w:szCs w:val="26"/>
+        </w:rPr>
+      </w:pPr>
+      <w:r>
+        <w:rPr>
+          <w:rFonts w:asciiTheme="majorHAnsi" w:eastAsiaTheme="majorEastAsia" w:hAnsiTheme="majorHAnsi" w:cstheme="majorBidi"/>
+          <w:b/>
+          <w:bCs/>
+          <w:color w:val="1F3864" w:themeColor="accent1" w:themeShade="80"/>
+          <w:sz w:val="26"/>
+          <w:szCs w:val="26"/>
+        </w:rPr>
+        <w:t>Learning Resources</w:t>
+      </w:r>
+    </w:p>
+    <w:p>
+      <w:pPr>
+        <w:spacing w:after="0"/>
+      </w:pPr>
+    </w:p>
+    <w:p>
+      <w:pPr>
+        <w:spacing w:after="0"/>
+      </w:pPr>
+      <w:r>
+        <w:t>${course_materials}</w:t>
+      </w:r>
+    </w:p>
+    <w:p>
+      <w:pPr>
+        <w:spacing w:after="0"/>
+      </w:pPr>
+    </w:p>
+    <w:p>
+      <w:pPr>
+        <w:spacing w:after="0"/>
+        <w:rPr>
+          <w:rFonts w:asciiTheme="majorHAnsi" w:eastAsiaTheme="majorEastAsia" w:hAnsiTheme="majorHAnsi" w:cstheme="majorBidi"/>
+          <w:b/>
+          <w:bCs/>
+          <w:color w:val="1F3864" w:themeColor="accent1" w:themeShade="80"/>
+          <w:sz w:val="26"/>
+          <w:szCs w:val="26"/>
+        </w:rPr>
+      </w:pPr>
+      <w:r>
+        <w:rPr>
+          <w:rFonts w:asciiTheme="majorHAnsi" w:eastAsiaTheme="majorEastAsia" w:hAnsiTheme="majorHAnsi" w:cstheme="majorBidi"/>
+          <w:b/>
+          <w:bCs/>
+          <w:color w:val="1F3864" w:themeColor="accent1" w:themeShade="80"/>
+          <w:sz w:val="26"/>
+          <w:szCs w:val="26"/>
+        </w:rPr>
+        <w:t>Assessments</w:t>
+      </w:r>
+    </w:p>
+    <w:p>
+      <w:pPr>
+        <w:spacing w:after="0"/>
+        <w:rPr>
+          <w:rStyle w:val="Heading4Char"/>
+          <w:b/>
+          <w:bCs/>
+          <w:i w:val="0"/>
+          <w:iCs w:val="0"/>
+          <w:color w:val="1F3864" w:themeColor="accent1" w:themeShade="80"/>
+        </w:rPr>
+      </w:pPr>
+    </w:p>
+    <w:p>
+      <w:pPr>
+        <w:spacing w:after="0"/>
         <w:rPr>
           <w:rStyle w:val="Heading4Char"/>
           <w:rFonts w:asciiTheme="minorHAnsi" w:hAnsiTheme="minorHAnsi" w:cstheme="minorHAnsi"/>
@@ -1450,9 +1444,7 @@
           <w:iCs w:val="0"/>
           <w:color w:val="auto"/>
         </w:rPr>
-        <w:t>assmt_assignments_syllabus_json</w:t>
-      </w:r>
-      <w:proofErr w:type="spellEnd"/>
+      </w:pPr>
       <w:r>
         <w:rPr>
           <w:rStyle w:val="Heading4Char"/>
@@ -1461,21 +1453,8 @@
           <w:iCs w:val="0"/>
           <w:color w:val="auto"/>
         </w:rPr>
-        <w:t>}</w:t>
-      </w:r>
-    </w:p>
-    <w:p>
-      <w:pPr>
-        <w:spacing w:after="0"/>
-        <w:rPr>
-          <w:rStyle w:val="Heading4Char"/>
-          <w:b/>
-          <w:bCs/>
-          <w:i w:val="0"/>
-          <w:iCs w:val="0"/>
-          <w:color w:val="1F3864" w:themeColor="accent1" w:themeShade="80"/>
-        </w:rPr>
-      </w:pPr>
+        <w:t>${assmt_assignments_syllabus_json}</w:t>
+      </w:r>
     </w:p>
     <w:p>
       <w:pPr>
@@ -1494,21 +1473,8 @@
       <w:pPr>
         <w:spacing w:after="0"/>
       </w:pPr>
-    </w:p>
-    <w:p>
-      <w:pPr>
-        <w:spacing w:after="0"/>
-      </w:pPr>
-      <w:r>
-        <w:t>${</w:t>
-      </w:r>
-      <w:proofErr w:type="spellStart"/>
-      <w:r>
-        <w:t>grade_table_syllabus_list</w:t>
-      </w:r>
-      <w:proofErr w:type="spellEnd"/>
-      <w:r>
-        <w:t>}</w:t>
+      <w:r>
+        <w:t>${grade_table_syllabus_list}</w:t>
       </w:r>
     </w:p>
     <w:p>
@@ -1573,29 +1539,7 @@
           <w:iCs w:val="0"/>
           <w:color w:val="auto"/>
         </w:rPr>
-        <w:t>${</w:t>
-      </w:r>
-      <w:proofErr w:type="spellStart"/>
-      <w:r>
-        <w:rPr>
-          <w:rStyle w:val="Heading4Char"/>
-          <w:rFonts w:asciiTheme="minorHAnsi" w:hAnsiTheme="minorHAnsi" w:cstheme="minorHAnsi"/>
-          <w:i w:val="0"/>
-          <w:iCs w:val="0"/>
-          <w:color w:val="auto"/>
-        </w:rPr>
-        <w:t>grading_policies_syllabus_json</w:t>
-      </w:r>
-      <w:proofErr w:type="spellEnd"/>
-      <w:r>
-        <w:rPr>
-          <w:rStyle w:val="Heading4Char"/>
-          <w:rFonts w:asciiTheme="minorHAnsi" w:hAnsiTheme="minorHAnsi" w:cstheme="minorHAnsi"/>
-          <w:i w:val="0"/>
-          <w:iCs w:val="0"/>
-          <w:color w:val="auto"/>
-        </w:rPr>
-        <w:t>}</w:t>
+        <w:t>${grading_policies_syllabus_json}</w:t>
       </w:r>
     </w:p>
     <w:p>
@@ -1635,31 +1579,9 @@
         <w:t xml:space="preserve"> and Resources</w:t>
       </w:r>
     </w:p>
-    <w:p/>
-    <w:p>
-      <w:r>
-        <w:t>${</w:t>
-      </w:r>
-      <w:proofErr w:type="spellStart"/>
-      <w:r>
-        <w:t>policy_statements</w:t>
-      </w:r>
-      <w:proofErr w:type="spellEnd"/>
-      <w:r>
-        <w:t>}</w:t>
-      </w:r>
-    </w:p>
-    <w:p>
-      <w:r>
-        <w:t>${</w:t>
-      </w:r>
-      <w:proofErr w:type="spellStart"/>
-      <w:r>
-        <w:t>university_resources</w:t>
-      </w:r>
-      <w:proofErr w:type="spellEnd"/>
-      <w:r>
-        <w:t>}</w:t>
+    <w:p>
+      <w:r>
+        <w:t>&lt;policy_statements&gt;&lt;/policy_statements&gt;</w:t>
       </w:r>
     </w:p>
     <w:p>
@@ -1693,27 +1615,28 @@
           <w:sz w:val="26"/>
           <w:szCs w:val="26"/>
         </w:rPr>
+        <w:t xml:space="preserve">Tentative </w:t>
+      </w:r>
+      <w:r>
+        <w:rPr>
+          <w:b/>
+          <w:bCs/>
+          <w:color w:val="1F3864" w:themeColor="accent1" w:themeShade="80"/>
+          <w:sz w:val="26"/>
+          <w:szCs w:val="26"/>
+        </w:rPr>
         <w:t>Course Schedule</w:t>
       </w:r>
     </w:p>
-    <w:p/>
-    <w:p>
-      <w:r>
-        <w:t>${</w:t>
-      </w:r>
-      <w:proofErr w:type="spellStart"/>
-      <w:r>
-        <w:t>course_schedule_</w:t>
+    <w:p>
+      <w:r>
+        <w:t>${course_schedule_</w:t>
       </w:r>
       <w:r>
         <w:t>syllabus_</w:t>
       </w:r>
       <w:r>
-        <w:t>list</w:t>
-      </w:r>
-      <w:proofErr w:type="spellEnd"/>
-      <w:r>
-        <w:t>}</w:t>
+        <w:t>list}</w:t>
       </w:r>
     </w:p>
     <w:p>
@@ -3073,6 +2996,16 @@
 </file>
 
 <file path=customXml/item1.xml><?xml version="1.0" encoding="utf-8"?>
+<p:properties xmlns:p="http://schemas.microsoft.com/office/2006/metadata/properties" xmlns:xsi="http://www.w3.org/2001/XMLSchema-instance" xmlns:pc="http://schemas.microsoft.com/office/infopath/2007/PartnerControls">
+  <documentManagement/>
+</p:properties>
+</file>
+
+<file path=customXml/item2.xml><?xml version="1.0" encoding="utf-8"?>
+<b:Sources xmlns:b="http://schemas.openxmlformats.org/officeDocument/2006/bibliography" xmlns="http://schemas.openxmlformats.org/officeDocument/2006/bibliography" SelectedStyle="\APASixthEditionOfficeOnline.xsl" StyleName="APA" Version="6"/>
+</file>
+
+<file path=customXml/item3.xml><?xml version="1.0" encoding="utf-8"?>
 <ct:contentTypeSchema xmlns:ct="http://schemas.microsoft.com/office/2006/metadata/contentType" xmlns:ma="http://schemas.microsoft.com/office/2006/metadata/properties/metaAttributes" ct:_="" ma:_="" ma:contentTypeName="Document" ma:contentTypeID="0x01010043AC30EE3931924C951949B01581249A" ma:contentTypeVersion="3" ma:contentTypeDescription="Create a new document." ma:contentTypeScope="" ma:versionID="ecba60cf1f3c2b4798aa357a3e04473e">
   <xsd:schema xmlns:xsd="http://www.w3.org/2001/XMLSchema" xmlns:xs="http://www.w3.org/2001/XMLSchema" xmlns:p="http://schemas.microsoft.com/office/2006/metadata/properties" xmlns:ns2="5e46cd92-5281-4aec-af6d-ce68d6323cf6" targetNamespace="http://schemas.microsoft.com/office/2006/metadata/properties" ma:root="true" ma:fieldsID="749246a7d39d1518a48c156f5ef050f5" ns2:_="">
     <xsd:import namespace="5e46cd92-5281-4aec-af6d-ce68d6323cf6"/>
@@ -3210,16 +3143,6 @@
 </ct:contentTypeSchema>
 </file>
 
-<file path=customXml/item2.xml><?xml version="1.0" encoding="utf-8"?>
-<b:Sources xmlns:b="http://schemas.openxmlformats.org/officeDocument/2006/bibliography" xmlns="http://schemas.openxmlformats.org/officeDocument/2006/bibliography" SelectedStyle="\APASixthEditionOfficeOnline.xsl" StyleName="APA" Version="6"/>
-</file>
-
-<file path=customXml/item3.xml><?xml version="1.0" encoding="utf-8"?>
-<p:properties xmlns:p="http://schemas.microsoft.com/office/2006/metadata/properties" xmlns:xsi="http://www.w3.org/2001/XMLSchema-instance" xmlns:pc="http://schemas.microsoft.com/office/infopath/2007/PartnerControls">
-  <documentManagement/>
-</p:properties>
-</file>
-
 <file path=customXml/item4.xml><?xml version="1.0" encoding="utf-8"?>
 <?mso-contentType ?>
 <FormTemplates xmlns="http://schemas.microsoft.com/sharepoint/v3/contenttype/forms">
@@ -3230,6 +3153,23 @@
 </file>
 
 <file path=customXml/itemProps1.xml><?xml version="1.0" encoding="utf-8"?>
+<ds:datastoreItem xmlns:ds="http://schemas.openxmlformats.org/officeDocument/2006/customXml" ds:itemID="{509D1927-145B-4147-AE53-B018C6899FD0}">
+  <ds:schemaRefs>
+    <ds:schemaRef ds:uri="http://schemas.microsoft.com/office/2006/metadata/properties"/>
+    <ds:schemaRef ds:uri="http://schemas.microsoft.com/office/infopath/2007/PartnerControls"/>
+  </ds:schemaRefs>
+</ds:datastoreItem>
+</file>
+
+<file path=customXml/itemProps2.xml><?xml version="1.0" encoding="utf-8"?>
+<ds:datastoreItem xmlns:ds="http://schemas.openxmlformats.org/officeDocument/2006/customXml" ds:itemID="{99DD2AA0-78B3-40EA-8C1D-954E770C8D8A}">
+  <ds:schemaRefs>
+    <ds:schemaRef ds:uri="http://schemas.openxmlformats.org/officeDocument/2006/bibliography"/>
+  </ds:schemaRefs>
+</ds:datastoreItem>
+</file>
+
+<file path=customXml/itemProps3.xml><?xml version="1.0" encoding="utf-8"?>
 <ds:datastoreItem xmlns:ds="http://schemas.openxmlformats.org/officeDocument/2006/customXml" ds:itemID="{D4AD5993-87D2-4E47-8D6E-96B6100FF46D}">
   <ds:schemaRefs>
     <ds:schemaRef ds:uri="http://schemas.microsoft.com/office/2006/metadata/contentType"/>
@@ -3247,23 +3187,6 @@
 </ds:datastoreItem>
 </file>
 
-<file path=customXml/itemProps2.xml><?xml version="1.0" encoding="utf-8"?>
-<ds:datastoreItem xmlns:ds="http://schemas.openxmlformats.org/officeDocument/2006/customXml" ds:itemID="{99DD2AA0-78B3-40EA-8C1D-954E770C8D8A}">
-  <ds:schemaRefs>
-    <ds:schemaRef ds:uri="http://schemas.openxmlformats.org/officeDocument/2006/bibliography"/>
-  </ds:schemaRefs>
-</ds:datastoreItem>
-</file>
-
-<file path=customXml/itemProps3.xml><?xml version="1.0" encoding="utf-8"?>
-<ds:datastoreItem xmlns:ds="http://schemas.openxmlformats.org/officeDocument/2006/customXml" ds:itemID="{509D1927-145B-4147-AE53-B018C6899FD0}">
-  <ds:schemaRefs>
-    <ds:schemaRef ds:uri="http://schemas.microsoft.com/office/2006/metadata/properties"/>
-    <ds:schemaRef ds:uri="http://schemas.microsoft.com/office/infopath/2007/PartnerControls"/>
-  </ds:schemaRefs>
-</ds:datastoreItem>
-</file>
-
 <file path=customXml/itemProps4.xml><?xml version="1.0" encoding="utf-8"?>
 <ds:datastoreItem xmlns:ds="http://schemas.openxmlformats.org/officeDocument/2006/customXml" ds:itemID="{E5876C36-A6F2-4B44-960A-B8B4B435ECCD}">
   <ds:schemaRefs>

</xml_diff>

<commit_message>
Display course materials as numbered list
</commit_message>
<xml_diff>
--- a/backend/docx/SyllabusTemplate.docx
+++ b/backend/docx/SyllabusTemplate.docx
@@ -247,7 +247,7 @@
               </wp:anchor>
             </w:drawing>
           </mc:Choice>
-          <mc:Fallback xmlns:a="http://schemas.openxmlformats.org/drawingml/2006/main" xmlns:pic="http://schemas.openxmlformats.org/drawingml/2006/picture" xmlns:a14="http://schemas.microsoft.com/office/drawing/2010/main">
+          <mc:Fallback xmlns:a14="http://schemas.microsoft.com/office/drawing/2010/main" xmlns:pic="http://schemas.openxmlformats.org/drawingml/2006/picture" xmlns:a="http://schemas.openxmlformats.org/drawingml/2006/main">
             <w:pict w14:anchorId="08122B22">
               <v:line id="Straight Connector 3" style="position:absolute;z-index:251640832;visibility:visible;mso-wrap-style:square;mso-wrap-distance-left:9pt;mso-wrap-distance-top:0;mso-wrap-distance-right:9pt;mso-wrap-distance-bottom:0;mso-position-horizontal:absolute;mso-position-horizontal-relative:text;mso-position-vertical:absolute;mso-position-vertical-relative:text" o:spid="_x0000_s1026" strokecolor="#1f3763 [1604]" strokeweight="1pt" from="104.4pt,-5.4pt" to="105pt,91.8pt" w14:anchorId="328FC97B" o:gfxdata="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">
                 <v:stroke joinstyle="miter"/>
@@ -322,7 +322,7 @@
               </wp:anchor>
             </w:drawing>
           </mc:Choice>
-          <mc:Fallback xmlns:a="http://schemas.openxmlformats.org/drawingml/2006/main" xmlns:pic="http://schemas.openxmlformats.org/drawingml/2006/picture" xmlns:a14="http://schemas.microsoft.com/office/drawing/2010/main">
+          <mc:Fallback xmlns:a14="http://schemas.microsoft.com/office/drawing/2010/main" xmlns:pic="http://schemas.openxmlformats.org/drawingml/2006/picture" xmlns:a="http://schemas.openxmlformats.org/drawingml/2006/main">
             <w:pict w14:anchorId="0F3FCE19">
               <v:line id="Straight Connector 2" style="position:absolute;z-index:251639808;visibility:visible;mso-wrap-style:square;mso-wrap-distance-left:9pt;mso-wrap-distance-top:0;mso-wrap-distance-right:9pt;mso-wrap-distance-bottom:0;mso-position-horizontal:absolute;mso-position-horizontal-relative:text;mso-position-vertical:absolute;mso-position-vertical-relative:text" o:spid="_x0000_s1026" strokecolor="#1f3763 [1604]" strokeweight="1pt" from="0,91.8pt" to="466.8pt,91.8pt" w14:anchorId="7ED6B9A8" o:gfxdata="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">
                 <v:stroke joinstyle="miter"/>
@@ -1245,7 +1245,7 @@
               </wp:anchor>
             </w:drawing>
           </mc:Choice>
-          <mc:Fallback xmlns:a="http://schemas.openxmlformats.org/drawingml/2006/main" xmlns:pic="http://schemas.openxmlformats.org/drawingml/2006/picture" xmlns:a14="http://schemas.microsoft.com/office/drawing/2010/main">
+          <mc:Fallback xmlns:a14="http://schemas.microsoft.com/office/drawing/2010/main" xmlns:pic="http://schemas.openxmlformats.org/drawingml/2006/picture" xmlns:a="http://schemas.openxmlformats.org/drawingml/2006/main">
             <w:pict w14:anchorId="474F2540">
               <v:group id="Group 9" style="position:absolute;margin-left:414.8pt;margin-top:12.15pt;width:52.55pt;height:282.7pt;z-index:251660288" coordsize="6673,35901" o:spid="_x0000_s1026" w14:anchorId="122F3E6F" o:gfxdata="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">
                 <v:shapetype id="_x0000_t75" coordsize="21600,21600" filled="f" stroked="f" o:spt="75" o:preferrelative="t" path="m@4@5l@4@11@9@11@9@5xe">
@@ -1926,6 +1926,24 @@
 <file path=word/numbering.xml><?xml version="1.0" encoding="utf-8"?>
 <w:numbering xmlns:wpc="http://schemas.microsoft.com/office/word/2010/wordprocessingCanvas" xmlns:cx="http://schemas.microsoft.com/office/drawing/2014/chartex" xmlns:cx1="http://schemas.microsoft.com/office/drawing/2015/9/8/chartex" xmlns:cx2="http://schemas.microsoft.com/office/drawing/2015/10/21/chartex" xmlns:cx3="http://schemas.microsoft.com/office/drawing/2016/5/9/chartex" xmlns:cx4="http://schemas.microsoft.com/office/drawing/2016/5/10/chartex" xmlns:cx5="http://schemas.microsoft.com/office/drawing/2016/5/11/chartex" xmlns:cx6="http://schemas.microsoft.com/office/drawing/2016/5/12/chartex" xmlns:cx7="http://schemas.microsoft.com/office/drawing/2016/5/13/chartex" xmlns:cx8="http://schemas.microsoft.com/office/drawing/2016/5/14/chartex" xmlns:mc="http://schemas.openxmlformats.org/markup-compatibility/2006" xmlns:aink="http://schemas.microsoft.com/office/drawing/2016/ink" xmlns:am3d="http://schemas.microsoft.com/office/drawing/2017/model3d" xmlns:o="urn:schemas-microsoft-com:office:office" xmlns:oel="http://schemas.microsoft.com/office/2019/extlst" xmlns:r="http://schemas.openxmlformats.org/officeDocument/2006/relationships" xmlns:m="http://schemas.openxmlformats.org/officeDocument/2006/math" xmlns:v="urn:schemas-microsoft-com:vml" xmlns:wp14="http://schemas.microsoft.com/office/word/2010/wordprocessingDrawing" xmlns:wp="http://schemas.openxmlformats.org/drawingml/2006/wordprocessingDrawing" xmlns:w10="urn:schemas-microsoft-com:office:word" xmlns:w="http://schemas.openxmlformats.org/wordprocessingml/2006/main" xmlns:w14="http://schemas.microsoft.com/office/word/2010/wordml" xmlns:w15="http://schemas.microsoft.com/office/word/2012/wordml" xmlns:w16cex="http://schemas.microsoft.com/office/word/2018/wordml/cex" xmlns:w16cid="http://schemas.microsoft.com/office/word/2016/wordml/cid" xmlns:w16="http://schemas.microsoft.com/office/word/2018/wordml" xmlns:w16sdtdh="http://schemas.microsoft.com/office/word/2020/wordml/sdtdatahash" xmlns:w16se="http://schemas.microsoft.com/office/word/2015/wordml/symex" xmlns:wpg="http://schemas.microsoft.com/office/word/2010/wordprocessingGroup" xmlns:wpi="http://schemas.microsoft.com/office/word/2010/wordprocessingInk" xmlns:wne="http://schemas.microsoft.com/office/word/2006/wordml" xmlns:wps="http://schemas.microsoft.com/office/word/2010/wordprocessingShape" mc:Ignorable="w14 w15 w16se w16cid w16 w16cex w16sdtdh wp14">
   <w:abstractNum w:abstractNumId="0" w15:restartNumberingAfterBreak="0">
+    <w:nsid w:val="FFFFFF88"/>
+    <w:multiLevelType w:val="singleLevel"/>
+    <w:tmpl w:val="B4B04BEC"/>
+    <w:lvl w:ilvl="0">
+      <w:start w:val="1"/>
+      <w:numFmt w:val="decimal"/>
+      <w:pStyle w:val="ListNumber"/>
+      <w:lvlText w:val="%1."/>
+      <w:lvlJc w:val="left"/>
+      <w:pPr>
+        <w:tabs>
+          <w:tab w:val="num" w:pos="360"/>
+        </w:tabs>
+        <w:ind w:left="360" w:hanging="360"/>
+      </w:pPr>
+    </w:lvl>
+  </w:abstractNum>
+  <w:abstractNum w:abstractNumId="1" w15:restartNumberingAfterBreak="0">
     <w:nsid w:val="5ACB5656"/>
     <w:multiLevelType w:val="hybridMultilevel"/>
     <w:tmpl w:val="DF9015E4"/>
@@ -2039,6 +2057,9 @@
     </w:lvl>
   </w:abstractNum>
   <w:num w:numId="1" w16cid:durableId="1489131867">
+    <w:abstractNumId w:val="1"/>
+  </w:num>
+  <w:num w:numId="2" w16cid:durableId="600335465">
     <w:abstractNumId w:val="0"/>
   </w:num>
 </w:numbering>
@@ -2857,6 +2878,30 @@
       <w:szCs w:val="20"/>
     </w:rPr>
   </w:style>
+  <w:style w:type="paragraph" w:customStyle="1" w:styleId="NumberedList">
+    <w:name w:val="Numbered List"/>
+    <w:basedOn w:val="ListNumber"/>
+    <w:next w:val="Default"/>
+    <w:qFormat/>
+    <w:rsid w:val="007B7F8D"/>
+    <w:pPr>
+      <w:spacing w:after="0"/>
+    </w:pPr>
+  </w:style>
+  <w:style w:type="paragraph" w:styleId="ListNumber">
+    <w:name w:val="List Number"/>
+    <w:basedOn w:val="Normal"/>
+    <w:uiPriority w:val="99"/>
+    <w:semiHidden/>
+    <w:unhideWhenUsed/>
+    <w:rsid w:val="007B7F8D"/>
+    <w:pPr>
+      <w:numPr>
+        <w:numId w:val="2"/>
+      </w:numPr>
+      <w:contextualSpacing/>
+    </w:pPr>
+  </w:style>
 </w:styles>
 </file>
 
@@ -3156,25 +3201,6 @@
 </file>
 
 <file path=customXml/item1.xml><?xml version="1.0" encoding="utf-8"?>
-<b:Sources xmlns:b="http://schemas.openxmlformats.org/officeDocument/2006/bibliography" xmlns="http://schemas.openxmlformats.org/officeDocument/2006/bibliography" SelectedStyle="\APASixthEditionOfficeOnline.xsl" StyleName="APA" Version="6"/>
-</file>
-
-<file path=customXml/item2.xml><?xml version="1.0" encoding="utf-8"?>
-<p:properties xmlns:p="http://schemas.microsoft.com/office/2006/metadata/properties" xmlns:xsi="http://www.w3.org/2001/XMLSchema-instance" xmlns:pc="http://schemas.microsoft.com/office/infopath/2007/PartnerControls">
-  <documentManagement/>
-</p:properties>
-</file>
-
-<file path=customXml/item3.xml><?xml version="1.0" encoding="utf-8"?>
-<?mso-contentType ?>
-<FormTemplates xmlns="http://schemas.microsoft.com/sharepoint/v3/contenttype/forms">
-  <Display>DocumentLibraryForm</Display>
-  <Edit>DocumentLibraryForm</Edit>
-  <New>DocumentLibraryForm</New>
-</FormTemplates>
-</file>
-
-<file path=customXml/item4.xml><?xml version="1.0" encoding="utf-8"?>
 <ct:contentTypeSchema xmlns:ct="http://schemas.microsoft.com/office/2006/metadata/contentType" xmlns:ma="http://schemas.microsoft.com/office/2006/metadata/properties/metaAttributes" ct:_="" ma:_="" ma:contentTypeName="Document" ma:contentTypeID="0x01010043AC30EE3931924C951949B01581249A" ma:contentTypeVersion="3" ma:contentTypeDescription="Create a new document." ma:contentTypeScope="" ma:versionID="ecba60cf1f3c2b4798aa357a3e04473e">
   <xsd:schema xmlns:xsd="http://www.w3.org/2001/XMLSchema" xmlns:xs="http://www.w3.org/2001/XMLSchema" xmlns:p="http://schemas.microsoft.com/office/2006/metadata/properties" xmlns:ns2="5e46cd92-5281-4aec-af6d-ce68d6323cf6" targetNamespace="http://schemas.microsoft.com/office/2006/metadata/properties" ma:root="true" ma:fieldsID="749246a7d39d1518a48c156f5ef050f5" ns2:_="">
     <xsd:import namespace="5e46cd92-5281-4aec-af6d-ce68d6323cf6"/>
@@ -3312,32 +3338,26 @@
 </ct:contentTypeSchema>
 </file>
 
-<file path=customXml/itemProps1.xml><?xml version="1.0" encoding="utf-8"?>
-<ds:datastoreItem xmlns:ds="http://schemas.openxmlformats.org/officeDocument/2006/customXml" ds:itemID="{99DD2AA0-78B3-40EA-8C1D-954E770C8D8A}">
-  <ds:schemaRefs>
-    <ds:schemaRef ds:uri="http://schemas.openxmlformats.org/officeDocument/2006/bibliography"/>
-  </ds:schemaRefs>
-</ds:datastoreItem>
+<file path=customXml/item2.xml><?xml version="1.0" encoding="utf-8"?>
+<?mso-contentType ?>
+<FormTemplates xmlns="http://schemas.microsoft.com/sharepoint/v3/contenttype/forms">
+  <Display>DocumentLibraryForm</Display>
+  <Edit>DocumentLibraryForm</Edit>
+  <New>DocumentLibraryForm</New>
+</FormTemplates>
 </file>
 
-<file path=customXml/itemProps2.xml><?xml version="1.0" encoding="utf-8"?>
-<ds:datastoreItem xmlns:ds="http://schemas.openxmlformats.org/officeDocument/2006/customXml" ds:itemID="{509D1927-145B-4147-AE53-B018C6899FD0}">
-  <ds:schemaRefs>
-    <ds:schemaRef ds:uri="http://schemas.microsoft.com/office/2006/metadata/properties"/>
-    <ds:schemaRef ds:uri="http://schemas.microsoft.com/office/infopath/2007/PartnerControls"/>
-  </ds:schemaRefs>
-</ds:datastoreItem>
+<file path=customXml/item3.xml><?xml version="1.0" encoding="utf-8"?>
+<p:properties xmlns:p="http://schemas.microsoft.com/office/2006/metadata/properties" xmlns:xsi="http://www.w3.org/2001/XMLSchema-instance" xmlns:pc="http://schemas.microsoft.com/office/infopath/2007/PartnerControls">
+  <documentManagement/>
+</p:properties>
 </file>
 
-<file path=customXml/itemProps3.xml><?xml version="1.0" encoding="utf-8"?>
-<ds:datastoreItem xmlns:ds="http://schemas.openxmlformats.org/officeDocument/2006/customXml" ds:itemID="{E5876C36-A6F2-4B44-960A-B8B4B435ECCD}">
-  <ds:schemaRefs>
-    <ds:schemaRef ds:uri="http://schemas.microsoft.com/sharepoint/v3/contenttype/forms"/>
-  </ds:schemaRefs>
-</ds:datastoreItem>
+<file path=customXml/item4.xml><?xml version="1.0" encoding="utf-8"?>
+<b:Sources xmlns:b="http://schemas.openxmlformats.org/officeDocument/2006/bibliography" xmlns="http://schemas.openxmlformats.org/officeDocument/2006/bibliography" SelectedStyle="\APASixthEditionOfficeOnline.xsl" StyleName="APA" Version="6"/>
 </file>
 
-<file path=customXml/itemProps4.xml><?xml version="1.0" encoding="utf-8"?>
+<file path=customXml/itemProps1.xml><?xml version="1.0" encoding="utf-8"?>
 <ds:datastoreItem xmlns:ds="http://schemas.openxmlformats.org/officeDocument/2006/customXml" ds:itemID="{D4AD5993-87D2-4E47-8D6E-96B6100FF46D}">
   <ds:schemaRefs>
     <ds:schemaRef ds:uri="http://schemas.microsoft.com/office/2006/metadata/contentType"/>
@@ -3353,4 +3373,29 @@
     <ds:schemaRef ds:uri="http://schemas.microsoft.com/internal/obd"/>
   </ds:schemaRefs>
 </ds:datastoreItem>
+</file>
+
+<file path=customXml/itemProps2.xml><?xml version="1.0" encoding="utf-8"?>
+<ds:datastoreItem xmlns:ds="http://schemas.openxmlformats.org/officeDocument/2006/customXml" ds:itemID="{E5876C36-A6F2-4B44-960A-B8B4B435ECCD}">
+  <ds:schemaRefs>
+    <ds:schemaRef ds:uri="http://schemas.microsoft.com/sharepoint/v3/contenttype/forms"/>
+  </ds:schemaRefs>
+</ds:datastoreItem>
+</file>
+
+<file path=customXml/itemProps3.xml><?xml version="1.0" encoding="utf-8"?>
+<ds:datastoreItem xmlns:ds="http://schemas.openxmlformats.org/officeDocument/2006/customXml" ds:itemID="{509D1927-145B-4147-AE53-B018C6899FD0}">
+  <ds:schemaRefs>
+    <ds:schemaRef ds:uri="http://schemas.microsoft.com/office/2006/metadata/properties"/>
+    <ds:schemaRef ds:uri="http://schemas.microsoft.com/office/infopath/2007/PartnerControls"/>
+  </ds:schemaRefs>
+</ds:datastoreItem>
+</file>
+
+<file path=customXml/itemProps4.xml><?xml version="1.0" encoding="utf-8"?>
+<ds:datastoreItem xmlns:ds="http://schemas.openxmlformats.org/officeDocument/2006/customXml" ds:itemID="{99DD2AA0-78B3-40EA-8C1D-954E770C8D8A}">
+  <ds:schemaRefs>
+    <ds:schemaRef ds:uri="http://schemas.openxmlformats.org/officeDocument/2006/bibliography"/>
+  </ds:schemaRefs>
+</ds:datastoreItem>
 </file>
</xml_diff>

<commit_message>
Reformatting LO, Assessment, markdown   - Reformat Learning Outcomes Content Card   - Reformat Learning Outcomes and Assessment display on syllabus   - Handle markdown in syllabus
</commit_message>
<xml_diff>
--- a/backend/docx/SyllabusTemplate.docx
+++ b/backend/docx/SyllabusTemplate.docx
@@ -351,7 +351,6 @@
         </w:rPr>
         <w:t>${</w:t>
       </w:r>
-      <w:proofErr w:type="spellStart"/>
       <w:r>
         <w:rPr>
           <w:b/>
@@ -362,7 +361,6 @@
         </w:rPr>
         <w:t>subj_code</w:t>
       </w:r>
-      <w:proofErr w:type="spellEnd"/>
       <w:r>
         <w:rPr>
           <w:b/>
@@ -403,7 +401,6 @@
         </w:rPr>
         <w:t>{</w:t>
       </w:r>
-      <w:proofErr w:type="spellStart"/>
       <w:r>
         <w:rPr>
           <w:b/>
@@ -444,7 +441,6 @@
         </w:rPr>
         <w:t>ber</w:t>
       </w:r>
-      <w:proofErr w:type="spellEnd"/>
       <w:r>
         <w:rPr>
           <w:b/>
@@ -495,7 +491,6 @@
         </w:rPr>
         <w:t>{</w:t>
       </w:r>
-      <w:proofErr w:type="spellStart"/>
       <w:r>
         <w:rPr>
           <w:b/>
@@ -506,7 +501,6 @@
         </w:rPr>
         <w:t>course_title</w:t>
       </w:r>
-      <w:proofErr w:type="spellEnd"/>
       <w:r>
         <w:rPr>
           <w:b/>
@@ -672,14 +666,6 @@
       </w:r>
     </w:p>
     <w:p/>
-    <w:p>
-      <w:pPr>
-        <w:pStyle w:val="Heading2"/>
-        <w:rPr>
-          <w:color w:val="1F3864" w:themeColor="accent1" w:themeShade="80"/>
-        </w:rPr>
-      </w:pPr>
-    </w:p>
     <w:p>
       <w:pPr>
         <w:pStyle w:val="Heading2"/>
@@ -690,6 +676,17 @@
           <w:color w:val="1F3864" w:themeColor="accent1" w:themeShade="80"/>
         </w:rPr>
       </w:pPr>
+    </w:p>
+    <w:p>
+      <w:pPr>
+        <w:pStyle w:val="Heading2"/>
+        <w:spacing w:before="0"/>
+        <w:rPr>
+          <w:b/>
+          <w:bCs/>
+          <w:color w:val="1F3864" w:themeColor="accent1" w:themeShade="80"/>
+        </w:rPr>
+      </w:pPr>
       <w:r>
         <w:rPr>
           <w:b/>
@@ -734,11 +731,9 @@
       <w:r>
         <w:t>${</w:t>
       </w:r>
-      <w:proofErr w:type="spellStart"/>
       <w:r>
         <w:t>instructor_name</w:t>
       </w:r>
-      <w:proofErr w:type="spellEnd"/>
       <w:r>
         <w:t>}</w:t>
       </w:r>
@@ -754,11 +749,9 @@
       <w:r>
         <w:t>{</w:t>
       </w:r>
-      <w:proofErr w:type="spellStart"/>
       <w:r>
         <w:t>instructor_title</w:t>
       </w:r>
-      <w:proofErr w:type="spellEnd"/>
       <w:r>
         <w:t>}</w:t>
       </w:r>
@@ -783,11 +776,9 @@
       <w:r>
         <w:t>{</w:t>
       </w:r>
-      <w:proofErr w:type="spellStart"/>
       <w:r>
         <w:t>instructor_pronouns</w:t>
       </w:r>
-      <w:proofErr w:type="spellEnd"/>
       <w:r>
         <w:t>}</w:t>
       </w:r>
@@ -864,11 +855,9 @@
       <w:r>
         <w:t>${</w:t>
       </w:r>
-      <w:proofErr w:type="spellStart"/>
       <w:r>
         <w:t>office_location</w:t>
       </w:r>
-      <w:proofErr w:type="spellEnd"/>
       <w:r>
         <w:t>}</w:t>
       </w:r>
@@ -889,11 +878,9 @@
       <w:r>
         <w:t>${</w:t>
       </w:r>
-      <w:proofErr w:type="spellStart"/>
       <w:r>
         <w:t>office_hours</w:t>
       </w:r>
-      <w:proofErr w:type="spellEnd"/>
       <w:r>
         <w:t>}</w:t>
       </w:r>
@@ -908,133 +895,99 @@
         <w:spacing w:after="0"/>
       </w:pPr>
       <w:r>
-        <w:t>&lt;</w:t>
-      </w:r>
-      <w:proofErr w:type="spellStart"/>
-      <w:r>
+        <w:t>&lt;instructor_additional_information&gt;</w:t>
+      </w:r>
+    </w:p>
+    <w:p>
+      <w:pPr>
+        <w:spacing w:after="0"/>
+        <w:rPr>
+          <w:lang w:val="fr-FR"/>
+        </w:rPr>
+      </w:pPr>
+      <w:r>
+        <w:rPr>
+          <w:lang w:val="fr-FR"/>
+        </w:rPr>
+        <w:t>${</w:t>
+      </w:r>
+      <w:r>
+        <w:rPr>
+          <w:lang w:val="fr-FR"/>
+        </w:rPr>
+        <w:t xml:space="preserve"> </w:t>
+      </w:r>
+      <w:r>
+        <w:rPr>
+          <w:lang w:val="fr-FR"/>
+        </w:rPr>
         <w:t>instructor_additional_information</w:t>
       </w:r>
-      <w:proofErr w:type="spellEnd"/>
-      <w:r>
-        <w:t>&gt;</w:t>
-      </w:r>
-    </w:p>
-    <w:p>
-      <w:pPr>
-        <w:spacing w:after="0"/>
+      <w:r>
         <w:rPr>
           <w:lang w:val="fr-FR"/>
         </w:rPr>
-      </w:pPr>
-      <w:proofErr w:type="gramStart"/>
-      <w:r>
+        <w:t>}</w:t>
+      </w:r>
+    </w:p>
+    <w:p>
+      <w:pPr>
+        <w:spacing w:after="0"/>
         <w:rPr>
           <w:lang w:val="fr-FR"/>
         </w:rPr>
+      </w:pPr>
+      <w:r>
+        <w:rPr>
+          <w:lang w:val="fr-FR"/>
+        </w:rPr>
+        <w:t>&lt;/instructor_additional_information&gt;</w:t>
+      </w:r>
+    </w:p>
+    <w:p>
+      <w:pPr>
+        <w:spacing w:after="0"/>
+        <w:rPr>
+          <w:lang w:val="fr-FR"/>
+        </w:rPr>
+      </w:pPr>
+    </w:p>
+    <w:p>
+      <w:pPr>
+        <w:spacing w:after="0"/>
+        <w:rPr>
+          <w:rFonts w:asciiTheme="majorHAnsi" w:eastAsiaTheme="majorEastAsia" w:hAnsiTheme="majorHAnsi" w:cstheme="majorBidi"/>
+          <w:b/>
+          <w:bCs/>
+          <w:color w:val="1F3864" w:themeColor="accent1" w:themeShade="80"/>
+          <w:sz w:val="26"/>
+          <w:szCs w:val="26"/>
+          <w:lang w:val="fr-FR"/>
+        </w:rPr>
+      </w:pPr>
+      <w:r>
+        <w:rPr>
+          <w:rFonts w:asciiTheme="majorHAnsi" w:eastAsiaTheme="majorEastAsia" w:hAnsiTheme="majorHAnsi" w:cstheme="majorBidi"/>
+          <w:b/>
+          <w:bCs/>
+          <w:color w:val="1F3864" w:themeColor="accent1" w:themeShade="80"/>
+          <w:sz w:val="26"/>
+          <w:szCs w:val="26"/>
+          <w:lang w:val="fr-FR"/>
+        </w:rPr>
+        <w:t>Course Description</w:t>
+      </w:r>
+    </w:p>
+    <w:p>
+      <w:pPr>
+        <w:spacing w:after="0"/>
+      </w:pPr>
+      <w:r>
         <w:t>${</w:t>
       </w:r>
       <w:r>
-        <w:rPr>
-          <w:lang w:val="fr-FR"/>
-        </w:rPr>
-        <w:t xml:space="preserve"> </w:t>
-      </w:r>
-      <w:proofErr w:type="spellStart"/>
-      <w:r>
-        <w:rPr>
-          <w:lang w:val="fr-FR"/>
-        </w:rPr>
-        <w:t>instructor</w:t>
-      </w:r>
-      <w:proofErr w:type="gramEnd"/>
-      <w:r>
-        <w:rPr>
-          <w:lang w:val="fr-FR"/>
-        </w:rPr>
-        <w:t>_additional_information</w:t>
-      </w:r>
-      <w:proofErr w:type="spellEnd"/>
-      <w:r>
-        <w:rPr>
-          <w:lang w:val="fr-FR"/>
-        </w:rPr>
-        <w:t>}</w:t>
-      </w:r>
-    </w:p>
-    <w:p>
-      <w:pPr>
-        <w:spacing w:after="0"/>
-        <w:rPr>
-          <w:lang w:val="fr-FR"/>
-        </w:rPr>
-      </w:pPr>
-      <w:r>
-        <w:rPr>
-          <w:lang w:val="fr-FR"/>
-        </w:rPr>
-        <w:t>&lt;/</w:t>
-      </w:r>
-      <w:proofErr w:type="spellStart"/>
-      <w:r>
-        <w:rPr>
-          <w:lang w:val="fr-FR"/>
-        </w:rPr>
-        <w:t>instructor_additional_information</w:t>
-      </w:r>
-      <w:proofErr w:type="spellEnd"/>
-      <w:r>
-        <w:rPr>
-          <w:lang w:val="fr-FR"/>
-        </w:rPr>
-        <w:t>&gt;</w:t>
-      </w:r>
-    </w:p>
-    <w:p>
-      <w:pPr>
-        <w:spacing w:after="0"/>
-        <w:rPr>
-          <w:lang w:val="fr-FR"/>
-        </w:rPr>
-      </w:pPr>
-    </w:p>
-    <w:p>
-      <w:pPr>
-        <w:spacing w:after="0"/>
-        <w:rPr>
-          <w:rFonts w:asciiTheme="majorHAnsi" w:eastAsiaTheme="majorEastAsia" w:hAnsiTheme="majorHAnsi" w:cstheme="majorBidi"/>
-          <w:b/>
-          <w:bCs/>
-          <w:color w:val="1F3864" w:themeColor="accent1" w:themeShade="80"/>
-          <w:sz w:val="26"/>
-          <w:szCs w:val="26"/>
-          <w:lang w:val="fr-FR"/>
-        </w:rPr>
-      </w:pPr>
-      <w:r>
-        <w:rPr>
-          <w:rFonts w:asciiTheme="majorHAnsi" w:eastAsiaTheme="majorEastAsia" w:hAnsiTheme="majorHAnsi" w:cstheme="majorBidi"/>
-          <w:b/>
-          <w:bCs/>
-          <w:color w:val="1F3864" w:themeColor="accent1" w:themeShade="80"/>
-          <w:sz w:val="26"/>
-          <w:szCs w:val="26"/>
-          <w:lang w:val="fr-FR"/>
-        </w:rPr>
-        <w:t>Course Description</w:t>
-      </w:r>
-    </w:p>
-    <w:p>
-      <w:pPr>
-        <w:spacing w:after="0"/>
-      </w:pPr>
-      <w:r>
-        <w:t>${</w:t>
-      </w:r>
-      <w:proofErr w:type="spellStart"/>
-      <w:r>
         <w:t>course_description</w:t>
       </w:r>
-      <w:proofErr w:type="spellEnd"/>
       <w:r>
         <w:t>}</w:t>
       </w:r>
@@ -1331,7 +1284,6 @@
         </w:rPr>
         <w:t xml:space="preserve"> </w:t>
       </w:r>
-      <w:proofErr w:type="spellStart"/>
       <w:r>
         <w:rPr>
           <w:rStyle w:val="Heading4Char"/>
@@ -1342,7 +1294,6 @@
         </w:rPr>
         <w:t>lo_syllabus_json</w:t>
       </w:r>
-      <w:proofErr w:type="spellEnd"/>
       <w:r>
         <w:t xml:space="preserve"> </w:t>
       </w:r>
@@ -1465,16 +1416,13 @@
         <w:spacing w:after="0"/>
       </w:pPr>
       <w:r>
-        <w:t>${</w:t>
-      </w:r>
-      <w:proofErr w:type="spellStart"/>
-      <w:r>
-        <w:t>course_materials</w:t>
-      </w:r>
-      <w:proofErr w:type="spellEnd"/>
-      <w:r>
-        <w:t>}</w:t>
-      </w:r>
+        <w:t>${course_materials}</w:t>
+      </w:r>
+    </w:p>
+    <w:p>
+      <w:pPr>
+        <w:spacing w:after="0"/>
+      </w:pPr>
     </w:p>
     <w:p>
       <w:pPr>
@@ -1503,6 +1451,27 @@
           <w:szCs w:val="26"/>
         </w:rPr>
         <w:t>Assessments</w:t>
+      </w:r>
+    </w:p>
+    <w:p>
+      <w:pPr>
+        <w:spacing w:after="0"/>
+        <w:rPr>
+          <w:rStyle w:val="Heading4Char"/>
+          <w:b/>
+          <w:bCs/>
+          <w:i w:val="0"/>
+          <w:iCs w:val="0"/>
+          <w:color w:val="1F3864" w:themeColor="accent1" w:themeShade="80"/>
+        </w:rPr>
+      </w:pPr>
+    </w:p>
+    <w:p>
+      <w:pPr>
+        <w:spacing w:after="0"/>
+      </w:pPr>
+      <w:r>
+        <w:t>The final course grade will be calculated using the following assessments:</w:t>
       </w:r>
     </w:p>
     <w:p>
@@ -1537,10 +1506,17 @@
           <w:iCs w:val="0"/>
           <w:color w:val="auto"/>
         </w:rPr>
-        <w:t>${</w:t>
-      </w:r>
-      <w:proofErr w:type="spellStart"/>
-      <w:r>
+        <w:t>${assmt_assignments_syllabus_json}</w:t>
+      </w:r>
+    </w:p>
+    <w:p>
+      <w:pPr>
+        <w:spacing w:after="0"/>
+      </w:pPr>
+    </w:p>
+    <w:p>
+      <w:pPr>
+        <w:spacing w:after="0"/>
         <w:rPr>
           <w:rStyle w:val="Heading4Char"/>
           <w:rFonts w:asciiTheme="minorHAnsi" w:hAnsiTheme="minorHAnsi" w:cstheme="minorHAnsi"/>
@@ -1548,9 +1524,7 @@
           <w:iCs w:val="0"/>
           <w:color w:val="auto"/>
         </w:rPr>
-        <w:t>assmt_assignments_syllabus_json</w:t>
-      </w:r>
-      <w:proofErr w:type="spellEnd"/>
+      </w:pPr>
       <w:r>
         <w:rPr>
           <w:rStyle w:val="Heading4Char"/>
@@ -1559,7 +1533,7 @@
           <w:iCs w:val="0"/>
           <w:color w:val="auto"/>
         </w:rPr>
-        <w:t>}</w:t>
+        <w:t>${assmt_assignments_syllabus_json}</w:t>
       </w:r>
     </w:p>
     <w:p>
@@ -1580,21 +1554,8 @@
         <w:spacing w:after="0"/>
       </w:pPr>
       <w:r>
-        <w:t>${</w:t>
-      </w:r>
-      <w:proofErr w:type="spellStart"/>
-      <w:r>
-        <w:t>grade_table_syllabus_list</w:t>
-      </w:r>
-      <w:proofErr w:type="spellEnd"/>
-      <w:r>
-        <w:t>}</w:t>
-      </w:r>
-    </w:p>
-    <w:p>
-      <w:pPr>
-        <w:spacing w:after="0"/>
-      </w:pPr>
+        <w:t>${grade_table_syllabus_list}</w:t>
+      </w:r>
     </w:p>
     <w:p>
       <w:pPr>
@@ -1653,29 +1614,7 @@
           <w:iCs w:val="0"/>
           <w:color w:val="auto"/>
         </w:rPr>
-        <w:t>${</w:t>
-      </w:r>
-      <w:proofErr w:type="spellStart"/>
-      <w:r>
-        <w:rPr>
-          <w:rStyle w:val="Heading4Char"/>
-          <w:rFonts w:asciiTheme="minorHAnsi" w:hAnsiTheme="minorHAnsi" w:cstheme="minorHAnsi"/>
-          <w:i w:val="0"/>
-          <w:iCs w:val="0"/>
-          <w:color w:val="auto"/>
-        </w:rPr>
-        <w:t>grading_policies_syllabus_json</w:t>
-      </w:r>
-      <w:proofErr w:type="spellEnd"/>
-      <w:r>
-        <w:rPr>
-          <w:rStyle w:val="Heading4Char"/>
-          <w:rFonts w:asciiTheme="minorHAnsi" w:hAnsiTheme="minorHAnsi" w:cstheme="minorHAnsi"/>
-          <w:i w:val="0"/>
-          <w:iCs w:val="0"/>
-          <w:color w:val="auto"/>
-        </w:rPr>
-        <w:t>}</w:t>
+        <w:t>${grading_policies_syllabus_json}</w:t>
       </w:r>
     </w:p>
     <w:p>
@@ -1717,23 +1656,7 @@
     </w:p>
     <w:p>
       <w:r>
-        <w:t>&lt;</w:t>
-      </w:r>
-      <w:proofErr w:type="spellStart"/>
-      <w:r>
-        <w:t>policy_statements</w:t>
-      </w:r>
-      <w:proofErr w:type="spellEnd"/>
-      <w:r>
-        <w:t>&gt;&lt;/</w:t>
-      </w:r>
-      <w:proofErr w:type="spellStart"/>
-      <w:r>
-        <w:t>policy_statements</w:t>
-      </w:r>
-      <w:proofErr w:type="spellEnd"/>
-      <w:r>
-        <w:t>&gt;</w:t>
+        <w:t>&lt;policy_statements&gt;&lt;/policy_statements&gt;</w:t>
       </w:r>
     </w:p>
     <w:p>
@@ -1782,21 +1705,13 @@
     </w:p>
     <w:p>
       <w:r>
-        <w:t>${</w:t>
-      </w:r>
-      <w:proofErr w:type="spellStart"/>
-      <w:r>
-        <w:t>course_schedule_</w:t>
+        <w:t>${course_schedule_</w:t>
       </w:r>
       <w:r>
         <w:t>syllabus_</w:t>
       </w:r>
       <w:r>
-        <w:t>list</w:t>
-      </w:r>
-      <w:proofErr w:type="spellEnd"/>
-      <w:r>
-        <w:t>}</w:t>
+        <w:t>list}</w:t>
       </w:r>
     </w:p>
     <w:p>
@@ -1831,6 +1746,7 @@
         <w:separator/>
       </w:r>
     </w:p>
+    <w:p/>
   </w:endnote>
   <w:endnote w:type="continuationSeparator" w:id="0">
     <w:p>
@@ -1841,6 +1757,7 @@
         <w:continuationSeparator/>
       </w:r>
     </w:p>
+    <w:p/>
   </w:endnote>
 </w:endnotes>
 </file>
@@ -1895,6 +1812,7 @@
       <w:pStyle w:val="Footer"/>
     </w:pPr>
   </w:p>
+  <w:p/>
 </w:ftr>
 </file>
 
@@ -1909,6 +1827,7 @@
         <w:separator/>
       </w:r>
     </w:p>
+    <w:p/>
   </w:footnote>
   <w:footnote w:type="continuationSeparator" w:id="0">
     <w:p>
@@ -1919,6 +1838,7 @@
         <w:continuationSeparator/>
       </w:r>
     </w:p>
+    <w:p/>
   </w:footnote>
 </w:footnotes>
 </file>
@@ -1928,7 +1848,7 @@
   <w:abstractNum w:abstractNumId="0" w15:restartNumberingAfterBreak="0">
     <w:nsid w:val="FFFFFF88"/>
     <w:multiLevelType w:val="singleLevel"/>
-    <w:tmpl w:val="B4B04BEC"/>
+    <w:tmpl w:val="805A9E74"/>
     <w:lvl w:ilvl="0">
       <w:start w:val="1"/>
       <w:numFmt w:val="decimal"/>
@@ -1944,12 +1864,34 @@
     </w:lvl>
   </w:abstractNum>
   <w:abstractNum w:abstractNumId="1" w15:restartNumberingAfterBreak="0">
+    <w:nsid w:val="FFFFFF89"/>
+    <w:multiLevelType w:val="singleLevel"/>
+    <w:tmpl w:val="FC82B1FE"/>
+    <w:lvl w:ilvl="0">
+      <w:start w:val="1"/>
+      <w:numFmt w:val="bullet"/>
+      <w:pStyle w:val="ListBullet"/>
+      <w:lvlText w:val=""/>
+      <w:lvlJc w:val="left"/>
+      <w:pPr>
+        <w:tabs>
+          <w:tab w:val="num" w:pos="360"/>
+        </w:tabs>
+        <w:ind w:left="360" w:hanging="360"/>
+      </w:pPr>
+      <w:rPr>
+        <w:rFonts w:ascii="Symbol" w:hAnsi="Symbol" w:hint="default"/>
+      </w:rPr>
+    </w:lvl>
+  </w:abstractNum>
+  <w:abstractNum w:abstractNumId="2" w15:restartNumberingAfterBreak="0">
     <w:nsid w:val="5ACB5656"/>
     <w:multiLevelType w:val="hybridMultilevel"/>
-    <w:tmpl w:val="DF9015E4"/>
-    <w:lvl w:ilvl="0" w:tplc="04090001">
+    <w:tmpl w:val="BA527AE2"/>
+    <w:lvl w:ilvl="0" w:tplc="C506ECDA">
       <w:start w:val="1"/>
       <w:numFmt w:val="bullet"/>
+      <w:pStyle w:val="BulletList"/>
       <w:lvlText w:val=""/>
       <w:lvlJc w:val="left"/>
       <w:pPr>
@@ -2056,11 +1998,103 @@
       </w:rPr>
     </w:lvl>
   </w:abstractNum>
+  <w:abstractNum w:abstractNumId="3" w15:restartNumberingAfterBreak="0">
+    <w:nsid w:val="64183B12"/>
+    <w:multiLevelType w:val="multilevel"/>
+    <w:tmpl w:val="0409001F"/>
+    <w:lvl w:ilvl="0">
+      <w:start w:val="1"/>
+      <w:numFmt w:val="decimal"/>
+      <w:lvlText w:val="%1."/>
+      <w:lvlJc w:val="left"/>
+      <w:pPr>
+        <w:ind w:left="360" w:hanging="360"/>
+      </w:pPr>
+    </w:lvl>
+    <w:lvl w:ilvl="1">
+      <w:start w:val="1"/>
+      <w:numFmt w:val="decimal"/>
+      <w:lvlText w:val="%1.%2."/>
+      <w:lvlJc w:val="left"/>
+      <w:pPr>
+        <w:ind w:left="792" w:hanging="432"/>
+      </w:pPr>
+    </w:lvl>
+    <w:lvl w:ilvl="2">
+      <w:start w:val="1"/>
+      <w:numFmt w:val="decimal"/>
+      <w:lvlText w:val="%1.%2.%3."/>
+      <w:lvlJc w:val="left"/>
+      <w:pPr>
+        <w:ind w:left="1224" w:hanging="504"/>
+      </w:pPr>
+    </w:lvl>
+    <w:lvl w:ilvl="3">
+      <w:start w:val="1"/>
+      <w:numFmt w:val="decimal"/>
+      <w:lvlText w:val="%1.%2.%3.%4."/>
+      <w:lvlJc w:val="left"/>
+      <w:pPr>
+        <w:ind w:left="1728" w:hanging="648"/>
+      </w:pPr>
+    </w:lvl>
+    <w:lvl w:ilvl="4">
+      <w:start w:val="1"/>
+      <w:numFmt w:val="decimal"/>
+      <w:lvlText w:val="%1.%2.%3.%4.%5."/>
+      <w:lvlJc w:val="left"/>
+      <w:pPr>
+        <w:ind w:left="2232" w:hanging="792"/>
+      </w:pPr>
+    </w:lvl>
+    <w:lvl w:ilvl="5">
+      <w:start w:val="1"/>
+      <w:numFmt w:val="decimal"/>
+      <w:lvlText w:val="%1.%2.%3.%4.%5.%6."/>
+      <w:lvlJc w:val="left"/>
+      <w:pPr>
+        <w:ind w:left="2736" w:hanging="936"/>
+      </w:pPr>
+    </w:lvl>
+    <w:lvl w:ilvl="6">
+      <w:start w:val="1"/>
+      <w:numFmt w:val="decimal"/>
+      <w:lvlText w:val="%1.%2.%3.%4.%5.%6.%7."/>
+      <w:lvlJc w:val="left"/>
+      <w:pPr>
+        <w:ind w:left="3240" w:hanging="1080"/>
+      </w:pPr>
+    </w:lvl>
+    <w:lvl w:ilvl="7">
+      <w:start w:val="1"/>
+      <w:numFmt w:val="decimal"/>
+      <w:lvlText w:val="%1.%2.%3.%4.%5.%6.%7.%8."/>
+      <w:lvlJc w:val="left"/>
+      <w:pPr>
+        <w:ind w:left="3744" w:hanging="1224"/>
+      </w:pPr>
+    </w:lvl>
+    <w:lvl w:ilvl="8">
+      <w:start w:val="1"/>
+      <w:numFmt w:val="decimal"/>
+      <w:lvlText w:val="%1.%2.%3.%4.%5.%6.%7.%8.%9."/>
+      <w:lvlJc w:val="left"/>
+      <w:pPr>
+        <w:ind w:left="4320" w:hanging="1440"/>
+      </w:pPr>
+    </w:lvl>
+  </w:abstractNum>
   <w:num w:numId="1" w16cid:durableId="1489131867">
-    <w:abstractNumId w:val="1"/>
+    <w:abstractNumId w:val="2"/>
   </w:num>
   <w:num w:numId="2" w16cid:durableId="600335465">
     <w:abstractNumId w:val="0"/>
+  </w:num>
+  <w:num w:numId="3" w16cid:durableId="1628462195">
+    <w:abstractNumId w:val="1"/>
+  </w:num>
+  <w:num w:numId="4" w16cid:durableId="202060863">
+    <w:abstractNumId w:val="3"/>
   </w:num>
 </w:numbering>
 </file>
@@ -2902,6 +2936,67 @@
       <w:contextualSpacing/>
     </w:pPr>
   </w:style>
+  <w:style w:type="paragraph" w:styleId="ListBullet">
+    <w:name w:val="List Bullet"/>
+    <w:basedOn w:val="Normal"/>
+    <w:link w:val="ListBulletChar"/>
+    <w:uiPriority w:val="99"/>
+    <w:semiHidden/>
+    <w:unhideWhenUsed/>
+    <w:rsid w:val="00436043"/>
+    <w:pPr>
+      <w:numPr>
+        <w:numId w:val="3"/>
+      </w:numPr>
+      <w:contextualSpacing/>
+    </w:pPr>
+  </w:style>
+  <w:style w:type="character" w:customStyle="1" w:styleId="ListBulletChar">
+    <w:name w:val="List Bullet Char"/>
+    <w:basedOn w:val="DefaultParagraphFont"/>
+    <w:link w:val="ListBullet"/>
+    <w:uiPriority w:val="99"/>
+    <w:semiHidden/>
+    <w:rsid w:val="00436043"/>
+  </w:style>
+  <w:style w:type="paragraph" w:customStyle="1" w:styleId="BulletList">
+    <w:name w:val="Bullet List"/>
+    <w:basedOn w:val="ListParagraph"/>
+    <w:qFormat/>
+    <w:rsid w:val="00B95529"/>
+    <w:pPr>
+      <w:numPr>
+        <w:numId w:val="1"/>
+      </w:numPr>
+      <w:spacing w:after="0"/>
+    </w:pPr>
+  </w:style>
+  <w:style w:type="character" w:customStyle="1" w:styleId="ListItemTitle">
+    <w:name w:val="List Item Title"/>
+    <w:basedOn w:val="Heading4Char"/>
+    <w:uiPriority w:val="1"/>
+    <w:qFormat/>
+    <w:rsid w:val="001904C5"/>
+    <w:rPr>
+      <w:rFonts w:asciiTheme="majorHAnsi" w:eastAsiaTheme="majorEastAsia" w:hAnsiTheme="majorHAnsi" w:cstheme="majorBidi"/>
+      <w:i/>
+      <w:iCs/>
+      <w:color w:val="1F3864" w:themeColor="accent1" w:themeShade="80"/>
+    </w:rPr>
+  </w:style>
+  <w:style w:type="paragraph" w:customStyle="1" w:styleId="CPTNumberedList">
+    <w:name w:val="CPT Numbered List"/>
+    <w:basedOn w:val="NumberedList"/>
+    <w:qFormat/>
+    <w:rsid w:val="00AE38AC"/>
+    <w:pPr>
+      <w:tabs>
+        <w:tab w:val="clear" w:pos="360"/>
+        <w:tab w:val="num" w:pos="720"/>
+      </w:tabs>
+      <w:ind w:left="720"/>
+    </w:pPr>
+  </w:style>
 </w:styles>
 </file>
 
@@ -3201,6 +3296,25 @@
 </file>
 
 <file path=customXml/item1.xml><?xml version="1.0" encoding="utf-8"?>
+<?mso-contentType ?>
+<FormTemplates xmlns="http://schemas.microsoft.com/sharepoint/v3/contenttype/forms">
+  <Display>DocumentLibraryForm</Display>
+  <Edit>DocumentLibraryForm</Edit>
+  <New>DocumentLibraryForm</New>
+</FormTemplates>
+</file>
+
+<file path=customXml/item2.xml><?xml version="1.0" encoding="utf-8"?>
+<p:properties xmlns:p="http://schemas.microsoft.com/office/2006/metadata/properties" xmlns:xsi="http://www.w3.org/2001/XMLSchema-instance" xmlns:pc="http://schemas.microsoft.com/office/infopath/2007/PartnerControls">
+  <documentManagement/>
+</p:properties>
+</file>
+
+<file path=customXml/item3.xml><?xml version="1.0" encoding="utf-8"?>
+<b:Sources xmlns:b="http://schemas.openxmlformats.org/officeDocument/2006/bibliography" xmlns="http://schemas.openxmlformats.org/officeDocument/2006/bibliography" SelectedStyle="\APASixthEditionOfficeOnline.xsl" StyleName="APA" Version="6"/>
+</file>
+
+<file path=customXml/item4.xml><?xml version="1.0" encoding="utf-8"?>
 <ct:contentTypeSchema xmlns:ct="http://schemas.microsoft.com/office/2006/metadata/contentType" xmlns:ma="http://schemas.microsoft.com/office/2006/metadata/properties/metaAttributes" ct:_="" ma:_="" ma:contentTypeName="Document" ma:contentTypeID="0x01010043AC30EE3931924C951949B01581249A" ma:contentTypeVersion="3" ma:contentTypeDescription="Create a new document." ma:contentTypeScope="" ma:versionID="ecba60cf1f3c2b4798aa357a3e04473e">
   <xsd:schema xmlns:xsd="http://www.w3.org/2001/XMLSchema" xmlns:xs="http://www.w3.org/2001/XMLSchema" xmlns:p="http://schemas.microsoft.com/office/2006/metadata/properties" xmlns:ns2="5e46cd92-5281-4aec-af6d-ce68d6323cf6" targetNamespace="http://schemas.microsoft.com/office/2006/metadata/properties" ma:root="true" ma:fieldsID="749246a7d39d1518a48c156f5ef050f5" ns2:_="">
     <xsd:import namespace="5e46cd92-5281-4aec-af6d-ce68d6323cf6"/>
@@ -3338,26 +3452,32 @@
 </ct:contentTypeSchema>
 </file>
 
-<file path=customXml/item2.xml><?xml version="1.0" encoding="utf-8"?>
-<?mso-contentType ?>
-<FormTemplates xmlns="http://schemas.microsoft.com/sharepoint/v3/contenttype/forms">
-  <Display>DocumentLibraryForm</Display>
-  <Edit>DocumentLibraryForm</Edit>
-  <New>DocumentLibraryForm</New>
-</FormTemplates>
+<file path=customXml/itemProps1.xml><?xml version="1.0" encoding="utf-8"?>
+<ds:datastoreItem xmlns:ds="http://schemas.openxmlformats.org/officeDocument/2006/customXml" ds:itemID="{E5876C36-A6F2-4B44-960A-B8B4B435ECCD}">
+  <ds:schemaRefs>
+    <ds:schemaRef ds:uri="http://schemas.microsoft.com/sharepoint/v3/contenttype/forms"/>
+  </ds:schemaRefs>
+</ds:datastoreItem>
 </file>
 
-<file path=customXml/item3.xml><?xml version="1.0" encoding="utf-8"?>
-<p:properties xmlns:p="http://schemas.microsoft.com/office/2006/metadata/properties" xmlns:xsi="http://www.w3.org/2001/XMLSchema-instance" xmlns:pc="http://schemas.microsoft.com/office/infopath/2007/PartnerControls">
-  <documentManagement/>
-</p:properties>
+<file path=customXml/itemProps2.xml><?xml version="1.0" encoding="utf-8"?>
+<ds:datastoreItem xmlns:ds="http://schemas.openxmlformats.org/officeDocument/2006/customXml" ds:itemID="{509D1927-145B-4147-AE53-B018C6899FD0}">
+  <ds:schemaRefs>
+    <ds:schemaRef ds:uri="http://schemas.microsoft.com/office/2006/metadata/properties"/>
+    <ds:schemaRef ds:uri="http://schemas.microsoft.com/office/infopath/2007/PartnerControls"/>
+  </ds:schemaRefs>
+</ds:datastoreItem>
 </file>
 
-<file path=customXml/item4.xml><?xml version="1.0" encoding="utf-8"?>
-<b:Sources xmlns:b="http://schemas.openxmlformats.org/officeDocument/2006/bibliography" xmlns="http://schemas.openxmlformats.org/officeDocument/2006/bibliography" SelectedStyle="\APASixthEditionOfficeOnline.xsl" StyleName="APA" Version="6"/>
+<file path=customXml/itemProps3.xml><?xml version="1.0" encoding="utf-8"?>
+<ds:datastoreItem xmlns:ds="http://schemas.openxmlformats.org/officeDocument/2006/customXml" ds:itemID="{99DD2AA0-78B3-40EA-8C1D-954E770C8D8A}">
+  <ds:schemaRefs>
+    <ds:schemaRef ds:uri="http://schemas.openxmlformats.org/officeDocument/2006/bibliography"/>
+  </ds:schemaRefs>
+</ds:datastoreItem>
 </file>
 
-<file path=customXml/itemProps1.xml><?xml version="1.0" encoding="utf-8"?>
+<file path=customXml/itemProps4.xml><?xml version="1.0" encoding="utf-8"?>
 <ds:datastoreItem xmlns:ds="http://schemas.openxmlformats.org/officeDocument/2006/customXml" ds:itemID="{D4AD5993-87D2-4E47-8D6E-96B6100FF46D}">
   <ds:schemaRefs>
     <ds:schemaRef ds:uri="http://schemas.microsoft.com/office/2006/metadata/contentType"/>
@@ -3373,29 +3493,4 @@
     <ds:schemaRef ds:uri="http://schemas.microsoft.com/internal/obd"/>
   </ds:schemaRefs>
 </ds:datastoreItem>
-</file>
-
-<file path=customXml/itemProps2.xml><?xml version="1.0" encoding="utf-8"?>
-<ds:datastoreItem xmlns:ds="http://schemas.openxmlformats.org/officeDocument/2006/customXml" ds:itemID="{E5876C36-A6F2-4B44-960A-B8B4B435ECCD}">
-  <ds:schemaRefs>
-    <ds:schemaRef ds:uri="http://schemas.microsoft.com/sharepoint/v3/contenttype/forms"/>
-  </ds:schemaRefs>
-</ds:datastoreItem>
-</file>
-
-<file path=customXml/itemProps3.xml><?xml version="1.0" encoding="utf-8"?>
-<ds:datastoreItem xmlns:ds="http://schemas.openxmlformats.org/officeDocument/2006/customXml" ds:itemID="{509D1927-145B-4147-AE53-B018C6899FD0}">
-  <ds:schemaRefs>
-    <ds:schemaRef ds:uri="http://schemas.microsoft.com/office/2006/metadata/properties"/>
-    <ds:schemaRef ds:uri="http://schemas.microsoft.com/office/infopath/2007/PartnerControls"/>
-  </ds:schemaRefs>
-</ds:datastoreItem>
-</file>
-
-<file path=customXml/itemProps4.xml><?xml version="1.0" encoding="utf-8"?>
-<ds:datastoreItem xmlns:ds="http://schemas.openxmlformats.org/officeDocument/2006/customXml" ds:itemID="{99DD2AA0-78B3-40EA-8C1D-954E770C8D8A}">
-  <ds:schemaRefs>
-    <ds:schemaRef ds:uri="http://schemas.openxmlformats.org/officeDocument/2006/bibliography"/>
-  </ds:schemaRefs>
-</ds:datastoreItem>
 </file>
</xml_diff>